<commit_message>
Update project document and canvas by removing financial agent
Remove the Treasury & Finance Agent and all CoinKeeper references from the project document and update the canvas accordingly.

Replit-Commit-Author: Agent
Replit-Commit-Session-Id: 7d6f3ee8-9d8f-4005-9f45-b28281e672c1
Replit-Commit-Checkpoint-Type: full_checkpoint
Replit-Commit-Event-Id: 8a1d73a7-9759-463e-b4ed-983cc4d036fd
Replit-Helium-Checkpoint-Created: true
</commit_message>
<xml_diff>
--- a/LOS_Full_Context_Document.docx
+++ b/LOS_Full_Context_Document.docx
@@ -56,7 +56,7 @@
           <w:color w:val="787878"/>
           <w:sz w:val="22"/>
         </w:rPr>
-        <w:t>Версия: 1.0  |  Дата: 26.06.2026  |  Конфиденциально</w:t>
+        <w:t>Версия: 1.1  |  Дата: 26.06.2026  |  Конфиденциально</w:t>
       </w:r>
     </w:p>
     <w:p>
@@ -113,7 +113,7 @@
         <w:pStyle w:val="ListBullet"/>
       </w:pPr>
       <w:r>
-        <w:t>контролирует финансы, отношения, здоровье и коммуникации в одном месте;</w:t>
+        <w:t>контролирует отношения, здоровье и коммуникации в одном месте;</w:t>
       </w:r>
     </w:p>
     <w:p>
@@ -130,7 +130,6 @@
           <w:b w:val="0"/>
           <w:i w:val="0"/>
         </w:rPr>
-        <w:br/>
         <w:t>Результат — хроническая перегрузка, снижение качества стратегических решений, упущенные контакты и нарастающий дисбаланс между работой и жизнью.</w:t>
       </w:r>
     </w:p>
@@ -148,7 +147,7 @@
           <w:b w:val="0"/>
           <w:i w:val="0"/>
         </w:rPr>
-        <w:t>LOS — это персональная мультиагентная ИИ-система, работающая как цифровой штаб первого лица. Система состоит из 7 специализированных ИИ-агентов под управлением единого Master Orchestrator. Весь поток данных, решений и коммуникаций проходит через единый человеческий интерфейс — Chief of Staff (Аня) в Telegram. Система работает на русском языке.</w:t>
+        <w:t>LOS — это персональная мультиагентная ИИ-система, работающая как цифровой штаб первого лица. Система состоит из 6 специализированных ИИ-агентов под управлением единого Master Orchestrator. Весь поток данных, решений и коммуникаций проходит через единый человеческий интерфейс — Chief of Staff (Аня) в Telegram. Система работает на русском языке.</w:t>
       </w:r>
     </w:p>
     <w:p>
@@ -235,7 +234,7 @@
         <w:pStyle w:val="Heading2"/>
       </w:pPr>
       <w:r>
-        <w:t>2.1 Концепция: 7 агентов + 1 Orchestrator</w:t>
+        <w:t>2.1 Концепция: 6 агентов + 1 Orchestrator</w:t>
       </w:r>
     </w:p>
     <w:p>
@@ -244,7 +243,7 @@
           <w:b w:val="0"/>
           <w:i w:val="0"/>
         </w:rPr>
-        <w:t>Система построена по принципу «звезда»: в центре — Master Orchestrator (центральный агент-координатор), вокруг него — 7 специализированных агентов, каждый из которых является экспертом своего домена.</w:t>
+        <w:t>Система построена по принципу «звезда»: в центре — Master Orchestrator, вокруг него — 6 специализированных агентов, каждый из которых является экспертом своего домена.</w:t>
       </w:r>
     </w:p>
     <w:tbl>
@@ -262,13 +261,11 @@
         <w:tc>
           <w:tcPr>
             <w:tcW w:type="dxa" w:w="3041"/>
-            <w:shd w:fill="5C38BA" w:val="clear"/>
           </w:tcPr>
           <w:p>
             <w:r>
               <w:rPr>
                 <w:b/>
-                <w:color w:val="FFFFFF"/>
               </w:rPr>
               <w:t>Компонент</w:t>
             </w:r>
@@ -277,13 +274,11 @@
         <w:tc>
           <w:tcPr>
             <w:tcW w:type="dxa" w:w="3041"/>
-            <w:shd w:fill="5C38BA" w:val="clear"/>
           </w:tcPr>
           <w:p>
             <w:r>
               <w:rPr>
                 <w:b/>
-                <w:color w:val="FFFFFF"/>
               </w:rPr>
               <w:t>Роль</w:t>
             </w:r>
@@ -292,13 +287,11 @@
         <w:tc>
           <w:tcPr>
             <w:tcW w:type="dxa" w:w="3041"/>
-            <w:shd w:fill="5C38BA" w:val="clear"/>
           </w:tcPr>
           <w:p>
             <w:r>
               <w:rPr>
                 <w:b/>
-                <w:color w:val="FFFFFF"/>
               </w:rPr>
               <w:t>Фаза</w:t>
             </w:r>
@@ -322,7 +315,7 @@
           </w:tcPr>
           <w:p>
             <w:r>
-              <w:t>Центральный координатор: маршрутизирует запросы, агрегирует ответы, управляет порядком вызовов и разрешает конфликты</w:t>
+              <w:t>Центральный координатор: маршрутизирует запросы, агрегирует ответы, разрешает конфликты</w:t>
             </w:r>
           </w:p>
         </w:tc>
@@ -386,7 +379,7 @@
           </w:tcPr>
           <w:p>
             <w:r>
-              <w:t>Агрегатор: мультилинзовый анализ решений; утренний (07:00) и вечерний (22:00) брифинги</w:t>
+              <w:t>Агрегатор: мультилинзовый анализ; утренний брифинг 07:00 и вечерний дайджест 22:00</w:t>
             </w:r>
           </w:p>
         </w:tc>
@@ -504,38 +497,6 @@
           </w:tcPr>
           <w:p>
             <w:r>
-              <w:t>💰 Treasury &amp; Finance Agent</w:t>
-            </w:r>
-          </w:p>
-        </w:tc>
-        <w:tc>
-          <w:tcPr>
-            <w:tcW w:type="dxa" w:w="3041"/>
-          </w:tcPr>
-          <w:p>
-            <w:r>
-              <w:t>Трекинг личных финансов через интеграцию с CoinKeeper</w:t>
-            </w:r>
-          </w:p>
-        </w:tc>
-        <w:tc>
-          <w:tcPr>
-            <w:tcW w:type="dxa" w:w="3041"/>
-          </w:tcPr>
-          <w:p>
-            <w:r>
-              <w:t>⏳ Фаза 2</w:t>
-            </w:r>
-          </w:p>
-        </w:tc>
-      </w:tr>
-      <w:tr>
-        <w:tc>
-          <w:tcPr>
-            <w:tcW w:type="dxa" w:w="3041"/>
-          </w:tcPr>
-          <w:p>
-            <w:r>
               <w:t>🎙 Communication Intelligence Agent</w:t>
             </w:r>
           </w:p>
@@ -616,14 +577,6 @@
         <w:pStyle w:val="ListBullet"/>
       </w:pPr>
       <w:r>
-        <w:t>CoinKeeper → Treasury → Decision Support</w:t>
-      </w:r>
-    </w:p>
-    <w:p>
-      <w:pPr>
-        <w:pStyle w:val="ListBullet"/>
-      </w:pPr>
-      <w:r>
         <w:t>PLAUDE (аудио + текст) → Communication Intel → Decision Support (при флаге high_risk)</w:t>
       </w:r>
     </w:p>
@@ -664,7 +617,7 @@
         <w:pStyle w:val="ListBullet"/>
       </w:pPr>
       <w:r>
-        <w:t>Neuro &amp; Bio → Health (текущее состояние здоровья для контекста)</w:t>
+        <w:t>Neuro &amp; Bio → Health (текущее состояние для контекста)</w:t>
       </w:r>
     </w:p>
     <w:p>
@@ -765,28 +718,6 @@
           </w:p>
         </w:tc>
       </w:tr>
-      <w:tr>
-        <w:tc>
-          <w:tcPr>
-            <w:tcW w:type="dxa" w:w="4561"/>
-          </w:tcPr>
-          <w:p>
-            <w:r>
-              <w:t>Decision Support vs. Treasury (финансовый дедлайн)</w:t>
-            </w:r>
-          </w:p>
-        </w:tc>
-        <w:tc>
-          <w:tcPr>
-            <w:tcW w:type="dxa" w:w="4561"/>
-          </w:tcPr>
-          <w:p>
-            <w:r>
-              <w:t>Флаг deadline_conflict с описанием рисков обоих сценариев</w:t>
-            </w:r>
-          </w:p>
-        </w:tc>
-      </w:tr>
     </w:tbl>
     <w:p>
       <w:r>
@@ -876,7 +807,7 @@
           <w:b/>
           <w:i w:val="0"/>
         </w:rPr>
-        <w:t>Типология встреч по нагрузке:</w:t>
+        <w:t>Типология встреч по когнитивной нагрузке:</w:t>
       </w:r>
     </w:p>
     <w:p>
@@ -925,6 +856,39 @@
           <w:b/>
           <w:i w:val="0"/>
         </w:rPr>
+        <w:t>Логика анализа:</w:t>
+      </w:r>
+    </w:p>
+    <w:p>
+      <w:pPr>
+        <w:pStyle w:val="ListBullet"/>
+      </w:pPr>
+      <w:r>
+        <w:t>Пороговые алерты (срочные): Readiness Score &lt; N → флаг на перегруз, предложение переноса тяжёлых встреч</w:t>
+      </w:r>
+    </w:p>
+    <w:p>
+      <w:pPr>
+        <w:pStyle w:val="ListBullet"/>
+      </w:pPr>
+      <w:r>
+        <w:t>Паттерны (проактивные): Анализ динамики за 7 дней; предупреждение до наступления перегруза</w:t>
+      </w:r>
+    </w:p>
+    <w:p>
+      <w:pPr>
+        <w:pStyle w:val="ListBullet"/>
+      </w:pPr>
+      <w:r>
+        <w:t>Приоритет субъективного ввода: при конфликте данных Oura vs. субъективный ввод — победа за субъективным (флаг data_conflict)</w:t>
+      </w:r>
+    </w:p>
+    <w:p>
+      <w:r>
+        <w:rPr>
+          <w:b/>
+          <w:i w:val="0"/>
+        </w:rPr>
         <w:t>Пример вывода:</w:t>
       </w:r>
     </w:p>
@@ -933,7 +897,7 @@
         <w:rPr>
           <w:i/>
         </w:rPr>
-        <w:t>«Readiness Score сегодня 61 (4-й день снижения подряд). Стратегическая встреча с партнёрами в 14:00 несёт высокий когнитивный риск. Рекомендую перенести на среду 10:00–12:00. До встречи: 20-минутная прогулка без телефона. Семейный блок 18:00–20:00 защищён.»</w:t>
+        <w:t>Readiness Score сегодня 61 (4-й день снижения подряд). Стратегическая встреча с партнёрами в 14:00 несёт высокий когнитивный риск. Рекомендую перенести на среду 10:00-12:00. До встречи: 20-минутная прогулка без телефона. Семейный блок 18:00-20:00 защищён.</w:t>
       </w:r>
     </w:p>
     <w:p>
@@ -950,7 +914,7 @@
           <w:b w:val="0"/>
           <w:i w:val="0"/>
         </w:rPr>
-        <w:t>Основная цель: центральный мозг системы — агрегирует контекст всех 6 агентов, проводит мультилинзовый анализ решений, приоритизирует задачи дня, выступает арбитром при конфликтах агентов.</w:t>
+        <w:t>Основная цель: центральный мозг системы — агрегирует контекст всех агентов, проводит мультилинзовый анализ решений, приоритизирует задачи дня, выступает арбитром при конфликтах.</w:t>
       </w:r>
     </w:p>
     <w:p>
@@ -971,17 +935,6 @@
       </w:r>
       <w:r>
         <w:t>Neuro &amp; Bio: Readiness Score, паттерны усталости</w:t>
-      </w:r>
-    </w:p>
-    <w:p>
-      <w:r>
-        <w:rPr>
-          <w:b/>
-        </w:rPr>
-        <w:t xml:space="preserve">• Финансовая: </w:t>
-      </w:r>
-      <w:r>
-        <w:t>Treasury: текущая финансовая картина</w:t>
       </w:r>
     </w:p>
     <w:p>
@@ -1021,6 +974,17 @@
       <w:r>
         <w:rPr>
           <w:b/>
+        </w:rPr>
+        <w:t xml:space="preserve">• Коммуникационная: </w:t>
+      </w:r>
+      <w:r>
+        <w:t>Communication Intel: контекст переговоров и профайлинг</w:t>
+      </w:r>
+    </w:p>
+    <w:p>
+      <w:r>
+        <w:rPr>
+          <w:b/>
           <w:i w:val="0"/>
         </w:rPr>
         <w:t>Триггеры:</w:t>
@@ -1039,7 +1003,7 @@
         <w:pStyle w:val="ListBullet"/>
       </w:pPr>
       <w:r>
-        <w:t>22:00 МСК (ежедневно): вечерний дайджест</w:t>
+        <w:t>22:00 МСК (ежедневно): автоматический вечерний дайджест</w:t>
       </w:r>
     </w:p>
     <w:p>
@@ -1047,15 +1011,7 @@
         <w:pStyle w:val="ListBullet"/>
       </w:pPr>
       <w:r>
-        <w:t>Личный запрос Ани: описывает ситуацию — агент собирает контекст и выдаёт анализ</w:t>
-      </w:r>
-    </w:p>
-    <w:p>
-      <w:pPr>
-        <w:pStyle w:val="ListBullet"/>
-      </w:pPr>
-      <w:r>
-        <w:t>Флаг Treasury: обнаружено крупное финансовое движение</w:t>
+        <w:t>Личный запрос Ани: описывает ситуацию — агент выдаёт мультилинзовый анализ</w:t>
       </w:r>
     </w:p>
     <w:p>
@@ -1080,7 +1036,7 @@
         <w:rPr>
           <w:i/>
         </w:rPr>
-        <w:t>«07:00 МСК. Состояние: Readiness 68, 3-й день снижения. Качество дня (Esoteric): высокое — рекомендован для стратегических решений. Финансы: норма. Приоритеты: 1) Решение по сделке с Петровым (дедлайн 2 дня); 2) Уточнить юридические гарантии до подписания. Рекомендация: перенести операционные встречи на послеобед; пик когнитивной работы — до 13:00. Именинники сегодня: нет.»</w:t>
+        <w:t>07:00 МСК. Состояние: Readiness 68, 3-й день снижения. Качество дня (Esoteric): высокое — рекомендован для стратегических решений. Приоритеты: 1) Решение по сделке с Петровым (дедлайн 2 дня); 2) Уточнить юридические гарантии. Рекомендация: перенести операционные встречи на послеобед; пик когнитивной работы — до 13:00.</w:t>
       </w:r>
     </w:p>
     <w:p>
@@ -1097,7 +1053,7 @@
           <w:b w:val="0"/>
           <w:i w:val="0"/>
         </w:rPr>
-        <w:t>Основная цель: комплексный эзотерический советник, ежедневно оценивающий качество дня по трём системам и предоставляющий рекомендации по срокам и характеру ключевых действий.</w:t>
+        <w:t>Основная цель: ежедневная оценка качества дня по трём системам и рекомендации по срокам ключевых действий.</w:t>
       </w:r>
     </w:p>
     <w:p>
@@ -1108,7 +1064,7 @@
         <w:t xml:space="preserve">• Астрология (транзиты): </w:t>
       </w:r>
       <w:r>
-        <w:t>Благоприятные / сложные периоды для сделок, переговоров, запусков. По натальной карте.</w:t>
+        <w:t>Благоприятные/сложные периоды для сделок, переговоров, запусков. По натальной карте.</w:t>
       </w:r>
     </w:p>
     <w:p>
@@ -1139,7 +1095,16 @@
           <w:b w:val="0"/>
           <w:i w:val="0"/>
         </w:rPr>
-        <w:t>Входные данные: дата, время и место рождения (астрология, Матрица судьбы); имя (нумерология).</w:t>
+        <w:t>Входные данные: дата, время и место рождения; имя для нумерологии. Вносятся при первоначальной настройке.</w:t>
+      </w:r>
+    </w:p>
+    <w:p>
+      <w:r>
+        <w:rPr>
+          <w:b w:val="0"/>
+          <w:i w:val="0"/>
+        </w:rPr>
+        <w:t>Триггер: каждое утро автоматически до начала рабочего дня.</w:t>
       </w:r>
     </w:p>
     <w:p>
@@ -1156,7 +1121,7 @@
           <w:b w:val="0"/>
           <w:i w:val="0"/>
         </w:rPr>
-        <w:t>Основная цель: трекинг физического здоровья — динамика анализов, врачебные визиты, медикаменты и ресёрч назначенных препаратов.</w:t>
+        <w:t>Основная цель: трекинг физического здоровья — динамика анализов, врачебные визиты, медикаменты и ресёрч назначений.</w:t>
       </w:r>
     </w:p>
     <w:p>
@@ -1164,7 +1129,7 @@
         <w:pStyle w:val="ListBullet"/>
       </w:pPr>
       <w:r>
-        <w:t>Динамика показателей: выявляет устойчивые отклонения в анализах</w:t>
+        <w:t>Динамика показателей: выявляет устойчивые отклонения в анализах крови и тестах</w:t>
       </w:r>
     </w:p>
     <w:p>
@@ -1172,7 +1137,7 @@
         <w:pStyle w:val="ListBullet"/>
       </w:pPr>
       <w:r>
-        <w:t>Ресёрч препаратов: при новом назначении — состав, побочные эффекты, взаимодействия</w:t>
+        <w:t>Ресёрч препаратов: при новом назначении — состав, механизм действия, побочные эффекты, взаимодействия</w:t>
       </w:r>
     </w:p>
     <w:p>
@@ -1180,7 +1145,7 @@
         <w:pStyle w:val="ListBullet"/>
       </w:pPr>
       <w:r>
-        <w:t>Напоминания о визитах: плановые обследования и интервалы</w:t>
+        <w:t>Напоминания о визитах: контролирует плановые обследования и интервалы между ними</w:t>
       </w:r>
     </w:p>
     <w:p>
@@ -1189,6 +1154,15 @@
       </w:pPr>
       <w:r>
         <w:t>Мониторинг приёма: фиксирует факт приёма медикаментов / добавок</w:t>
+      </w:r>
+    </w:p>
+    <w:p>
+      <w:r>
+        <w:rPr>
+          <w:b w:val="0"/>
+          <w:i w:val="0"/>
+        </w:rPr>
+        <w:t>Ограничения: не ставит диагнозов; не назначает медикаменты; только трекает и исследует назначенное врачом.</w:t>
       </w:r>
     </w:p>
     <w:p>
@@ -1205,7 +1179,7 @@
           <w:b w:val="0"/>
           <w:i w:val="0"/>
         </w:rPr>
-        <w:t>Основная цель: управление деловыми и личными связями — единая карта отношений с приоритетами, ритмами касаний, напоминаниями о датах и персонализированной коммуникационной поддержкой.</w:t>
+        <w:t>Основная цель: единая карта отношений с приоритетами, ритмами касаний, напоминаниями о датах и коммуникационной поддержкой.</w:t>
       </w:r>
     </w:p>
     <w:p>
@@ -1235,6 +1209,9 @@
           </w:tcPr>
           <w:p>
             <w:r>
+              <w:rPr>
+                <w:b/>
+              </w:rPr>
               <w:t>Круг</w:t>
             </w:r>
           </w:p>
@@ -1245,6 +1222,9 @@
           </w:tcPr>
           <w:p>
             <w:r>
+              <w:rPr>
+                <w:b/>
+              </w:rPr>
               <w:t>Состав</w:t>
             </w:r>
           </w:p>
@@ -1255,6 +1235,9 @@
           </w:tcPr>
           <w:p>
             <w:r>
+              <w:rPr>
+                <w:b/>
+              </w:rPr>
               <w:t>Ритм касания</w:t>
             </w:r>
           </w:p>
@@ -1412,7 +1395,7 @@
         <w:pStyle w:val="ListBullet"/>
       </w:pPr>
       <w:r>
-        <w:t>Персональные поздравления: под каждого человека, не повторяет тон и образы. Только русский язык.</w:t>
+        <w:t>Персональные поздравления под каждого человека, не повторяет тон и образы. Только русский язык.</w:t>
       </w:r>
     </w:p>
     <w:p>
@@ -1420,7 +1403,7 @@
         <w:pStyle w:val="ListBullet"/>
       </w:pPr>
       <w:r>
-        <w:t>Динамика отношений: фиксирует статус; флаг при долгом отсутствии касания</w:t>
+        <w:t>Динамика отношений: фиксирует статус (развиваются / стагнируют / охлаждаются); флаг при долгом отсутствии касания</w:t>
       </w:r>
     </w:p>
     <w:p>
@@ -1428,7 +1411,7 @@
         <w:pStyle w:val="ListBullet"/>
       </w:pPr>
       <w:r>
-        <w:t>Система напоминаний: дни рождения (за 7, 2 дня и в день), праздники, годовщины</w:t>
+        <w:t>Напоминания: дни рождения (за 7, 2 дня и в день), религиозные и государственные праздники, годовщины</w:t>
       </w:r>
     </w:p>
     <w:p>
@@ -1436,7 +1419,7 @@
         <w:pStyle w:val="Heading2"/>
       </w:pPr>
       <w:r>
-        <w:t>3.6 Treasury &amp; Personal Finance Agent  [⏳ Фаза 2]</w:t>
+        <w:t>3.6 Communication Intelligence Agent  [⏳ Фаза 2]</w:t>
       </w:r>
     </w:p>
     <w:p>
@@ -1445,7 +1428,16 @@
           <w:b w:val="0"/>
           <w:i w:val="0"/>
         </w:rPr>
-        <w:t>Основная цель: трекинг личных финансов — доходы, расходы, бюджет, динамика по месяцам, контроль регулярных платежей. Источник данных: CoinKeeper API.</w:t>
+        <w:t>Основная цель: психологический и юридический анализ переговоров на основе аудио и транскрипций из PLAUDE.</w:t>
+      </w:r>
+    </w:p>
+    <w:p>
+      <w:r>
+        <w:rPr>
+          <w:b/>
+          <w:i w:val="0"/>
+        </w:rPr>
+        <w:t>Источники данных:</w:t>
       </w:r>
     </w:p>
     <w:p>
@@ -1453,7 +1445,7 @@
         <w:pStyle w:val="ListBullet"/>
       </w:pPr>
       <w:r>
-        <w:t>Трекинг по категориям: расходы/доходы с разбивкой и контролем лимитов</w:t>
+        <w:t>PLAUDE: аудиофайл + текстовое саммари встречи — загружает Аня вручную</w:t>
       </w:r>
     </w:p>
     <w:p>
@@ -1461,7 +1453,7 @@
         <w:pStyle w:val="ListBullet"/>
       </w:pPr>
       <w:r>
-        <w:t>Алерты превышения бюджета: мгновенный флаг при выходе за лимит категории</w:t>
+        <w:t>Network Agent: профили участников (если контакт есть в базе)</w:t>
       </w:r>
     </w:p>
     <w:p>
@@ -1469,40 +1461,7 @@
         <w:pStyle w:val="ListBullet"/>
       </w:pPr>
       <w:r>
-        <w:t>Аномалии: выявляет нестандартные расходы; запрашивает подтверждение у Ани</w:t>
-      </w:r>
-    </w:p>
-    <w:p>
-      <w:pPr>
-        <w:pStyle w:val="ListBullet"/>
-      </w:pPr>
-      <w:r>
-        <w:t>Регулярные платежи: напоминания до дедлайна; флаг payment_missed при просрочке</w:t>
-      </w:r>
-    </w:p>
-    <w:p>
-      <w:pPr>
-        <w:pStyle w:val="ListBullet"/>
-      </w:pPr>
-      <w:r>
-        <w:t>Критический баланс: алерт critical_balance при уходе баланса в минус</w:t>
-      </w:r>
-    </w:p>
-    <w:p>
-      <w:pPr>
-        <w:pStyle w:val="Heading2"/>
-      </w:pPr>
-      <w:r>
-        <w:t>3.7 Communication Intelligence Agent  [⏳ Фаза 2]</w:t>
-      </w:r>
-    </w:p>
-    <w:p>
-      <w:r>
-        <w:rPr>
-          <w:b w:val="0"/>
-          <w:i w:val="0"/>
-        </w:rPr>
-        <w:t>Основная цель: психологический и юридический анализ переговоров на основе аудиозаписей и транскрипций из PLAUDE — выявление манипуляций, скрытых конфликтов, профайлинг участников.</w:t>
+        <w:t>Ручной ввод Ани: контекст встречи — участники, цель, дата</w:t>
       </w:r>
     </w:p>
     <w:p>
@@ -1527,7 +1486,7 @@
         <w:pStyle w:val="ListBullet"/>
       </w:pPr>
       <w:r>
-        <w:t>Скрытые конфликты: противоречия между словами, избегаемые темы</w:t>
+        <w:t>Скрытые конфликты: противоречия между словами, избегаемые темы, напряжение в диалоге</w:t>
       </w:r>
     </w:p>
     <w:p>
@@ -1543,7 +1502,7 @@
         <w:pStyle w:val="ListBullet"/>
       </w:pPr>
       <w:r>
-        <w:t>Профайлинг личности: тип личности, мотивации, вероятные слабые точки</w:t>
+        <w:t>Профайлинг личности: тип личности, мотивации, вероятные слабые точки собеседника</w:t>
       </w:r>
     </w:p>
     <w:p>
@@ -1560,7 +1519,24 @@
           <w:b w:val="0"/>
           <w:i w:val="0"/>
         </w:rPr>
-        <w:t>Политика хранения: хранятся результаты анализа и краткие сведения об участниках. НЕ хранятся: аудиозаписи, полные транскрипции, чувствительные детали переговоров.</w:t>
+        <w:t>Политика хранения: сохраняются результаты анализа и краткие сведения об участниках. НЕ хранятся: аудиозаписи, полные транскрипции, чувствительные детали переговоров.</w:t>
+      </w:r>
+    </w:p>
+    <w:p>
+      <w:r>
+        <w:rPr>
+          <w:b/>
+          <w:i w:val="0"/>
+        </w:rPr>
+        <w:t>Пример вывода:</w:t>
+      </w:r>
+    </w:p>
+    <w:p>
+      <w:r>
+        <w:rPr>
+          <w:i/>
+        </w:rPr>
+        <w:t>Встреча: переговоры по сделке, 15.01.2025. Участник: Иван Петров. Манипуляция: зафиксирована техника искусственного дефицита времени. Скрытый конфликт: устойчивое избегание прямого ответа по финансовым гарантиям (3 обхода за разговор). Рекомендация: не принимать решение под давлением; запросить письменные гарантии.</w:t>
       </w:r>
     </w:p>
     <w:p>
@@ -1585,7 +1561,7 @@
           <w:b w:val="0"/>
           <w:i w:val="0"/>
         </w:rPr>
-        <w:t>На основе анализа лучших практик 2025–2026 (CoALA Framework, Princeton/CMU) выбрана четырёхслойная архитектура памяти в сочетании с фреймворком Mem0 (open-source, Apache-2.0).</w:t>
+        <w:t>На основе анализа лучших практик 2025-2026 (CoALA Framework, Princeton/CMU) выбрана четырёхслойная архитектура памяти в сочетании с фреймворком Mem0 (open-source, Apache-2.0).</w:t>
       </w:r>
     </w:p>
     <w:p>
@@ -1689,7 +1665,7 @@
           </w:tcPr>
           <w:p>
             <w:r>
-              <w:t>LLM context window / память в RAM</w:t>
+              <w:t>LLM context window</w:t>
             </w:r>
           </w:p>
         </w:tc>
@@ -1721,7 +1697,7 @@
           </w:tcPr>
           <w:p>
             <w:r>
-              <w:t>Что происходило: «Аня в июле летела в Бали»</w:t>
+              <w:t>Что происходило: история взаимодействий</w:t>
             </w:r>
           </w:p>
         </w:tc>
@@ -1846,7 +1822,7 @@
           <w:b w:val="0"/>
           <w:i w:val="0"/>
         </w:rPr>
-        <w:t>Mem0 — open-source REST API, который автоматически извлекает факты, предпочтения и отношения из разговоров и сохраняет их с возможностью векторного поиска. Лицензия: Apache 2.0. Работает поверх PostgreSQL с расширением pgvector.</w:t>
+        <w:t>Mem0 — open-source REST API, автоматически извлекающий факты и предпочтения из разговоров. Лицензия: Apache 2.0. Работает поверх PostgreSQL с расширением pgvector.</w:t>
       </w:r>
     </w:p>
     <w:p>
@@ -1855,7 +1831,7 @@
           <w:b/>
           <w:i w:val="0"/>
         </w:rPr>
-        <w:t>Три внутренних хранилища Mem0:</w:t>
+        <w:t>Три внутренних хранилища:</w:t>
       </w:r>
     </w:p>
     <w:p>
@@ -1877,7 +1853,7 @@
         <w:t xml:space="preserve">• Graph Store: </w:t>
       </w:r>
       <w:r>
-        <w:t>Хранит связи: «Пётр — деловой партнёр», «Иван — муж сестры»</w:t>
+        <w:t>Хранит связи: «Пётр — деловой партнёр», «Ahmed — ключевой клиент, Дубай»</w:t>
       </w:r>
     </w:p>
     <w:p>
@@ -1897,8 +1873,7 @@
           <w:b/>
           <w:i w:val="0"/>
         </w:rPr>
-        <w:br/>
-        <w:t>Как это работает:</w:t>
+        <w:t>Как работает автоматически:</w:t>
       </w:r>
     </w:p>
     <w:p>
@@ -1907,16 +1882,7 @@
           <w:b w:val="0"/>
           <w:i w:val="0"/>
         </w:rPr>
-        <w:t>Когда Аня говорит «Он предпочитает встречи до 12:00», Mem0 автоматически: 1) извлекает факт; 2) сохраняет в Vector Store + KV Store; 3) при следующем запросе возвращает контекст оркестратору → персонализированный ответ.</w:t>
-      </w:r>
-    </w:p>
-    <w:p>
-      <w:r>
-        <w:rPr>
-          <w:b/>
-          <w:i w:val="0"/>
-        </w:rPr>
-        <w:t>Сравнение с альтернативами:</w:t>
+        <w:t>Аня говорит: «Он предпочитает переговоры до 12:00» — Mem0 извлекает факт, сохраняет в Vector Store + KV Store. При следующем запросе оркестратор получает этот контекст и отвечает персонализированно.</w:t>
       </w:r>
     </w:p>
     <w:tbl>
@@ -1998,7 +1964,7 @@
           </w:tcPr>
           <w:p>
             <w:r>
-              <w:t>Менее мощный граф чем Zep</w:t>
+              <w:t>Граф менее мощный, чем у Zep</w:t>
             </w:r>
           </w:p>
         </w:tc>
@@ -2020,7 +1986,7 @@
           </w:tcPr>
           <w:p>
             <w:r>
-              <w:t>Мощный граф связей, темпоральность</w:t>
+              <w:t>Мощный темпоральный граф связей</w:t>
             </w:r>
           </w:p>
         </w:tc>
@@ -2030,7 +1996,7 @@
           </w:tcPr>
           <w:p>
             <w:r>
-              <w:t>Требует Neo4j, сложнее в настройке, корпоративное решение</w:t>
+              <w:t>Требует Neo4j, сложнее в настройке</w:t>
             </w:r>
           </w:p>
         </w:tc>
@@ -2052,7 +2018,7 @@
           </w:tcPr>
           <w:p>
             <w:r>
-              <w:t>OS-подобная иерархия памяти, исследовательски интересен</w:t>
+              <w:t>OS-подобная иерархия памяти, интересен для исследований</w:t>
             </w:r>
           </w:p>
         </w:tc>
@@ -2089,7 +2055,7 @@
         <w:pStyle w:val="Heading2"/>
       </w:pPr>
       <w:r>
-        <w:t>5.1 07:00 МСК — Утренний брифинг (автоматически)</w:t>
+        <w:t>5.1  07:00 МСК — Утренний брифинг (автоматически)</w:t>
       </w:r>
     </w:p>
     <w:p>
@@ -2234,28 +2200,6 @@
           </w:tcPr>
           <w:p>
             <w:r>
-              <w:t>Финансы</w:t>
-            </w:r>
-          </w:p>
-        </w:tc>
-        <w:tc>
-          <w:tcPr>
-            <w:tcW w:type="dxa" w:w="4561"/>
-          </w:tcPr>
-          <w:p>
-            <w:r>
-              <w:t>Флаги: превышения бюджета, ближайшие платежи</w:t>
-            </w:r>
-          </w:p>
-        </w:tc>
-      </w:tr>
-      <w:tr>
-        <w:tc>
-          <w:tcPr>
-            <w:tcW w:type="dxa" w:w="4561"/>
-          </w:tcPr>
-          <w:p>
-            <w:r>
               <w:t>Приоритеты дня</w:t>
             </w:r>
           </w:p>
@@ -2279,7 +2223,7 @@
           <w:b w:val="0"/>
           <w:i w:val="0"/>
         </w:rPr>
-        <w:t>После брифинга Аня вводит субъективный статус: энергия / фокус / настроение / тренировка / массаж / алкоголь. Логика напоминаний: первый пинг +5 мин → если нет ответа, второй пинг +5 мин → после этого система работает на данных Oura без субъективного ввода.</w:t>
+        <w:t>После брифинга Аня вводит субъективный статус: энергия / фокус / настроение / тренировка / массаж / алкоголь. Двухступенчатый пинг при отсутствии ответа: +5 мин → +5 мин → система работает на данных Oura.</w:t>
       </w:r>
     </w:p>
     <w:p>
@@ -2287,7 +2231,7 @@
         <w:pStyle w:val="Heading2"/>
       </w:pPr>
       <w:r>
-        <w:t>5.2 День — Реактивный режим</w:t>
+        <w:t>5.2  День — Реактивный режим</w:t>
       </w:r>
     </w:p>
     <w:p>
@@ -2295,15 +2239,7 @@
         <w:pStyle w:val="ListBullet"/>
       </w:pPr>
       <w:r>
-        <w:t>Новая встреча в календаре → Neuro &amp; Bio оценивает нагрузку, при необходимости — рекомендация</w:t>
-      </w:r>
-    </w:p>
-    <w:p>
-      <w:pPr>
-        <w:pStyle w:val="ListBullet"/>
-      </w:pPr>
-      <w:r>
-        <w:t>Новые данные из CoinKeeper → Treasury обновляет картину; мгновенный алерт при превышении бюджета</w:t>
+        <w:t>Новая встреча в календаре → Neuro &amp; Bio оценивает нагрузку; при необходимости — рекомендация по перестановке</w:t>
       </w:r>
     </w:p>
     <w:p>
@@ -2319,7 +2255,7 @@
         <w:pStyle w:val="ListBullet"/>
       </w:pPr>
       <w:r>
-        <w:t>Аня описывает дилемму → Decision Support собирает контекст и выдаёт мультилинзовый анализ</w:t>
+        <w:t>Аня описывает дилемму → Decision Support выдаёт мультилинзовый анализ</w:t>
       </w:r>
     </w:p>
     <w:p>
@@ -2332,10 +2268,18 @@
     </w:p>
     <w:p>
       <w:pPr>
+        <w:pStyle w:val="ListBullet"/>
+      </w:pPr>
+      <w:r>
+        <w:t>Аня вводит данные вручную (анализы, препараты, информацию о контакте) → агент обновляет базу</w:t>
+      </w:r>
+    </w:p>
+    <w:p>
+      <w:pPr>
         <w:pStyle w:val="Heading2"/>
       </w:pPr>
       <w:r>
-        <w:t>5.3 22:00 МСК — Вечерний дайджест (автоматически)</w:t>
+        <w:t>5.3  22:00 МСК — Вечерний дайджест (автоматически)</w:t>
       </w:r>
     </w:p>
     <w:tbl>
@@ -2394,28 +2338,6 @@
           <w:p>
             <w:r>
               <w:t>Динамика Readiness / состояния: как прошёл день</w:t>
-            </w:r>
-          </w:p>
-        </w:tc>
-      </w:tr>
-      <w:tr>
-        <w:tc>
-          <w:tcPr>
-            <w:tcW w:type="dxa" w:w="4561"/>
-          </w:tcPr>
-          <w:p>
-            <w:r>
-              <w:t>Финансы</w:t>
-            </w:r>
-          </w:p>
-        </w:tc>
-        <w:tc>
-          <w:tcPr>
-            <w:tcW w:type="dxa" w:w="4561"/>
-          </w:tcPr>
-          <w:p>
-            <w:r>
-              <w:t>Что потрачено сегодня; отклонения от нормы</w:t>
             </w:r>
           </w:p>
         </w:tc>
@@ -2668,7 +2590,7 @@
           </w:tcPr>
           <w:p>
             <w:r>
-              <w:t>Mem0 (open-source)</w:t>
+              <w:t>Mem0 (open-source, Apache 2.0)</w:t>
             </w:r>
           </w:p>
         </w:tc>
@@ -2679,38 +2601,6 @@
           <w:p>
             <w:r>
               <w:t>Автоизвлечение фактов, семантический поиск</w:t>
-            </w:r>
-          </w:p>
-        </w:tc>
-      </w:tr>
-      <w:tr>
-        <w:tc>
-          <w:tcPr>
-            <w:tcW w:type="dxa" w:w="3041"/>
-          </w:tcPr>
-          <w:p>
-            <w:r>
-              <w:t>Веб-поиск</w:t>
-            </w:r>
-          </w:p>
-        </w:tc>
-        <w:tc>
-          <w:tcPr>
-            <w:tcW w:type="dxa" w:w="3041"/>
-          </w:tcPr>
-          <w:p>
-            <w:r>
-              <w:t>Tavily Search API</w:t>
-            </w:r>
-          </w:p>
-        </w:tc>
-        <w:tc>
-          <w:tcPr>
-            <w:tcW w:type="dxa" w:w="3041"/>
-          </w:tcPr>
-          <w:p>
-            <w:r>
-              <w:t>Агент поиска по интернету</w:t>
             </w:r>
           </w:p>
         </w:tc>
@@ -2754,38 +2644,6 @@
           </w:tcPr>
           <w:p>
             <w:r>
-              <w:t>Финансы</w:t>
-            </w:r>
-          </w:p>
-        </w:tc>
-        <w:tc>
-          <w:tcPr>
-            <w:tcW w:type="dxa" w:w="3041"/>
-          </w:tcPr>
-          <w:p>
-            <w:r>
-              <w:t>CoinKeeper API / парсинг</w:t>
-            </w:r>
-          </w:p>
-        </w:tc>
-        <w:tc>
-          <w:tcPr>
-            <w:tcW w:type="dxa" w:w="3041"/>
-          </w:tcPr>
-          <w:p>
-            <w:r>
-              <w:t>Доходы, расходы, бюджет</w:t>
-            </w:r>
-          </w:p>
-        </w:tc>
-      </w:tr>
-      <w:tr>
-        <w:tc>
-          <w:tcPr>
-            <w:tcW w:type="dxa" w:w="3041"/>
-          </w:tcPr>
-          <w:p>
-            <w:r>
               <w:t>Переговоры</w:t>
             </w:r>
           </w:p>
@@ -2806,7 +2664,7 @@
           </w:tcPr>
           <w:p>
             <w:r>
-              <w:t>Анализ встреч и переговоров</w:t>
+              <w:t>Анализ встреч</w:t>
             </w:r>
           </w:p>
         </w:tc>
@@ -2882,7 +2740,7 @@
         <w:pStyle w:val="Heading2"/>
       </w:pPr>
       <w:r>
-        <w:t>6.1 Внешние API и ключи доступа (необходимы для запуска)</w:t>
+        <w:t>6.1 Необходимые API-ключи для запуска</w:t>
       </w:r>
     </w:p>
     <w:tbl>
@@ -2940,7 +2798,7 @@
           </w:tcPr>
           <w:p>
             <w:r>
-              <w:t>Через @BotFather в Telegram (/newbot)</w:t>
+              <w:t>Через @BotFather в Telegram — команда /newbot</w:t>
             </w:r>
           </w:p>
         </w:tc>
@@ -2962,7 +2820,7 @@
           </w:tcPr>
           <w:p>
             <w:r>
-              <w:t>platform.openai.com → API Keys</w:t>
+              <w:t>platform.openai.com — раздел API Keys</w:t>
             </w:r>
           </w:p>
         </w:tc>
@@ -2985,50 +2843,6 @@
           <w:p>
             <w:r>
               <w:t>cloud.ouraring.com/personal-access-tokens</w:t>
-            </w:r>
-          </w:p>
-        </w:tc>
-      </w:tr>
-      <w:tr>
-        <w:tc>
-          <w:tcPr>
-            <w:tcW w:type="dxa" w:w="4561"/>
-          </w:tcPr>
-          <w:p>
-            <w:r>
-              <w:t>Tavily API Key (поиск)</w:t>
-            </w:r>
-          </w:p>
-        </w:tc>
-        <w:tc>
-          <w:tcPr>
-            <w:tcW w:type="dxa" w:w="4561"/>
-          </w:tcPr>
-          <w:p>
-            <w:r>
-              <w:t>tavily.com → бесплатный тариф доступен</w:t>
-            </w:r>
-          </w:p>
-        </w:tc>
-      </w:tr>
-      <w:tr>
-        <w:tc>
-          <w:tcPr>
-            <w:tcW w:type="dxa" w:w="4561"/>
-          </w:tcPr>
-          <w:p>
-            <w:r>
-              <w:t>CoinKeeper API</w:t>
-            </w:r>
-          </w:p>
-        </w:tc>
-        <w:tc>
-          <w:tcPr>
-            <w:tcW w:type="dxa" w:w="4561"/>
-          </w:tcPr>
-          <w:p>
-            <w:r>
-              <w:t>Уточняется: API или парсинг — на этапе разработки Фазы 2</w:t>
             </w:r>
           </w:p>
         </w:tc>
@@ -3064,7 +2878,7 @@
           <w:b w:val="0"/>
           <w:i w:val="0"/>
         </w:rPr>
-        <w:t>Состав: Neuro &amp; Bio Intelligence Agent + Decision Support Agent + Telegram-бот.</w:t>
+        <w:t>Состав: Neuro &amp; Bio Agent + Decision Support Agent + Telegram-бот + Oura Ring.</w:t>
       </w:r>
     </w:p>
     <w:p>
@@ -3088,7 +2902,7 @@
         <w:pStyle w:val="ListBullet"/>
       </w:pPr>
       <w:r>
-        <w:t>Ручной ввод субъективного состояния через бот (энергия, фокус, настроение, тренировка, массаж, алкоголь)</w:t>
+        <w:t>Ручной ввод субъективного состояния (энергия, фокус, настроение, тренировка, массаж, алкоголь)</w:t>
       </w:r>
     </w:p>
     <w:p>
@@ -3104,7 +2918,7 @@
         <w:pStyle w:val="ListBullet"/>
       </w:pPr>
       <w:r>
-        <w:t>Алерты при низком Readiness Score + рекомендации по перестановке в расписании</w:t>
+        <w:t>Алерты при низком Readiness Score + рекомендации по расписанию</w:t>
       </w:r>
     </w:p>
     <w:p>
@@ -3112,15 +2926,7 @@
         <w:pStyle w:val="ListBullet"/>
       </w:pPr>
       <w:r>
-        <w:t>Утренний брифинг в 07:00 МСК (автоматически)</w:t>
-      </w:r>
-    </w:p>
-    <w:p>
-      <w:pPr>
-        <w:pStyle w:val="ListBullet"/>
-      </w:pPr>
-      <w:r>
-        <w:t>Вечерний дайджест в 22:00 МСК (автоматически)</w:t>
+        <w:t>Утренний брифинг 07:00 МСК и вечерний дайджест 22:00 МСК (оба автоматически)</w:t>
       </w:r>
     </w:p>
     <w:p>
@@ -3136,7 +2942,7 @@
         <w:pStyle w:val="ListBullet"/>
       </w:pPr>
       <w:r>
-        <w:t>Архитектура памяти: рабочая + эпизодическая (Mem0 + PostgreSQL)</w:t>
+        <w:t>Архитектура памяти: рабочая + семантическая (Mem0 + PostgreSQL)</w:t>
       </w:r>
     </w:p>
     <w:p>
@@ -3152,10 +2958,10 @@
         <w:rPr>
           <w:b/>
         </w:rPr>
-        <w:t xml:space="preserve">Результат Фазы 1: </w:t>
+        <w:t xml:space="preserve">Результат: </w:t>
       </w:r>
       <w:r>
-        <w:t>Работающий MVP — владелец получает персонализированный утренний брифинг и рекомендации по расписанию на основе физического состояния.</w:t>
+        <w:t>Работающий MVP — персонализированный утренний брифинг и рекомендации по расписанию на основе физического состояния.</w:t>
       </w:r>
     </w:p>
     <w:p/>
@@ -3173,7 +2979,7 @@
           <w:b w:val="0"/>
           <w:i w:val="0"/>
         </w:rPr>
-        <w:t>Состав: все 7 агентов + полная интеграция источников данных.</w:t>
+        <w:t>Состав: все 6 агентов + полная интеграция источников данных.</w:t>
       </w:r>
     </w:p>
     <w:p>
@@ -3181,7 +2987,7 @@
         <w:pStyle w:val="ListBullet"/>
       </w:pPr>
       <w:r>
-        <w:t>Esoteric Intelligence Agent (требует ввода натальных данных)</w:t>
+        <w:t>Esoteric Intelligence Agent (ввод натальных данных через бот)</w:t>
       </w:r>
     </w:p>
     <w:p>
@@ -3198,14 +3004,6 @@
       </w:pPr>
       <w:r>
         <w:t>Network &amp; Relationship Agent: карта контактов, напоминания, подарки, поздравления</w:t>
-      </w:r>
-    </w:p>
-    <w:p>
-      <w:pPr>
-        <w:pStyle w:val="ListBullet"/>
-      </w:pPr>
-      <w:r>
-        <w:t>Treasury &amp; Finance Agent: интеграция с CoinKeeper</w:t>
       </w:r>
     </w:p>
     <w:p>
@@ -3285,15 +3083,7 @@
         <w:pStyle w:val="ListBullet"/>
       </w:pPr>
       <w:r>
-        <w:t>Данные банковских карт и реквизиты счётов не хранятся — только агрегированные данные из CoinKeeper</w:t>
-      </w:r>
-    </w:p>
-    <w:p>
-      <w:pPr>
-        <w:pStyle w:val="ListBullet"/>
-      </w:pPr>
-      <w:r>
-        <w:t>Вывод рекомендаций идёт исключительно через Аню; система не контактирует с третьими лицами напрямую</w:t>
+        <w:t>Вывод рекомендаций идёт исключительно через Аню; система не контактирует с третьими лицами</w:t>
       </w:r>
     </w:p>
     <w:p>
@@ -3317,14 +3107,6 @@
         <w:pStyle w:val="ListBullet"/>
       </w:pPr>
       <w:r>
-        <w:t>Система не даёт инвестиционных советов и не проводит транзакции</w:t>
-      </w:r>
-    </w:p>
-    <w:p>
-      <w:pPr>
-        <w:pStyle w:val="ListBullet"/>
-      </w:pPr>
-      <w:r>
         <w:t>Семейные блоки в расписании неприкосновенны</w:t>
       </w:r>
     </w:p>
@@ -3333,7 +3115,15 @@
         <w:pStyle w:val="ListBullet"/>
       </w:pPr>
       <w:r>
-        <w:t>При обнаружении высокого риска в переговорах (флаг high_risk) — сигнал передаётся в Decision Support</w:t>
+        <w:t>При высоком риске в переговорах (флаг high_risk) — сигнал передаётся в Decision Support</w:t>
+      </w:r>
+    </w:p>
+    <w:p>
+      <w:pPr>
+        <w:pStyle w:val="ListBullet"/>
+      </w:pPr>
+      <w:r>
+        <w:t>Эзотерические рекомендации не заменяют решения; всегда сопровождаются обоснованием</w:t>
       </w:r>
     </w:p>
     <w:p>
@@ -3446,7 +3236,7 @@
           </w:tcPr>
           <w:p>
             <w:r>
-              <w:t>Центральный агент-координатор, управляющий всеми остальными агентами</w:t>
+              <w:t>Центральный агент-координатор, управляющий всеми остальными</w:t>
             </w:r>
           </w:p>
         </w:tc>
@@ -3468,7 +3258,7 @@
           </w:tcPr>
           <w:p>
             <w:r>
-              <w:t>Показатель Oura Ring (0–100): готовность к нагрузке на основе биометрии</w:t>
+              <w:t>Показатель Oura Ring (0-100): готовность к нагрузке на основе биометрии</w:t>
             </w:r>
           </w:p>
         </w:tc>
@@ -3524,28 +3314,6 @@
           </w:tcPr>
           <w:p>
             <w:r>
-              <w:t>CoinKeeper</w:t>
-            </w:r>
-          </w:p>
-        </w:tc>
-        <w:tc>
-          <w:tcPr>
-            <w:tcW w:type="dxa" w:w="4561"/>
-          </w:tcPr>
-          <w:p>
-            <w:r>
-              <w:t>Приложение для трекинга личных финансов</w:t>
-            </w:r>
-          </w:p>
-        </w:tc>
-      </w:tr>
-      <w:tr>
-        <w:tc>
-          <w:tcPr>
-            <w:tcW w:type="dxa" w:w="4561"/>
-          </w:tcPr>
-          <w:p>
-            <w:r>
               <w:t>Mem0</w:t>
             </w:r>
           </w:p>
@@ -3556,7 +3324,7 @@
           </w:tcPr>
           <w:p>
             <w:r>
-              <w:t>Open-source фреймворк памяти для ИИ-агентов (Apache 2.0)</w:t>
+              <w:t>Open-source фреймворк памяти для ИИ-агентов (Apache 2.0, pgvector)</w:t>
             </w:r>
           </w:p>
         </w:tc>
@@ -3622,7 +3390,7 @@
           </w:tcPr>
           <w:p>
             <w:r>
-              <w:t>Флаг Communication Intelligence Agent при обнаружении высокого риска в переговорах</w:t>
+              <w:t>Флаг Communication Intelligence Agent при высоком риске в переговорах</w:t>
             </w:r>
           </w:p>
         </w:tc>
@@ -3634,7 +3402,7 @@
           </w:tcPr>
           <w:p>
             <w:r>
-              <w:t>deadline_conflict</w:t>
+              <w:t>data_conflict</w:t>
             </w:r>
           </w:p>
         </w:tc>
@@ -3644,7 +3412,7 @@
           </w:tcPr>
           <w:p>
             <w:r>
-              <w:t>Флаг Decision Support при конфликте финансового дедлайна и других приоритетов</w:t>
+              <w:t>Флаг при расхождении данных Oura и субъективного ввода Ани</w:t>
             </w:r>
           </w:p>
         </w:tc>
@@ -3679,7 +3447,7 @@
           <w:color w:val="969696"/>
           <w:sz w:val="20"/>
         </w:rPr>
-        <w:t>LOS v1.0  |  26.06.2026</w:t>
+        <w:t>LOS v1.1  |  26.06.2026</w:t>
       </w:r>
     </w:p>
     <w:sectPr>

</xml_diff>

<commit_message>
Update project document to include full technical specifications
Update LOS project document title from v1.1 to v2.0 and enhance its content with full technical specifications for immediate development.

Replit-Commit-Author: Agent
Replit-Commit-Session-Id: 7d6f3ee8-9d8f-4005-9f45-b28281e672c1
Replit-Commit-Checkpoint-Type: full_checkpoint
Replit-Commit-Event-Id: 03d83ad5-a39e-4aa3-9ac8-25a7d7208084
Replit-Helium-Checkpoint-Created: true
</commit_message>
<xml_diff>
--- a/LOS_Full_Context_Document.docx
+++ b/LOS_Full_Context_Document.docx
@@ -56,7 +56,23 @@
           <w:color w:val="787878"/>
           <w:sz w:val="22"/>
         </w:rPr>
-        <w:t>Версия: 1.1  |  Дата: 26.06.2026  |  Конфиденциально</w:t>
+        <w:t>Версия: 2.0  |  Дата: 26.06.2026  |  Конфиденциально</w:t>
+      </w:r>
+    </w:p>
+    <w:p/>
+    <w:p>
+      <w:pPr>
+        <w:jc w:val="center"/>
+      </w:pPr>
+      <w:r>
+        <w:rPr>
+          <w:b/>
+          <w:color w:val="5838BA"/>
+          <w:sz w:val="22"/>
+        </w:rPr>
+        <w:t>ДОКУМЕНТ ДЛЯ AI-РАЗРАБОТКИ: содержит полный контекст, технические спецификации,</w:t>
+        <w:br/>
+        <w:t>структуру проекта и системные промты для немедленного начала разработки.</w:t>
       </w:r>
     </w:p>
     <w:p>
@@ -125,20 +141,11 @@
       </w:r>
     </w:p>
     <w:p>
+      <w:pPr>
+        <w:pStyle w:val="Heading2"/>
+      </w:pPr>
       <w:r>
-        <w:rPr>
-          <w:b w:val="0"/>
-          <w:i w:val="0"/>
-        </w:rPr>
-        <w:t>Результат — хроническая перегрузка, снижение качества стратегических решений, упущенные контакты и нарастающий дисбаланс между работой и жизнью.</w:t>
-      </w:r>
-    </w:p>
-    <w:p>
-      <w:pPr>
-        <w:pStyle w:val="Heading2"/>
-      </w:pPr>
-      <w:r>
-        <w:t>1.2 Решение — LOS (Life Operating System)</w:t>
+        <w:t>1.2 Решение — LOS</w:t>
       </w:r>
     </w:p>
     <w:p>
@@ -147,7 +154,7 @@
           <w:b w:val="0"/>
           <w:i w:val="0"/>
         </w:rPr>
-        <w:t>LOS — это персональная мультиагентная ИИ-система, работающая как цифровой штаб первого лица. Система состоит из 6 специализированных ИИ-агентов под управлением единого Master Orchestrator. Весь поток данных, решений и коммуникаций проходит через единый человеческий интерфейс — Chief of Staff (Аня) в Telegram. Система работает на русском языке.</w:t>
+        <w:t>LOS — персональная мультиагентная ИИ-система. 6 специализированных агентов под управлением Master Orchestrator. Единый интерфейс — Chief of Staff (Аня) в Telegram. Язык: русский.</w:t>
       </w:r>
     </w:p>
     <w:p>
@@ -210,7 +217,7 @@
         <w:t xml:space="preserve">• Единый ритм дня: </w:t>
       </w:r>
       <w:r>
-        <w:t>Утренний брифинг 07:00 МСК + реактивный режим + вечерний дайджест 22:00 МСК.</w:t>
+        <w:t>07:00 МСК утренний брифинг + реактивный режим + 22:00 МСК вечерний дайджест.</w:t>
       </w:r>
     </w:p>
     <w:p>
@@ -234,16 +241,7 @@
         <w:pStyle w:val="Heading2"/>
       </w:pPr>
       <w:r>
-        <w:t>2.1 Концепция: 6 агентов + 1 Orchestrator</w:t>
-      </w:r>
-    </w:p>
-    <w:p>
-      <w:r>
-        <w:rPr>
-          <w:b w:val="0"/>
-          <w:i w:val="0"/>
-        </w:rPr>
-        <w:t>Система построена по принципу «звезда»: в центре — Master Orchestrator, вокруг него — 6 специализированных агентов, каждый из которых является экспертом своего домена.</w:t>
+        <w:t>2.1 Концепция: 6 агентов + 1 Orchestrator (звезда)</w:t>
       </w:r>
     </w:p>
     <w:tbl>
@@ -261,11 +259,13 @@
         <w:tc>
           <w:tcPr>
             <w:tcW w:type="dxa" w:w="3041"/>
+            <w:shd w:fill="5C38BA" w:val="clear"/>
           </w:tcPr>
           <w:p>
             <w:r>
               <w:rPr>
                 <w:b/>
+                <w:color w:val="FFFFFF"/>
               </w:rPr>
               <w:t>Компонент</w:t>
             </w:r>
@@ -274,11 +274,13 @@
         <w:tc>
           <w:tcPr>
             <w:tcW w:type="dxa" w:w="3041"/>
+            <w:shd w:fill="5C38BA" w:val="clear"/>
           </w:tcPr>
           <w:p>
             <w:r>
               <w:rPr>
                 <w:b/>
+                <w:color w:val="FFFFFF"/>
               </w:rPr>
               <w:t>Роль</w:t>
             </w:r>
@@ -287,11 +289,13 @@
         <w:tc>
           <w:tcPr>
             <w:tcW w:type="dxa" w:w="3041"/>
+            <w:shd w:fill="5C38BA" w:val="clear"/>
           </w:tcPr>
           <w:p>
             <w:r>
               <w:rPr>
                 <w:b/>
+                <w:color w:val="FFFFFF"/>
               </w:rPr>
               <w:t>Фаза</w:t>
             </w:r>
@@ -347,7 +351,7 @@
           </w:tcPr>
           <w:p>
             <w:r>
-              <w:t>Мониторинг физического и ментального ресурса; оптимизация расписания на основе Oura Ring</w:t>
+              <w:t>Мониторинг физического и ментального ресурса на основе Oura Ring; оптимизация расписания</w:t>
             </w:r>
           </w:p>
         </w:tc>
@@ -357,7 +361,7 @@
           </w:tcPr>
           <w:p>
             <w:r>
-              <w:t>✅ Фаза 1 MVP</w:t>
+              <w:t>✅ MVP</w:t>
             </w:r>
           </w:p>
         </w:tc>
@@ -379,7 +383,7 @@
           </w:tcPr>
           <w:p>
             <w:r>
-              <w:t>Агрегатор: мультилинзовый анализ; утренний брифинг 07:00 и вечерний дайджест 22:00</w:t>
+              <w:t>Агрегатор всех агентов; утренний брифинг 07:00 и вечерний дайджест 22:00</w:t>
             </w:r>
           </w:p>
         </w:tc>
@@ -389,7 +393,7 @@
           </w:tcPr>
           <w:p>
             <w:r>
-              <w:t>✅ Фаза 1 MVP</w:t>
+              <w:t>✅ MVP</w:t>
             </w:r>
           </w:p>
         </w:tc>
@@ -411,7 +415,7 @@
           </w:tcPr>
           <w:p>
             <w:r>
-              <w:t>Астрологические, нумерологические и матрично-судьбовые прогнозы дня</w:t>
+              <w:t>Астрология (транзиты), нумерология, Матрица судьбы — ежедневная оценка дня</w:t>
             </w:r>
           </w:p>
         </w:tc>
@@ -443,7 +447,7 @@
           </w:tcPr>
           <w:p>
             <w:r>
-              <w:t>Трекинг здоровья: анализы, препараты, врачебные визиты</w:t>
+              <w:t>Трекинг анализов, препаратов, врачебных визитов; ресёрч назначений</w:t>
             </w:r>
           </w:p>
         </w:tc>
@@ -475,7 +479,7 @@
           </w:tcPr>
           <w:p>
             <w:r>
-              <w:t>Управление деловыми и личными связями; коммуникационные ритмы</w:t>
+              <w:t>Карта контактов, ритмы касаний, подарки, поздравления</w:t>
             </w:r>
           </w:p>
         </w:tc>
@@ -539,7 +543,7 @@
           </w:tcPr>
           <w:p>
             <w:r>
-              <w:t>Единственный человеческий интерфейс системы; Telegram-бот, русский язык</w:t>
+              <w:t>Единственный человеческий интерфейс; Telegram-бот, русский язык</w:t>
             </w:r>
           </w:p>
         </w:tc>
@@ -561,7 +565,7 @@
         <w:pStyle w:val="Heading2"/>
       </w:pPr>
       <w:r>
-        <w:t>2.2 Потоки данных между агентами</w:t>
+        <w:t>2.2 Потоки данных</w:t>
       </w:r>
     </w:p>
     <w:p>
@@ -577,7 +581,7 @@
         <w:pStyle w:val="ListBullet"/>
       </w:pPr>
       <w:r>
-        <w:t>PLAUDE (аудио + текст) → Communication Intel → Decision Support (при флаге high_risk)</w:t>
+        <w:t>PLAUDE (аудио + транскрипция) → Communication Intel → Decision Support (при флаге high_risk)</w:t>
       </w:r>
     </w:p>
     <w:p>
@@ -585,15 +589,7 @@
         <w:pStyle w:val="ListBullet"/>
       </w:pPr>
       <w:r>
-        <w:t>Network → Communication Intel (профили участников переговоров)</w:t>
-      </w:r>
-    </w:p>
-    <w:p>
-      <w:pPr>
-        <w:pStyle w:val="ListBullet"/>
-      </w:pPr>
-      <w:r>
-        <w:t>Network → Decision Support (контекст по вовлечённым людям)</w:t>
+        <w:t>Network → Communication Intel (профили участников) + Decision Support (контекст людей)</w:t>
       </w:r>
     </w:p>
     <w:p>
@@ -617,23 +613,15 @@
         <w:pStyle w:val="ListBullet"/>
       </w:pPr>
       <w:r>
-        <w:t>Neuro &amp; Bio → Health (текущее состояние для контекста)</w:t>
+        <w:t>Аня → все агенты (ручные вводы данных и команды)</w:t>
       </w:r>
     </w:p>
     <w:p>
       <w:pPr>
-        <w:pStyle w:val="ListBullet"/>
+        <w:pStyle w:val="Heading2"/>
       </w:pPr>
       <w:r>
-        <w:t>Аня (CoS) → все агенты (ручные вводы данных)</w:t>
-      </w:r>
-    </w:p>
-    <w:p>
-      <w:pPr>
-        <w:pStyle w:val="Heading2"/>
-      </w:pPr>
-      <w:r>
-        <w:t>2.3 Правила приоритетов и конфликтов</w:t>
+        <w:t>2.3 Правила приоритетов</w:t>
       </w:r>
     </w:p>
     <w:tbl>
@@ -650,11 +638,13 @@
         <w:tc>
           <w:tcPr>
             <w:tcW w:type="dxa" w:w="4561"/>
+            <w:shd w:fill="5C38BA" w:val="clear"/>
           </w:tcPr>
           <w:p>
             <w:r>
               <w:rPr>
                 <w:b/>
+                <w:color w:val="FFFFFF"/>
               </w:rPr>
               <w:t>Конфликт</w:t>
             </w:r>
@@ -663,11 +653,13 @@
         <w:tc>
           <w:tcPr>
             <w:tcW w:type="dxa" w:w="4561"/>
+            <w:shd w:fill="5C38BA" w:val="clear"/>
           </w:tcPr>
           <w:p>
             <w:r>
               <w:rPr>
                 <w:b/>
+                <w:color w:val="FFFFFF"/>
               </w:rPr>
               <w:t>Правило</w:t>
             </w:r>
@@ -713,7 +705,29 @@
           </w:tcPr>
           <w:p>
             <w:r>
-              <w:t>Оба сигнала передаются Ане одновременно; решение за ней</w:t>
+              <w:t>Оба сигнала передаются Ане; решение за ней</w:t>
+            </w:r>
+          </w:p>
+        </w:tc>
+      </w:tr>
+      <w:tr>
+        <w:tc>
+          <w:tcPr>
+            <w:tcW w:type="dxa" w:w="4561"/>
+          </w:tcPr>
+          <w:p>
+            <w:r>
+              <w:t>Несколько критических алертов</w:t>
+            </w:r>
+          </w:p>
+        </w:tc>
+        <w:tc>
+          <w:tcPr>
+            <w:tcW w:type="dxa" w:w="4561"/>
+          </w:tcPr>
+          <w:p>
+            <w:r>
+              <w:t>Decision Support агрегирует и показывает в порядке приоритета</w:t>
             </w:r>
           </w:p>
         </w:tc>
@@ -740,7 +754,7 @@
         <w:pStyle w:val="Heading2"/>
       </w:pPr>
       <w:r>
-        <w:t>3.1 Neuro &amp; Bio Intelligence Agent  [✅ Фаза 1 MVP]</w:t>
+        <w:t>3.1 Neuro &amp; Bio Intelligence Agent  [✅ MVP]</w:t>
       </w:r>
     </w:p>
     <w:p>
@@ -749,7 +763,7 @@
           <w:b w:val="0"/>
           <w:i w:val="0"/>
         </w:rPr>
-        <w:t>Основная цель: максимизировать продуктивность и work-life баланс через анализ физического, психологического и ментального состояния — с выдачей конкретных рекомендаций по расписанию и восстановлению.</w:t>
+        <w:t>Мониторинг физического и ментального состояния; оптимизация расписания на основе биометрии.</w:t>
       </w:r>
     </w:p>
     <w:p>
@@ -766,7 +780,7 @@
         <w:pStyle w:val="ListBullet"/>
       </w:pPr>
       <w:r>
-        <w:t>Oura Ring (авто): HRV, качество сна, ЧСС, Readiness Score</w:t>
+        <w:t>Oura Ring API (авто): HRV, качество сна, ЧСС, Readiness Score</w:t>
       </w:r>
     </w:p>
     <w:p>
@@ -774,7 +788,7 @@
         <w:pStyle w:val="ListBullet"/>
       </w:pPr>
       <w:r>
-        <w:t>Ручной ввод — Аня: Энергия, фокус, настроение (субъективная оценка)</w:t>
+        <w:t>Ручной ввод Ани: Энергия (1-10), Фокус (1-10), Настроение (1-10)</w:t>
       </w:r>
     </w:p>
     <w:p>
@@ -782,7 +796,7 @@
         <w:pStyle w:val="ListBullet"/>
       </w:pPr>
       <w:r>
-        <w:t>Ручной ввод — Аня: Тренировка (Да/Нет), Массаж (Да/Нет), Алкоголь (Да/Нет)</w:t>
+        <w:t>Ручной ввод Ани: Тренировка (Да/Нет), Массаж (Да/Нет), Алкоголь (Да/Нет)</w:t>
       </w:r>
     </w:p>
     <w:p>
@@ -790,7 +804,7 @@
         <w:pStyle w:val="ListBullet"/>
       </w:pPr>
       <w:r>
-        <w:t>Health &amp; Maintenance Agent: Медицинский контекст</w:t>
+        <w:t>Health Agent: медицинский контекст (Фаза 2)</w:t>
       </w:r>
     </w:p>
     <w:p>
@@ -798,7 +812,7 @@
         <w:pStyle w:val="ListBullet"/>
       </w:pPr>
       <w:r>
-        <w:t>Календарь (авто): Типы встреч, количество и временные слоты</w:t>
+        <w:t>Google Calendar API: встречи дня — тип, время, участники</w:t>
       </w:r>
     </w:p>
     <w:p>
@@ -807,47 +821,178 @@
           <w:b/>
           <w:i w:val="0"/>
         </w:rPr>
-        <w:t>Типология встреч по когнитивной нагрузке:</w:t>
+        <w:t>Типология встреч:</w:t>
+      </w:r>
+    </w:p>
+    <w:tbl>
+      <w:tblPr>
+        <w:tblStyle w:val="TableGrid"/>
+        <w:tblW w:type="auto" w:w="0"/>
+        <w:tblLook w:firstColumn="1" w:firstRow="1" w:lastColumn="0" w:lastRow="0" w:noHBand="0" w:noVBand="1" w:val="04A0"/>
+      </w:tblPr>
+      <w:tblGrid>
+        <w:gridCol w:w="4561"/>
+        <w:gridCol w:w="4561"/>
+      </w:tblGrid>
+      <w:tr>
+        <w:tc>
+          <w:tcPr>
+            <w:tcW w:type="dxa" w:w="4561"/>
+            <w:shd w:fill="8B0000" w:val="clear"/>
+          </w:tcPr>
+          <w:p>
+            <w:r>
+              <w:rPr>
+                <w:b/>
+                <w:color w:val="FFFFFF"/>
+              </w:rPr>
+              <w:t>Нагрузка</w:t>
+            </w:r>
+          </w:p>
+        </w:tc>
+        <w:tc>
+          <w:tcPr>
+            <w:tcW w:type="dxa" w:w="4561"/>
+            <w:shd w:fill="8B0000" w:val="clear"/>
+          </w:tcPr>
+          <w:p>
+            <w:r>
+              <w:rPr>
+                <w:b/>
+                <w:color w:val="FFFFFF"/>
+              </w:rPr>
+              <w:t>Типы встреч</w:t>
+            </w:r>
+          </w:p>
+        </w:tc>
+      </w:tr>
+      <w:tr>
+        <w:tc>
+          <w:tcPr>
+            <w:tcW w:type="dxa" w:w="4561"/>
+          </w:tcPr>
+          <w:p>
+            <w:r>
+              <w:t>🔴 Высокая</w:t>
+            </w:r>
+          </w:p>
+        </w:tc>
+        <w:tc>
+          <w:tcPr>
+            <w:tcW w:type="dxa" w:w="4561"/>
+          </w:tcPr>
+          <w:p>
+            <w:r>
+              <w:t>Стратегические, переговоры/сделки, публичные выступления, командировки</w:t>
+            </w:r>
+          </w:p>
+        </w:tc>
+      </w:tr>
+      <w:tr>
+        <w:tc>
+          <w:tcPr>
+            <w:tcW w:type="dxa" w:w="4561"/>
+          </w:tcPr>
+          <w:p>
+            <w:r>
+              <w:t>🟡 Средняя</w:t>
+            </w:r>
+          </w:p>
+        </w:tc>
+        <w:tc>
+          <w:tcPr>
+            <w:tcW w:type="dxa" w:w="4561"/>
+          </w:tcPr>
+          <w:p>
+            <w:r>
+              <w:t>Операционные (команда), личные встречи 1-на-1</w:t>
+            </w:r>
+          </w:p>
+        </w:tc>
+      </w:tr>
+      <w:tr>
+        <w:tc>
+          <w:tcPr>
+            <w:tcW w:type="dxa" w:w="4561"/>
+          </w:tcPr>
+          <w:p>
+            <w:r>
+              <w:t>🟢 Низкая</w:t>
+            </w:r>
+          </w:p>
+        </w:tc>
+        <w:tc>
+          <w:tcPr>
+            <w:tcW w:type="dxa" w:w="4561"/>
+          </w:tcPr>
+          <w:p>
+            <w:r>
+              <w:t>Административные, рутинные</w:t>
+            </w:r>
+          </w:p>
+        </w:tc>
+      </w:tr>
+      <w:tr>
+        <w:tc>
+          <w:tcPr>
+            <w:tcW w:type="dxa" w:w="4561"/>
+          </w:tcPr>
+          <w:p>
+            <w:r>
+              <w:t>⚪ Защищён</w:t>
+            </w:r>
+          </w:p>
+        </w:tc>
+        <w:tc>
+          <w:tcPr>
+            <w:tcW w:type="dxa" w:w="4561"/>
+          </w:tcPr>
+          <w:p>
+            <w:r>
+              <w:t>Восстановительные блоки (спорт, отдых) — агент не трогает</w:t>
+            </w:r>
+          </w:p>
+        </w:tc>
+      </w:tr>
+      <w:tr>
+        <w:tc>
+          <w:tcPr>
+            <w:tcW w:type="dxa" w:w="4561"/>
+          </w:tcPr>
+          <w:p>
+            <w:r>
+              <w:t>⚪ Неприкосновенно</w:t>
+            </w:r>
+          </w:p>
+        </w:tc>
+        <w:tc>
+          <w:tcPr>
+            <w:tcW w:type="dxa" w:w="4561"/>
+          </w:tcPr>
+          <w:p>
+            <w:r>
+              <w:t>Семья / личная жизнь — агент игнорирует</w:t>
+            </w:r>
+          </w:p>
+        </w:tc>
+      </w:tr>
+    </w:tbl>
+    <w:p/>
+    <w:p>
+      <w:pPr>
+        <w:pStyle w:val="Heading2"/>
+      </w:pPr>
+      <w:r>
+        <w:t>3.2 Decision Support Agent  [✅ MVP]</w:t>
       </w:r>
     </w:p>
     <w:p>
-      <w:pPr>
-        <w:pStyle w:val="ListBullet"/>
-      </w:pPr>
       <w:r>
-        <w:t>🔴 Высокая: Стратегические, переговоры/сделки, публичные выступления, командировки</w:t>
-      </w:r>
-    </w:p>
-    <w:p>
-      <w:pPr>
-        <w:pStyle w:val="ListBullet"/>
-      </w:pPr>
-      <w:r>
-        <w:t>🟡 Средняя: Операционные (команда), личные встречи 1-на-1</w:t>
-      </w:r>
-    </w:p>
-    <w:p>
-      <w:pPr>
-        <w:pStyle w:val="ListBullet"/>
-      </w:pPr>
-      <w:r>
-        <w:t>🟢 Низкая: Административные, рутинные</w:t>
-      </w:r>
-    </w:p>
-    <w:p>
-      <w:pPr>
-        <w:pStyle w:val="ListBullet"/>
-      </w:pPr>
-      <w:r>
-        <w:t>⚪ Защищённый ресурс: Восстановительные блоки (спорт, отдых)</w:t>
-      </w:r>
-    </w:p>
-    <w:p>
-      <w:pPr>
-        <w:pStyle w:val="ListBullet"/>
-      </w:pPr>
-      <w:r>
-        <w:t>⚪ Неприкосновенно: Семья / личная жизнь — агент не трогает</w:t>
+        <w:rPr>
+          <w:b w:val="0"/>
+          <w:i w:val="0"/>
+        </w:rPr>
+        <w:t>Центральный мозг: агрегирует контекст всех агентов, приоритизирует задачи, выступает арбитром.</w:t>
       </w:r>
     </w:p>
     <w:p>
@@ -856,74 +1001,7 @@
           <w:b/>
           <w:i w:val="0"/>
         </w:rPr>
-        <w:t>Логика анализа:</w:t>
-      </w:r>
-    </w:p>
-    <w:p>
-      <w:pPr>
-        <w:pStyle w:val="ListBullet"/>
-      </w:pPr>
-      <w:r>
-        <w:t>Пороговые алерты (срочные): Readiness Score &lt; N → флаг на перегруз, предложение переноса тяжёлых встреч</w:t>
-      </w:r>
-    </w:p>
-    <w:p>
-      <w:pPr>
-        <w:pStyle w:val="ListBullet"/>
-      </w:pPr>
-      <w:r>
-        <w:t>Паттерны (проактивные): Анализ динамики за 7 дней; предупреждение до наступления перегруза</w:t>
-      </w:r>
-    </w:p>
-    <w:p>
-      <w:pPr>
-        <w:pStyle w:val="ListBullet"/>
-      </w:pPr>
-      <w:r>
-        <w:t>Приоритет субъективного ввода: при конфликте данных Oura vs. субъективный ввод — победа за субъективным (флаг data_conflict)</w:t>
-      </w:r>
-    </w:p>
-    <w:p>
-      <w:r>
-        <w:rPr>
-          <w:b/>
-          <w:i w:val="0"/>
-        </w:rPr>
-        <w:t>Пример вывода:</w:t>
-      </w:r>
-    </w:p>
-    <w:p>
-      <w:r>
-        <w:rPr>
-          <w:i/>
-        </w:rPr>
-        <w:t>Readiness Score сегодня 61 (4-й день снижения подряд). Стратегическая встреча с партнёрами в 14:00 несёт высокий когнитивный риск. Рекомендую перенести на среду 10:00-12:00. До встречи: 20-минутная прогулка без телефона. Семейный блок 18:00-20:00 защищён.</w:t>
-      </w:r>
-    </w:p>
-    <w:p>
-      <w:pPr>
-        <w:pStyle w:val="Heading2"/>
-      </w:pPr>
-      <w:r>
-        <w:t>3.2 Decision Support Agent  [✅ Фаза 1 MVP]</w:t>
-      </w:r>
-    </w:p>
-    <w:p>
-      <w:r>
-        <w:rPr>
-          <w:b w:val="0"/>
-          <w:i w:val="0"/>
-        </w:rPr>
-        <w:t>Основная цель: центральный мозг системы — агрегирует контекст всех агентов, проводит мультилинзовый анализ решений, приоритизирует задачи дня, выступает арбитром при конфликтах.</w:t>
-      </w:r>
-    </w:p>
-    <w:p>
-      <w:r>
-        <w:rPr>
-          <w:b/>
-          <w:i w:val="0"/>
-        </w:rPr>
-        <w:t>5 линз анализа решений:</w:t>
+        <w:t>5 линз анализа:</w:t>
       </w:r>
     </w:p>
     <w:p>
@@ -978,65 +1056,7 @@
         <w:t xml:space="preserve">• Коммуникационная: </w:t>
       </w:r>
       <w:r>
-        <w:t>Communication Intel: контекст переговоров и профайлинг</w:t>
-      </w:r>
-    </w:p>
-    <w:p>
-      <w:r>
-        <w:rPr>
-          <w:b/>
-          <w:i w:val="0"/>
-        </w:rPr>
-        <w:t>Триггеры:</w:t>
-      </w:r>
-    </w:p>
-    <w:p>
-      <w:pPr>
-        <w:pStyle w:val="ListBullet"/>
-      </w:pPr>
-      <w:r>
-        <w:t>07:00 МСК (ежедневно): автоматический утренний брифинг</w:t>
-      </w:r>
-    </w:p>
-    <w:p>
-      <w:pPr>
-        <w:pStyle w:val="ListBullet"/>
-      </w:pPr>
-      <w:r>
-        <w:t>22:00 МСК (ежедневно): автоматический вечерний дайджест</w:t>
-      </w:r>
-    </w:p>
-    <w:p>
-      <w:pPr>
-        <w:pStyle w:val="ListBullet"/>
-      </w:pPr>
-      <w:r>
-        <w:t>Личный запрос Ани: описывает ситуацию — агент выдаёт мультилинзовый анализ</w:t>
-      </w:r>
-    </w:p>
-    <w:p>
-      <w:pPr>
-        <w:pStyle w:val="ListBullet"/>
-      </w:pPr>
-      <w:r>
-        <w:t>Конфликт агентов: противоречивые рекомендации — агент выступает арбитром</w:t>
-      </w:r>
-    </w:p>
-    <w:p>
-      <w:r>
-        <w:rPr>
-          <w:b/>
-          <w:i w:val="0"/>
-        </w:rPr>
-        <w:t>Пример утреннего брифинга:</w:t>
-      </w:r>
-    </w:p>
-    <w:p>
-      <w:r>
-        <w:rPr>
-          <w:i/>
-        </w:rPr>
-        <w:t>07:00 МСК. Состояние: Readiness 68, 3-й день снижения. Качество дня (Esoteric): высокое — рекомендован для стратегических решений. Приоритеты: 1) Решение по сделке с Петровым (дедлайн 2 дня); 2) Уточнить юридические гарантии. Рекомендация: перенести операционные встречи на послеобед; пик когнитивной работы — до 13:00.</w:t>
+        <w:t>Comm Intel: профайлинг участников переговоров</w:t>
       </w:r>
     </w:p>
     <w:p>
@@ -1053,40 +1073,7 @@
           <w:b w:val="0"/>
           <w:i w:val="0"/>
         </w:rPr>
-        <w:t>Основная цель: ежедневная оценка качества дня по трём системам и рекомендации по срокам ключевых действий.</w:t>
-      </w:r>
-    </w:p>
-    <w:p>
-      <w:r>
-        <w:rPr>
-          <w:b/>
-        </w:rPr>
-        <w:t xml:space="preserve">• Астрология (транзиты): </w:t>
-      </w:r>
-      <w:r>
-        <w:t>Благоприятные/сложные периоды для сделок, переговоров, запусков. По натальной карте.</w:t>
-      </w:r>
-    </w:p>
-    <w:p>
-      <w:r>
-        <w:rPr>
-          <w:b/>
-        </w:rPr>
-        <w:t xml:space="preserve">• Матрица судьбы: </w:t>
-      </w:r>
-      <w:r>
-        <w:t>Личные энергетические циклы, периоды силы и восстановления.</w:t>
-      </w:r>
-    </w:p>
-    <w:p>
-      <w:r>
-        <w:rPr>
-          <w:b/>
-        </w:rPr>
-        <w:t xml:space="preserve">• Нумерология: </w:t>
-      </w:r>
-      <w:r>
-        <w:t>Личный год, личный месяц, личный день — цифровые циклы влияния.</w:t>
+        <w:t>Ежедневная оценка по трём системам: Астрология (транзиты по натальной карте), Матрица судьбы, Нумерология (личный год/месяц/день).</w:t>
       </w:r>
     </w:p>
     <w:p>
@@ -1095,16 +1082,7 @@
           <w:b w:val="0"/>
           <w:i w:val="0"/>
         </w:rPr>
-        <w:t>Входные данные: дата, время и место рождения; имя для нумерологии. Вносятся при первоначальной настройке.</w:t>
-      </w:r>
-    </w:p>
-    <w:p>
-      <w:r>
-        <w:rPr>
-          <w:b w:val="0"/>
-          <w:i w:val="0"/>
-        </w:rPr>
-        <w:t>Триггер: каждое утро автоматически до начала рабочего дня.</w:t>
+        <w:t>Входные данные: дата+время+место рождения; имя. Триггер: каждое утро автоматически.</w:t>
       </w:r>
     </w:p>
     <w:p>
@@ -1116,12 +1094,11 @@
       </w:r>
     </w:p>
     <w:p>
+      <w:pPr>
+        <w:pStyle w:val="ListBullet"/>
+      </w:pPr>
       <w:r>
-        <w:rPr>
-          <w:b w:val="0"/>
-          <w:i w:val="0"/>
-        </w:rPr>
-        <w:t>Основная цель: трекинг физического здоровья — динамика анализов, врачебные визиты, медикаменты и ресёрч назначений.</w:t>
+        <w:t>Динамика анализов: выявляет устойчивые отклонения от нормы</w:t>
       </w:r>
     </w:p>
     <w:p>
@@ -1129,7 +1106,7 @@
         <w:pStyle w:val="ListBullet"/>
       </w:pPr>
       <w:r>
-        <w:t>Динамика показателей: выявляет устойчивые отклонения в анализах крови и тестах</w:t>
+        <w:t>Ресёрч препаратов: состав, механизм, побочные эффекты, взаимодействия</w:t>
       </w:r>
     </w:p>
     <w:p>
@@ -1137,7 +1114,7 @@
         <w:pStyle w:val="ListBullet"/>
       </w:pPr>
       <w:r>
-        <w:t>Ресёрч препаратов: при новом назначении — состав, механизм действия, побочные эффекты, взаимодействия</w:t>
+        <w:t>Напоминания о визитах и плановых обследованиях</w:t>
       </w:r>
     </w:p>
     <w:p>
@@ -1145,50 +1122,15 @@
         <w:pStyle w:val="ListBullet"/>
       </w:pPr>
       <w:r>
-        <w:t>Напоминания о визитах: контролирует плановые обследования и интервалы между ними</w:t>
+        <w:t>Мониторинг приёма медикаментов и добавок</w:t>
       </w:r>
     </w:p>
     <w:p>
       <w:pPr>
-        <w:pStyle w:val="ListBullet"/>
-      </w:pPr>
-      <w:r>
-        <w:t>Мониторинг приёма: фиксирует факт приёма медикаментов / добавок</w:t>
-      </w:r>
-    </w:p>
-    <w:p>
-      <w:r>
-        <w:rPr>
-          <w:b w:val="0"/>
-          <w:i w:val="0"/>
-        </w:rPr>
-        <w:t>Ограничения: не ставит диагнозов; не назначает медикаменты; только трекает и исследует назначенное врачом.</w:t>
-      </w:r>
-    </w:p>
-    <w:p>
-      <w:pPr>
         <w:pStyle w:val="Heading2"/>
       </w:pPr>
       <w:r>
         <w:t>3.5 Network &amp; Relationship Agent  [⏳ Фаза 2]</w:t>
-      </w:r>
-    </w:p>
-    <w:p>
-      <w:r>
-        <w:rPr>
-          <w:b w:val="0"/>
-          <w:i w:val="0"/>
-        </w:rPr>
-        <w:t>Основная цель: единая карта отношений с приоритетами, ритмами касаний, напоминаниями о датах и коммуникационной поддержкой.</w:t>
-      </w:r>
-    </w:p>
-    <w:p>
-      <w:r>
-        <w:rPr>
-          <w:b/>
-          <w:i w:val="0"/>
-        </w:rPr>
-        <w:t>Круги отношений:</w:t>
       </w:r>
     </w:p>
     <w:tbl>
@@ -1206,11 +1148,13 @@
         <w:tc>
           <w:tcPr>
             <w:tcW w:type="dxa" w:w="3041"/>
+            <w:shd w:fill="CC7700" w:val="clear"/>
           </w:tcPr>
           <w:p>
             <w:r>
               <w:rPr>
                 <w:b/>
+                <w:color w:val="FFFFFF"/>
               </w:rPr>
               <w:t>Круг</w:t>
             </w:r>
@@ -1219,11 +1163,13 @@
         <w:tc>
           <w:tcPr>
             <w:tcW w:type="dxa" w:w="3041"/>
+            <w:shd w:fill="CC7700" w:val="clear"/>
           </w:tcPr>
           <w:p>
             <w:r>
               <w:rPr>
                 <w:b/>
+                <w:color w:val="FFFFFF"/>
               </w:rPr>
               <w:t>Состав</w:t>
             </w:r>
@@ -1232,11 +1178,13 @@
         <w:tc>
           <w:tcPr>
             <w:tcW w:type="dxa" w:w="3041"/>
+            <w:shd w:fill="CC7700" w:val="clear"/>
           </w:tcPr>
           <w:p>
             <w:r>
               <w:rPr>
                 <w:b/>
+                <w:color w:val="FFFFFF"/>
               </w:rPr>
               <w:t>Ритм касания</w:t>
             </w:r>
@@ -1374,15 +1322,6 @@
     </w:tbl>
     <w:p/>
     <w:p>
-      <w:r>
-        <w:rPr>
-          <w:b/>
-          <w:i w:val="0"/>
-        </w:rPr>
-        <w:t>Ключевые функции:</w:t>
-      </w:r>
-    </w:p>
-    <w:p>
       <w:pPr>
         <w:pStyle w:val="ListBullet"/>
       </w:pPr>
@@ -1395,7 +1334,7 @@
         <w:pStyle w:val="ListBullet"/>
       </w:pPr>
       <w:r>
-        <w:t>Персональные поздравления под каждого человека, не повторяет тон и образы. Только русский язык.</w:t>
+        <w:t>Персональные поздравления только на русском языке; не повторяет тон и образы</w:t>
       </w:r>
     </w:p>
     <w:p>
@@ -1403,15 +1342,7 @@
         <w:pStyle w:val="ListBullet"/>
       </w:pPr>
       <w:r>
-        <w:t>Динамика отношений: фиксирует статус (развиваются / стагнируют / охлаждаются); флаг при долгом отсутствии касания</w:t>
-      </w:r>
-    </w:p>
-    <w:p>
-      <w:pPr>
-        <w:pStyle w:val="ListBullet"/>
-      </w:pPr>
-      <w:r>
-        <w:t>Напоминания: дни рождения (за 7, 2 дня и в день), религиозные и государственные праздники, годовщины</w:t>
+        <w:t>Напоминания: дни рождения (за 7 / 2 дня / в день), религиозные праздники, годовщины</w:t>
       </w:r>
     </w:p>
     <w:p>
@@ -1428,16 +1359,15 @@
           <w:b w:val="0"/>
           <w:i w:val="0"/>
         </w:rPr>
-        <w:t>Основная цель: психологический и юридический анализ переговоров на основе аудио и транскрипций из PLAUDE.</w:t>
+        <w:t>Источник: PLAUDE (аудио + транскрипция) — загружает Аня вручную.</w:t>
       </w:r>
     </w:p>
     <w:p>
+      <w:pPr>
+        <w:pStyle w:val="ListBullet"/>
+      </w:pPr>
       <w:r>
-        <w:rPr>
-          <w:b/>
-          <w:i w:val="0"/>
-        </w:rPr>
-        <w:t>Источники данных:</w:t>
+        <w:t>Манипуляции: газлайтинг, давление, лесть, искусственный дефицит времени</w:t>
       </w:r>
     </w:p>
     <w:p>
@@ -1445,7 +1375,7 @@
         <w:pStyle w:val="ListBullet"/>
       </w:pPr>
       <w:r>
-        <w:t>PLAUDE: аудиофайл + текстовое саммари встречи — загружает Аня вручную</w:t>
+        <w:t>Скрытые конфликты: противоречия, избегаемые темы</w:t>
       </w:r>
     </w:p>
     <w:p>
@@ -1453,7 +1383,7 @@
         <w:pStyle w:val="ListBullet"/>
       </w:pPr>
       <w:r>
-        <w:t>Network Agent: профили участников (если контакт есть в базе)</w:t>
+        <w:t>Верификация искренности: несоответствия в логике (признаки, не доказательства)</w:t>
       </w:r>
     </w:p>
     <w:p>
@@ -1461,56 +1391,15 @@
         <w:pStyle w:val="ListBullet"/>
       </w:pPr>
       <w:r>
-        <w:t>Ручной ввод Ани: контекст встречи — участники, цель, дата</w:t>
+        <w:t>Профайлинг: тип личности, мотивации, слабые точки</w:t>
       </w:r>
     </w:p>
     <w:p>
+      <w:pPr>
+        <w:pStyle w:val="ListBullet"/>
+      </w:pPr>
       <w:r>
-        <w:rPr>
-          <w:b/>
-          <w:i w:val="0"/>
-        </w:rPr>
-        <w:t>Аналитические модули:</w:t>
-      </w:r>
-    </w:p>
-    <w:p>
-      <w:pPr>
-        <w:pStyle w:val="ListBullet"/>
-      </w:pPr>
-      <w:r>
-        <w:t>Манипуляции: газлайтинг, давление, лесть, уклонение, искусственный дефицит времени</w:t>
-      </w:r>
-    </w:p>
-    <w:p>
-      <w:pPr>
-        <w:pStyle w:val="ListBullet"/>
-      </w:pPr>
-      <w:r>
-        <w:t>Скрытые конфликты: противоречия между словами, избегаемые темы, напряжение в диалоге</w:t>
-      </w:r>
-    </w:p>
-    <w:p>
-      <w:pPr>
-        <w:pStyle w:val="ListBullet"/>
-      </w:pPr>
-      <w:r>
-        <w:t>Верификация искренности: несоответствия в логике аргументов (признаки, не доказательства)</w:t>
-      </w:r>
-    </w:p>
-    <w:p>
-      <w:pPr>
-        <w:pStyle w:val="ListBullet"/>
-      </w:pPr>
-      <w:r>
-        <w:t>Профайлинг личности: тип личности, мотивации, вероятные слабые точки собеседника</w:t>
-      </w:r>
-    </w:p>
-    <w:p>
-      <w:pPr>
-        <w:pStyle w:val="ListBullet"/>
-      </w:pPr>
-      <w:r>
-        <w:t>Юридический анализ: риски позиции, уязвимости, рекомендации по следующим шагам</w:t>
+        <w:t>Юридический анализ: риски позиции, рекомендации по следующим шагам</w:t>
       </w:r>
     </w:p>
     <w:p>
@@ -1519,24 +1408,7 @@
           <w:b w:val="0"/>
           <w:i w:val="0"/>
         </w:rPr>
-        <w:t>Политика хранения: сохраняются результаты анализа и краткие сведения об участниках. НЕ хранятся: аудиозаписи, полные транскрипции, чувствительные детали переговоров.</w:t>
-      </w:r>
-    </w:p>
-    <w:p>
-      <w:r>
-        <w:rPr>
-          <w:b/>
-          <w:i w:val="0"/>
-        </w:rPr>
-        <w:t>Пример вывода:</w:t>
-      </w:r>
-    </w:p>
-    <w:p>
-      <w:r>
-        <w:rPr>
-          <w:i/>
-        </w:rPr>
-        <w:t>Встреча: переговоры по сделке, 15.01.2025. Участник: Иван Петров. Манипуляция: зафиксирована техника искусственного дефицита времени. Скрытый конфликт: устойчивое избегание прямого ответа по финансовым гарантиям (3 обхода за разговор). Рекомендация: не принимать решение под давлением; запросить письменные гарантии.</w:t>
+        <w:t>Политика хранения: аудио и транскрипции НЕ хранятся. Только структурированные результаты.</w:t>
       </w:r>
     </w:p>
     <w:p>
@@ -1552,7 +1424,7 @@
         <w:rPr>
           <w:color w:val="5838BA"/>
         </w:rPr>
-        <w:t>4. Архитектура памяти агента</w:t>
+        <w:t>4. Архитектура памяти</w:t>
       </w:r>
     </w:p>
     <w:p>
@@ -1561,15 +1433,7 @@
           <w:b w:val="0"/>
           <w:i w:val="0"/>
         </w:rPr>
-        <w:t>На основе анализа лучших практик 2025-2026 (CoALA Framework, Princeton/CMU) выбрана четырёхслойная архитектура памяти в сочетании с фреймворком Mem0 (open-source, Apache-2.0).</w:t>
-      </w:r>
-    </w:p>
-    <w:p>
-      <w:pPr>
-        <w:pStyle w:val="Heading2"/>
-      </w:pPr>
-      <w:r>
-        <w:t>4.1 Четыре слоя памяти</w:t>
+        <w:t>CoALA Framework (Princeton/CMU, 2025) + Mem0 open-source (Apache 2.0, pgvector).</w:t>
       </w:r>
     </w:p>
     <w:tbl>
@@ -1588,11 +1452,13 @@
         <w:tc>
           <w:tcPr>
             <w:tcW w:type="dxa" w:w="2280"/>
+            <w:shd w:fill="5C38BA" w:val="clear"/>
           </w:tcPr>
           <w:p>
             <w:r>
               <w:rPr>
                 <w:b/>
+                <w:color w:val="FFFFFF"/>
               </w:rPr>
               <w:t>Слой</w:t>
             </w:r>
@@ -1601,11 +1467,13 @@
         <w:tc>
           <w:tcPr>
             <w:tcW w:type="dxa" w:w="2280"/>
+            <w:shd w:fill="5C38BA" w:val="clear"/>
           </w:tcPr>
           <w:p>
             <w:r>
               <w:rPr>
                 <w:b/>
+                <w:color w:val="FFFFFF"/>
               </w:rPr>
               <w:t>Что хранит</w:t>
             </w:r>
@@ -1614,26 +1482,30 @@
         <w:tc>
           <w:tcPr>
             <w:tcW w:type="dxa" w:w="2280"/>
+            <w:shd w:fill="5C38BA" w:val="clear"/>
           </w:tcPr>
           <w:p>
             <w:r>
               <w:rPr>
                 <w:b/>
+                <w:color w:val="FFFFFF"/>
               </w:rPr>
-              <w:t>Где хранится</w:t>
+              <w:t>Где</w:t>
             </w:r>
           </w:p>
         </w:tc>
         <w:tc>
           <w:tcPr>
             <w:tcW w:type="dxa" w:w="2280"/>
+            <w:shd w:fill="5C38BA" w:val="clear"/>
           </w:tcPr>
           <w:p>
             <w:r>
               <w:rPr>
                 <w:b/>
+                <w:color w:val="FFFFFF"/>
               </w:rPr>
-              <w:t>Время жизни</w:t>
+              <w:t>TTL</w:t>
             </w:r>
           </w:p>
         </w:tc>
@@ -1645,7 +1517,7 @@
           </w:tcPr>
           <w:p>
             <w:r>
-              <w:t>⚡ Рабочая (Working)</w:t>
+              <w:t>⚡ Рабочая</w:t>
             </w:r>
           </w:p>
         </w:tc>
@@ -1675,7 +1547,7 @@
           </w:tcPr>
           <w:p>
             <w:r>
-              <w:t>Пока идёт разговор</w:t>
+              <w:t>Сессия</w:t>
             </w:r>
           </w:p>
         </w:tc>
@@ -1687,7 +1559,7 @@
           </w:tcPr>
           <w:p>
             <w:r>
-              <w:t>📖 Эпизодическая (Episodic)</w:t>
+              <w:t>📖 Эпизодическая</w:t>
             </w:r>
           </w:p>
         </w:tc>
@@ -1697,7 +1569,7 @@
           </w:tcPr>
           <w:p>
             <w:r>
-              <w:t>Что происходило: история взаимодействий</w:t>
+              <w:t>История взаимодействий, что происходило</w:t>
             </w:r>
           </w:p>
         </w:tc>
@@ -1707,7 +1579,7 @@
           </w:tcPr>
           <w:p>
             <w:r>
-              <w:t>PostgreSQL + векторные эмбеддинги</w:t>
+              <w:t>PostgreSQL + pgvector</w:t>
             </w:r>
           </w:p>
         </w:tc>
@@ -1729,7 +1601,7 @@
           </w:tcPr>
           <w:p>
             <w:r>
-              <w:t>💡 Семантическая (Semantic)</w:t>
+              <w:t>💡 Семантическая</w:t>
             </w:r>
           </w:p>
         </w:tc>
@@ -1739,7 +1611,7 @@
           </w:tcPr>
           <w:p>
             <w:r>
-              <w:t>Факты о боссе, людях, предпочтениях</w:t>
+              <w:t>Факты, предпочтения, профили людей</w:t>
             </w:r>
           </w:p>
         </w:tc>
@@ -1749,7 +1621,7 @@
           </w:tcPr>
           <w:p>
             <w:r>
-              <w:t>Mem0 (pgvector + граф)</w:t>
+              <w:t>Mem0 (Vector+Graph+KV)</w:t>
             </w:r>
           </w:p>
         </w:tc>
@@ -1771,7 +1643,7 @@
           </w:tcPr>
           <w:p>
             <w:r>
-              <w:t>⚙️ Процедурная (Procedural)</w:t>
+              <w:t>⚙️ Процедурная</w:t>
             </w:r>
           </w:p>
         </w:tc>
@@ -1781,7 +1653,7 @@
           </w:tcPr>
           <w:p>
             <w:r>
-              <w:t>Как делать: промты, навыки агентов</w:t>
+              <w:t>Как делать: промты, навыки, инструменты</w:t>
             </w:r>
           </w:p>
         </w:tc>
@@ -1791,7 +1663,7 @@
           </w:tcPr>
           <w:p>
             <w:r>
-              <w:t>Код / System prompt</w:t>
+              <w:t>System prompts / код</w:t>
             </w:r>
           </w:p>
         </w:tc>
@@ -1801,7 +1673,7 @@
           </w:tcPr>
           <w:p>
             <w:r>
-              <w:t>Постоянно (в коде)</w:t>
+              <w:t>Постоянно</w:t>
             </w:r>
           </w:p>
         </w:tc>
@@ -1809,11 +1681,45 @@
     </w:tbl>
     <w:p/>
     <w:p>
+      <w:r>
+        <w:rPr>
+          <w:b w:val="0"/>
+          <w:i w:val="0"/>
+        </w:rPr>
+        <w:t>Mem0 автоматически извлекает факты из разговора и сохраняет без ручного кода. При запросе — семантический поиск возвращает релевантный контекст оркестратору.</w:t>
+      </w:r>
+    </w:p>
+    <w:p>
+      <w:r>
+        <w:br w:type="page"/>
+      </w:r>
+    </w:p>
+    <w:p>
+      <w:pPr>
+        <w:pStyle w:val="Heading1"/>
+      </w:pPr>
+      <w:r>
+        <w:rPr>
+          <w:color w:val="5838BA"/>
+        </w:rPr>
+        <w:t>5. Улучшения и расширения системы</w:t>
+      </w:r>
+    </w:p>
+    <w:p>
+      <w:r>
+        <w:rPr>
+          <w:b w:val="0"/>
+          <w:i/>
+        </w:rPr>
+        <w:t>Ниже — проработанный список улучшений, которые значительно усилят систему. Разбиты по приоритету.</w:t>
+      </w:r>
+    </w:p>
+    <w:p>
       <w:pPr>
         <w:pStyle w:val="Heading2"/>
       </w:pPr>
       <w:r>
-        <w:t>4.2 Mem0 — выбранный фреймворк</w:t>
+        <w:t>5.1 Голосовые сообщения (высокий приоритет)</w:t>
       </w:r>
     </w:p>
     <w:p>
@@ -1822,58 +1728,39 @@
           <w:b w:val="0"/>
           <w:i w:val="0"/>
         </w:rPr>
-        <w:t>Mem0 — open-source REST API, автоматически извлекающий факты и предпочтения из разговоров. Лицензия: Apache 2.0. Работает поверх PostgreSQL с расширением pgvector.</w:t>
+        <w:t>Аня отправляет голосовое — бот транскрибирует через Whisper API, передаёт оркестратору как текст.</w:t>
       </w:r>
     </w:p>
     <w:p>
+      <w:pPr>
+        <w:pStyle w:val="ListBullet"/>
+      </w:pPr>
       <w:r>
-        <w:rPr>
-          <w:b/>
-          <w:i w:val="0"/>
-        </w:rPr>
-        <w:t>Три внутренних хранилища:</w:t>
+        <w:t>Технология: OpenAI Whisper API (или локальный faster-whisper)</w:t>
       </w:r>
     </w:p>
     <w:p>
+      <w:pPr>
+        <w:pStyle w:val="ListBullet"/>
+      </w:pPr>
       <w:r>
-        <w:rPr>
-          <w:b/>
-        </w:rPr>
-        <w:t xml:space="preserve">• Vector Store (pgvector): </w:t>
-      </w:r>
-      <w:r>
-        <w:t>Семантический поиск по смыслу — находит похожий контекст</w:t>
+        <w:t>Формат: Telegram voice message → OGG-файл → Whisper → текст → оркестратор</w:t>
       </w:r>
     </w:p>
     <w:p>
+      <w:pPr>
+        <w:pStyle w:val="ListBullet"/>
+      </w:pPr>
       <w:r>
-        <w:rPr>
-          <w:b/>
-        </w:rPr>
-        <w:t xml:space="preserve">• Graph Store: </w:t>
-      </w:r>
-      <w:r>
-        <w:t>Хранит связи: «Пётр — деловой партнёр», «Ahmed — ключевой клиент, Дубай»</w:t>
+        <w:t>Результат: Аня может говорить вместо печатать — критично для мобильного использования</w:t>
       </w:r>
     </w:p>
     <w:p>
+      <w:pPr>
+        <w:pStyle w:val="Heading2"/>
+      </w:pPr>
       <w:r>
-        <w:rPr>
-          <w:b/>
-        </w:rPr>
-        <w:t xml:space="preserve">• KV Store: </w:t>
-      </w:r>
-      <w:r>
-        <w:t>Быстрые факты: имя, город, язык, предпочтения</w:t>
-      </w:r>
-    </w:p>
-    <w:p>
-      <w:r>
-        <w:rPr>
-          <w:b/>
-          <w:i w:val="0"/>
-        </w:rPr>
-        <w:t>Как работает автоматически:</w:t>
+        <w:t>5.2 Проактивные алерты без запроса (высокий приоритет)</w:t>
       </w:r>
     </w:p>
     <w:p>
@@ -1882,7 +1769,7 @@
           <w:b w:val="0"/>
           <w:i w:val="0"/>
         </w:rPr>
-        <w:t>Аня говорит: «Он предпочитает переговоры до 12:00» — Mem0 извлекает факт, сохраняет в Vector Store + KV Store. При следующем запросе оркестратор получает этот контекст и отвечает персонализированно.</w:t>
+        <w:t>Система сама пишет Ане при наступлении триггера — не ждёт запроса.</w:t>
       </w:r>
     </w:p>
     <w:tbl>
@@ -1900,39 +1787,45 @@
         <w:tc>
           <w:tcPr>
             <w:tcW w:type="dxa" w:w="3041"/>
+            <w:shd w:fill="333333" w:val="clear"/>
           </w:tcPr>
           <w:p>
             <w:r>
               <w:rPr>
                 <w:b/>
+                <w:color w:val="FFFFFF"/>
               </w:rPr>
-              <w:t>Фреймворк</w:t>
+              <w:t>Триггер</w:t>
             </w:r>
           </w:p>
         </w:tc>
         <w:tc>
           <w:tcPr>
             <w:tcW w:type="dxa" w:w="3041"/>
+            <w:shd w:fill="333333" w:val="clear"/>
           </w:tcPr>
           <w:p>
             <w:r>
               <w:rPr>
                 <w:b/>
+                <w:color w:val="FFFFFF"/>
               </w:rPr>
-              <w:t>Преимущества</w:t>
+              <w:t>Кто генерирует</w:t>
             </w:r>
           </w:p>
         </w:tc>
         <w:tc>
           <w:tcPr>
             <w:tcW w:type="dxa" w:w="3041"/>
+            <w:shd w:fill="333333" w:val="clear"/>
           </w:tcPr>
           <w:p>
             <w:r>
               <w:rPr>
                 <w:b/>
+                <w:color w:val="FFFFFF"/>
               </w:rPr>
-              <w:t>Недостатки</w:t>
+              <w:t>Приоритет</w:t>
             </w:r>
           </w:p>
         </w:tc>
@@ -1944,7 +1837,7 @@
           </w:tcPr>
           <w:p>
             <w:r>
-              <w:t>✅ Mem0 (выбран)</w:t>
+              <w:t>Readiness Score ниже порога</w:t>
             </w:r>
           </w:p>
         </w:tc>
@@ -1954,7 +1847,7 @@
           </w:tcPr>
           <w:p>
             <w:r>
-              <w:t>Open-source, pgvector, автоизвлечение фактов, Python-библиотека, идеален для личных ассистентов</w:t>
+              <w:t>Neuro &amp; Bio</w:t>
             </w:r>
           </w:p>
         </w:tc>
@@ -1964,7 +1857,7 @@
           </w:tcPr>
           <w:p>
             <w:r>
-              <w:t>Граф менее мощный, чем у Zep</w:t>
+              <w:t>🔴 Немедленно</w:t>
             </w:r>
           </w:p>
         </w:tc>
@@ -1976,7 +1869,7 @@
           </w:tcPr>
           <w:p>
             <w:r>
-              <w:t>⚠️ Zep / Graphiti</w:t>
+              <w:t>День рождения контакта завтра</w:t>
             </w:r>
           </w:p>
         </w:tc>
@@ -1986,7 +1879,7 @@
           </w:tcPr>
           <w:p>
             <w:r>
-              <w:t>Мощный темпоральный граф связей</w:t>
+              <w:t>Network</w:t>
             </w:r>
           </w:p>
         </w:tc>
@@ -1996,7 +1889,7 @@
           </w:tcPr>
           <w:p>
             <w:r>
-              <w:t>Требует Neo4j, сложнее в настройке</w:t>
+              <w:t>🟡 Утро</w:t>
             </w:r>
           </w:p>
         </w:tc>
@@ -2008,7 +1901,7 @@
           </w:tcPr>
           <w:p>
             <w:r>
-              <w:t>❌ Letta / MemGPT</w:t>
+              <w:t>Тревожный тренд в анализах (3+ периода)</w:t>
             </w:r>
           </w:p>
         </w:tc>
@@ -2018,7 +1911,7 @@
           </w:tcPr>
           <w:p>
             <w:r>
-              <w:t>OS-подобная иерархия памяти, интересен для исследований</w:t>
+              <w:t>Health</w:t>
             </w:r>
           </w:p>
         </w:tc>
@@ -2028,34 +1921,83 @@
           </w:tcPr>
           <w:p>
             <w:r>
-              <w:t>Требует отдельный сервер, медленнее в продакшне</w:t>
+              <w:t>🔴 Немедленно</w:t>
+            </w:r>
+          </w:p>
+        </w:tc>
+      </w:tr>
+      <w:tr>
+        <w:tc>
+          <w:tcPr>
+            <w:tcW w:type="dxa" w:w="3041"/>
+          </w:tcPr>
+          <w:p>
+            <w:r>
+              <w:t>Встреча с высокой нагрузкой при низком Readiness</w:t>
+            </w:r>
+          </w:p>
+        </w:tc>
+        <w:tc>
+          <w:tcPr>
+            <w:tcW w:type="dxa" w:w="3041"/>
+          </w:tcPr>
+          <w:p>
+            <w:r>
+              <w:t>Neuro &amp; Bio</w:t>
+            </w:r>
+          </w:p>
+        </w:tc>
+        <w:tc>
+          <w:tcPr>
+            <w:tcW w:type="dxa" w:w="3041"/>
+          </w:tcPr>
+          <w:p>
+            <w:r>
+              <w:t>🔴 За 2 часа</w:t>
+            </w:r>
+          </w:p>
+        </w:tc>
+      </w:tr>
+      <w:tr>
+        <w:tc>
+          <w:tcPr>
+            <w:tcW w:type="dxa" w:w="3041"/>
+          </w:tcPr>
+          <w:p>
+            <w:r>
+              <w:t>Высокий риск в анализе переговоров</w:t>
+            </w:r>
+          </w:p>
+        </w:tc>
+        <w:tc>
+          <w:tcPr>
+            <w:tcW w:type="dxa" w:w="3041"/>
+          </w:tcPr>
+          <w:p>
+            <w:r>
+              <w:t>Comm Intel</w:t>
+            </w:r>
+          </w:p>
+        </w:tc>
+        <w:tc>
+          <w:tcPr>
+            <w:tcW w:type="dxa" w:w="3041"/>
+          </w:tcPr>
+          <w:p>
+            <w:r>
+              <w:t>🔴 Немедленно</w:t>
             </w:r>
           </w:p>
         </w:tc>
       </w:tr>
     </w:tbl>
+    <w:p/>
     <w:p>
+      <w:pPr>
+        <w:pStyle w:val="Heading2"/>
+      </w:pPr>
       <w:r>
-        <w:br w:type="page"/>
-      </w:r>
-    </w:p>
-    <w:p>
-      <w:pPr>
-        <w:pStyle w:val="Heading1"/>
-      </w:pPr>
-      <w:r>
-        <w:rPr>
-          <w:color w:val="5838BA"/>
-        </w:rPr>
-        <w:t>5. Ритм работы с системой</w:t>
-      </w:r>
-    </w:p>
-    <w:p>
-      <w:pPr>
-        <w:pStyle w:val="Heading2"/>
-      </w:pPr>
-      <w:r>
-        <w:t>5.1  07:00 МСК — Утренний брифинг (автоматически)</w:t>
+        <w:t>5.3 Предвстречный брифинг (высокий приоритет)</w:t>
       </w:r>
     </w:p>
     <w:p>
@@ -2064,7 +2006,284 @@
           <w:b w:val="0"/>
           <w:i w:val="0"/>
         </w:rPr>
-        <w:t>Orchestrator автоматически запускает цепочку агентов и формирует единое сообщение для Ани:</w:t>
+        <w:t>За 30 минут до любой важной встречи система автоматически присылает брифинг.</w:t>
+      </w:r>
+    </w:p>
+    <w:p>
+      <w:pPr>
+        <w:pStyle w:val="ListBullet"/>
+      </w:pPr>
+      <w:r>
+        <w:t>Участники: их профиль из Network Agent (интересы, последний контакт, история)</w:t>
+      </w:r>
+    </w:p>
+    <w:p>
+      <w:pPr>
+        <w:pStyle w:val="ListBullet"/>
+      </w:pPr>
+      <w:r>
+        <w:t>Контекст переговоров: если ранее анализировались встречи с этим человеком</w:t>
+      </w:r>
+    </w:p>
+    <w:p>
+      <w:pPr>
+        <w:pStyle w:val="ListBullet"/>
+      </w:pPr>
+      <w:r>
+        <w:t>Состояние: текущий Readiness и рекомендации (пить воду, подвигаться)</w:t>
+      </w:r>
+    </w:p>
+    <w:p>
+      <w:pPr>
+        <w:pStyle w:val="ListBullet"/>
+      </w:pPr>
+      <w:r>
+        <w:t>Эзотерика (Фаза 2): благоприятность момента для переговоров</w:t>
+      </w:r>
+    </w:p>
+    <w:p>
+      <w:pPr>
+        <w:pStyle w:val="Heading2"/>
+      </w:pPr>
+      <w:r>
+        <w:t>5.4 Еженедельный отчёт (средний приоритет)</w:t>
+      </w:r>
+    </w:p>
+    <w:p>
+      <w:r>
+        <w:rPr>
+          <w:b w:val="0"/>
+          <w:i w:val="0"/>
+        </w:rPr>
+        <w:t>Каждое воскресенье в 20:00 МСК — автоматический недельный анализ.</w:t>
+      </w:r>
+    </w:p>
+    <w:p>
+      <w:pPr>
+        <w:pStyle w:val="ListBullet"/>
+      </w:pPr>
+      <w:r>
+        <w:t>Динамика Readiness и энергии за неделю</w:t>
+      </w:r>
+    </w:p>
+    <w:p>
+      <w:pPr>
+        <w:pStyle w:val="ListBullet"/>
+      </w:pPr>
+      <w:r>
+        <w:t>Топ-встречи по нагрузке и их влияние на состояние</w:t>
+      </w:r>
+    </w:p>
+    <w:p>
+      <w:pPr>
+        <w:pStyle w:val="ListBullet"/>
+      </w:pPr>
+      <w:r>
+        <w:t>Контакты: кто выпал из зоны внимания за неделю</w:t>
+      </w:r>
+    </w:p>
+    <w:p>
+      <w:pPr>
+        <w:pStyle w:val="ListBullet"/>
+      </w:pPr>
+      <w:r>
+        <w:t>Паттерны: когда в эту неделю был пик продуктивности</w:t>
+      </w:r>
+    </w:p>
+    <w:p>
+      <w:pPr>
+        <w:pStyle w:val="ListBullet"/>
+      </w:pPr>
+      <w:r>
+        <w:t>Прогноз следующей недели (Esoteric — Фаза 2)</w:t>
+      </w:r>
+    </w:p>
+    <w:p>
+      <w:pPr>
+        <w:pStyle w:val="Heading2"/>
+      </w:pPr>
+      <w:r>
+        <w:t>5.5 Многоязычные поздравления через Network Agent (средний приоритет)</w:t>
+      </w:r>
+    </w:p>
+    <w:p>
+      <w:r>
+        <w:rPr>
+          <w:b w:val="0"/>
+          <w:i w:val="0"/>
+        </w:rPr>
+        <w:t>Network Agent генерирует поздравления на языке контакта (не только русском).</w:t>
+      </w:r>
+    </w:p>
+    <w:p>
+      <w:pPr>
+        <w:pStyle w:val="ListBullet"/>
+      </w:pPr>
+      <w:r>
+        <w:t>Язык определяется по профилю контакта (поле 'язык' или 'страна')</w:t>
+      </w:r>
+    </w:p>
+    <w:p>
+      <w:pPr>
+        <w:pStyle w:val="ListBullet"/>
+      </w:pPr>
+      <w:r>
+        <w:t>Для арабских контактов — учитывает исламские праздники</w:t>
+      </w:r>
+    </w:p>
+    <w:p>
+      <w:pPr>
+        <w:pStyle w:val="ListBullet"/>
+      </w:pPr>
+      <w:r>
+        <w:t>Хранит историю поздравлений — никогда не повторяет один и тот же текст</w:t>
+      </w:r>
+    </w:p>
+    <w:p>
+      <w:pPr>
+        <w:pStyle w:val="Heading2"/>
+      </w:pPr>
+      <w:r>
+        <w:t>5.6 Анализ документов (средний приоритет)</w:t>
+      </w:r>
+    </w:p>
+    <w:p>
+      <w:r>
+        <w:rPr>
+          <w:b w:val="0"/>
+          <w:i w:val="0"/>
+        </w:rPr>
+        <w:t>Аня пересылает PDF / DOCX — бот анализирует и даёт краткое резюме с рисками.</w:t>
+      </w:r>
+    </w:p>
+    <w:p>
+      <w:pPr>
+        <w:pStyle w:val="ListBullet"/>
+      </w:pPr>
+      <w:r>
+        <w:t>Юридические документы: ключевые условия, риски, что нужно уточнить</w:t>
+      </w:r>
+    </w:p>
+    <w:p>
+      <w:pPr>
+        <w:pStyle w:val="ListBullet"/>
+      </w:pPr>
+      <w:r>
+        <w:t>Финансовые отчёты: ключевые метрики, аномалии</w:t>
+      </w:r>
+    </w:p>
+    <w:p>
+      <w:pPr>
+        <w:pStyle w:val="ListBullet"/>
+      </w:pPr>
+      <w:r>
+        <w:t>Письма и предложения: тон, скрытые намерения, рекомендуемый ответ</w:t>
+      </w:r>
+    </w:p>
+    <w:p>
+      <w:pPr>
+        <w:pStyle w:val="Heading2"/>
+      </w:pPr>
+      <w:r>
+        <w:t>5.7 Мультивременная зона (низкий приоритет)</w:t>
+      </w:r>
+    </w:p>
+    <w:p>
+      <w:r>
+        <w:rPr>
+          <w:b w:val="0"/>
+          <w:i w:val="0"/>
+        </w:rPr>
+        <w:t>При командировке бот автоматически адаптирует расписание и брифинги к местному времени.</w:t>
+      </w:r>
+    </w:p>
+    <w:p>
+      <w:pPr>
+        <w:pStyle w:val="ListBullet"/>
+      </w:pPr>
+      <w:r>
+        <w:t>Аня вводит: 'Я в Дубае до 20 июля' — система переключает временную зону</w:t>
+      </w:r>
+    </w:p>
+    <w:p>
+      <w:pPr>
+        <w:pStyle w:val="ListBullet"/>
+      </w:pPr>
+      <w:r>
+        <w:t>Брифинг подстраивается: 07:00 МСК → 08:00 GST (разница +1 час)</w:t>
+      </w:r>
+    </w:p>
+    <w:p>
+      <w:pPr>
+        <w:pStyle w:val="ListBullet"/>
+      </w:pPr>
+      <w:r>
+        <w:t>Напоминания учитывают локальный рабочий день</w:t>
+      </w:r>
+    </w:p>
+    <w:p>
+      <w:pPr>
+        <w:pStyle w:val="Heading2"/>
+      </w:pPr>
+      <w:r>
+        <w:t>5.8 Кнопочный интерфейс (низкий приоритет)</w:t>
+      </w:r>
+    </w:p>
+    <w:p>
+      <w:r>
+        <w:rPr>
+          <w:b w:val="0"/>
+          <w:i w:val="0"/>
+        </w:rPr>
+        <w:t>Часть команд — через Telegram inline-кнопки вместо текста.</w:t>
+      </w:r>
+    </w:p>
+    <w:p>
+      <w:pPr>
+        <w:pStyle w:val="ListBullet"/>
+      </w:pPr>
+      <w:r>
+        <w:t>Ввод субъективного состояния: кнопки 1-10 вместо текста</w:t>
+      </w:r>
+    </w:p>
+    <w:p>
+      <w:pPr>
+        <w:pStyle w:val="ListBullet"/>
+      </w:pPr>
+      <w:r>
+        <w:t>Подтверждение действий: [Перенести встречу] [Оставить как есть]</w:t>
+      </w:r>
+    </w:p>
+    <w:p>
+      <w:pPr>
+        <w:pStyle w:val="ListBullet"/>
+      </w:pPr>
+      <w:r>
+        <w:t>Быстрые команды: /briefing /status /help</w:t>
+      </w:r>
+    </w:p>
+    <w:p>
+      <w:r>
+        <w:br w:type="page"/>
+      </w:r>
+    </w:p>
+    <w:p>
+      <w:pPr>
+        <w:pStyle w:val="Heading1"/>
+      </w:pPr>
+      <w:r>
+        <w:rPr>
+          <w:color w:val="5838BA"/>
+        </w:rPr>
+        <w:t>6. Ритм работы с системой</w:t>
+      </w:r>
+    </w:p>
+    <w:p>
+      <w:pPr>
+        <w:pStyle w:val="Heading2"/>
+      </w:pPr>
+      <w:r>
+        <w:t>6.1  07:00 МСК — Утренний брифинг</w:t>
       </w:r>
     </w:p>
     <w:tbl>
@@ -2081,11 +2300,13 @@
         <w:tc>
           <w:tcPr>
             <w:tcW w:type="dxa" w:w="4561"/>
+            <w:shd w:fill="1a3a5c" w:val="clear"/>
           </w:tcPr>
           <w:p>
             <w:r>
               <w:rPr>
                 <w:b/>
+                <w:color w:val="FFFFFF"/>
               </w:rPr>
               <w:t>Блок</w:t>
             </w:r>
@@ -2094,11 +2315,13 @@
         <w:tc>
           <w:tcPr>
             <w:tcW w:type="dxa" w:w="4561"/>
+            <w:shd w:fill="1a3a5c" w:val="clear"/>
           </w:tcPr>
           <w:p>
             <w:r>
               <w:rPr>
                 <w:b/>
+                <w:color w:val="FFFFFF"/>
               </w:rPr>
               <w:t>Содержание</w:t>
             </w:r>
@@ -2144,7 +2367,7 @@
           </w:tcPr>
           <w:p>
             <w:r>
-              <w:t>Эзотерическая оценка: общая, по каждой системе, с объяснением</w:t>
+              <w:t>Эзотерическая оценка: общая + по каждой системе с объяснением</w:t>
             </w:r>
           </w:p>
         </w:tc>
@@ -2166,7 +2389,7 @@
           </w:tcPr>
           <w:p>
             <w:r>
-              <w:t>Тип и нагрузка встреч; флаги перегруза; предложения по перестановкам</w:t>
+              <w:t>Встречи дня: тип, нагрузка, флаги перегруза, предложения по перестановкам</w:t>
             </w:r>
           </w:p>
         </w:tc>
@@ -2188,7 +2411,7 @@
           </w:tcPr>
           <w:p>
             <w:r>
-              <w:t>Именинники, религиозные и государственные праздники контактов</w:t>
+              <w:t>Именинники, праздники контактов, годовщины</w:t>
             </w:r>
           </w:p>
         </w:tc>
@@ -2210,7 +2433,7 @@
           </w:tcPr>
           <w:p>
             <w:r>
-              <w:t>Топ-задачи от Decision Support с контекстом и рекомендуемым тайм-слотом</w:t>
+              <w:t>Топ-задачи с контекстом и рекомендуемым тайм-слотом</w:t>
             </w:r>
           </w:p>
         </w:tc>
@@ -2223,7 +2446,7 @@
           <w:b w:val="0"/>
           <w:i w:val="0"/>
         </w:rPr>
-        <w:t>После брифинга Аня вводит субъективный статус: энергия / фокус / настроение / тренировка / массаж / алкоголь. Двухступенчатый пинг при отсутствии ответа: +5 мин → +5 мин → система работает на данных Oura.</w:t>
+        <w:t>После брифинга — ввод субъективного статуса. Пинг +5 мин → +5 мин → работа на данных Oura.</w:t>
       </w:r>
     </w:p>
     <w:p>
@@ -2231,7 +2454,7 @@
         <w:pStyle w:val="Heading2"/>
       </w:pPr>
       <w:r>
-        <w:t>5.2  День — Реактивный режим</w:t>
+        <w:t>6.2  День — Реактивный режим</w:t>
       </w:r>
     </w:p>
     <w:p>
@@ -2239,7 +2462,7 @@
         <w:pStyle w:val="ListBullet"/>
       </w:pPr>
       <w:r>
-        <w:t>Новая встреча в календаре → Neuro &amp; Bio оценивает нагрузку; при необходимости — рекомендация по перестановке</w:t>
+        <w:t>Новая встреча в календаре → Neuro &amp; Bio оценивает нагрузку → рекомендация при необходимости</w:t>
       </w:r>
     </w:p>
     <w:p>
@@ -2247,7 +2470,7 @@
         <w:pStyle w:val="ListBullet"/>
       </w:pPr>
       <w:r>
-        <w:t>Аня загружает запись из PLAUDE → Communication Intelligence проводит анализ переговоров</w:t>
+        <w:t>За 30 мин до важной встречи → предвстречный брифинг (улучшение 5.3)</w:t>
       </w:r>
     </w:p>
     <w:p>
@@ -2255,7 +2478,7 @@
         <w:pStyle w:val="ListBullet"/>
       </w:pPr>
       <w:r>
-        <w:t>Аня описывает дилемму → Decision Support выдаёт мультилинзовый анализ</w:t>
+        <w:t>Загрузка PLAUDE → Communication Intelligence проводит анализ</w:t>
       </w:r>
     </w:p>
     <w:p>
@@ -2263,7 +2486,7 @@
         <w:pStyle w:val="ListBullet"/>
       </w:pPr>
       <w:r>
-        <w:t>Тревожный тренд в Oura → Health Agent проверяет медицинский контекст и флагирует</w:t>
+        <w:t>Запрос Ани → Decision Support выдаёт мультилинзовый анализ</w:t>
       </w:r>
     </w:p>
     <w:p>
@@ -2271,15 +2494,23 @@
         <w:pStyle w:val="ListBullet"/>
       </w:pPr>
       <w:r>
-        <w:t>Аня вводит данные вручную (анализы, препараты, информацию о контакте) → агент обновляет базу</w:t>
+        <w:t>Тревожный тренд Oura → Health флагирует и уведомляет</w:t>
       </w:r>
     </w:p>
     <w:p>
       <w:pPr>
+        <w:pStyle w:val="ListBullet"/>
+      </w:pPr>
+      <w:r>
+        <w:t>Голосовое сообщение → Whisper транскрибирует → оркестратор обрабатывает</w:t>
+      </w:r>
+    </w:p>
+    <w:p>
+      <w:pPr>
         <w:pStyle w:val="Heading2"/>
       </w:pPr>
       <w:r>
-        <w:t>5.3  22:00 МСК — Вечерний дайджест (автоматически)</w:t>
+        <w:t>6.3  22:00 МСК — Вечерний дайджест</w:t>
       </w:r>
     </w:p>
     <w:tbl>
@@ -2296,11 +2527,13 @@
         <w:tc>
           <w:tcPr>
             <w:tcW w:type="dxa" w:w="4561"/>
+            <w:shd w:fill="1a3a5c" w:val="clear"/>
           </w:tcPr>
           <w:p>
             <w:r>
               <w:rPr>
                 <w:b/>
+                <w:color w:val="FFFFFF"/>
               </w:rPr>
               <w:t>Блок</w:t>
             </w:r>
@@ -2309,11 +2542,13 @@
         <w:tc>
           <w:tcPr>
             <w:tcW w:type="dxa" w:w="4561"/>
+            <w:shd w:fill="1a3a5c" w:val="clear"/>
           </w:tcPr>
           <w:p>
             <w:r>
               <w:rPr>
                 <w:b/>
+                <w:color w:val="FFFFFF"/>
               </w:rPr>
               <w:t>Содержание</w:t>
             </w:r>
@@ -2337,7 +2572,7 @@
           </w:tcPr>
           <w:p>
             <w:r>
-              <w:t>Динамика Readiness / состояния: как прошёл день</w:t>
+              <w:t>Динамика Readiness и состояния за день</w:t>
             </w:r>
           </w:p>
         </w:tc>
@@ -2422,7 +2657,7 @@
         <w:rPr>
           <w:color w:val="5838BA"/>
         </w:rPr>
-        <w:t>6. Технологический стек</w:t>
+        <w:t>7. Технологический стек</w:t>
       </w:r>
     </w:p>
     <w:tbl>
@@ -2440,11 +2675,13 @@
         <w:tc>
           <w:tcPr>
             <w:tcW w:type="dxa" w:w="3041"/>
+            <w:shd w:fill="5C38BA" w:val="clear"/>
           </w:tcPr>
           <w:p>
             <w:r>
               <w:rPr>
                 <w:b/>
+                <w:color w:val="FFFFFF"/>
               </w:rPr>
               <w:t>Компонент</w:t>
             </w:r>
@@ -2453,11 +2690,13 @@
         <w:tc>
           <w:tcPr>
             <w:tcW w:type="dxa" w:w="3041"/>
+            <w:shd w:fill="5C38BA" w:val="clear"/>
           </w:tcPr>
           <w:p>
             <w:r>
               <w:rPr>
                 <w:b/>
+                <w:color w:val="FFFFFF"/>
               </w:rPr>
               <w:t>Технология</w:t>
             </w:r>
@@ -2466,13 +2705,15 @@
         <w:tc>
           <w:tcPr>
             <w:tcW w:type="dxa" w:w="3041"/>
+            <w:shd w:fill="5C38BA" w:val="clear"/>
           </w:tcPr>
           <w:p>
             <w:r>
               <w:rPr>
                 <w:b/>
+                <w:color w:val="FFFFFF"/>
               </w:rPr>
-              <w:t>Назначение</w:t>
+              <w:t>Версия / Примечание</w:t>
             </w:r>
           </w:p>
         </w:tc>
@@ -2494,7 +2735,7 @@
           </w:tcPr>
           <w:p>
             <w:r>
-              <w:t>Python + aiogram 3.x</w:t>
+              <w:t>Python + aiogram</w:t>
             </w:r>
           </w:p>
         </w:tc>
@@ -2504,7 +2745,7 @@
           </w:tcPr>
           <w:p>
             <w:r>
-              <w:t>Единственный интерфейс пользователя</w:t>
+              <w:t>aiogram 3.x, FSM для диалогов</w:t>
             </w:r>
           </w:p>
         </w:tc>
@@ -2536,7 +2777,39 @@
           </w:tcPr>
           <w:p>
             <w:r>
-              <w:t>Принятие решений, генерация ответов, ReAct-паттерн</w:t>
+              <w:t>Модель: gpt-4o, temperature: 0.3</w:t>
+            </w:r>
+          </w:p>
+        </w:tc>
+      </w:tr>
+      <w:tr>
+        <w:tc>
+          <w:tcPr>
+            <w:tcW w:type="dxa" w:w="3041"/>
+          </w:tcPr>
+          <w:p>
+            <w:r>
+              <w:t>Голос → Текст</w:t>
+            </w:r>
+          </w:p>
+        </w:tc>
+        <w:tc>
+          <w:tcPr>
+            <w:tcW w:type="dxa" w:w="3041"/>
+          </w:tcPr>
+          <w:p>
+            <w:r>
+              <w:t>OpenAI Whisper API</w:t>
+            </w:r>
+          </w:p>
+        </w:tc>
+        <w:tc>
+          <w:tcPr>
+            <w:tcW w:type="dxa" w:w="3041"/>
+          </w:tcPr>
+          <w:p>
+            <w:r>
+              <w:t>model: whisper-1, язык: ru</w:t>
             </w:r>
           </w:p>
         </w:tc>
@@ -2568,7 +2841,7 @@
           </w:tcPr>
           <w:p>
             <w:r>
-              <w:t>Долгосрочное хранение всех данных</w:t>
+              <w:t>Replit PostgreSQL, расширение vector</w:t>
             </w:r>
           </w:p>
         </w:tc>
@@ -2590,7 +2863,7 @@
           </w:tcPr>
           <w:p>
             <w:r>
-              <w:t>Mem0 (open-source, Apache 2.0)</w:t>
+              <w:t>Mem0 (open-source)</w:t>
             </w:r>
           </w:p>
         </w:tc>
@@ -2600,7 +2873,7 @@
           </w:tcPr>
           <w:p>
             <w:r>
-              <w:t>Автоизвлечение фактов, семантический поиск</w:t>
+              <w:t>pip install mem0ai, Apache 2.0</w:t>
             </w:r>
           </w:p>
         </w:tc>
@@ -2622,7 +2895,7 @@
           </w:tcPr>
           <w:p>
             <w:r>
-              <w:t>Oura Ring API</w:t>
+              <w:t>Oura Ring API v2</w:t>
             </w:r>
           </w:p>
         </w:tc>
@@ -2632,7 +2905,7 @@
           </w:tcPr>
           <w:p>
             <w:r>
-              <w:t>HRV, Readiness Score, сон, ЧСС</w:t>
+              <w:t>Bearer token, REST API</w:t>
             </w:r>
           </w:p>
         </w:tc>
@@ -2654,7 +2927,7 @@
           </w:tcPr>
           <w:p>
             <w:r>
-              <w:t>PLAUDE (аудио + транскрипция)</w:t>
+              <w:t>PLAUDE</w:t>
             </w:r>
           </w:p>
         </w:tc>
@@ -2664,7 +2937,7 @@
           </w:tcPr>
           <w:p>
             <w:r>
-              <w:t>Анализ встреч</w:t>
+              <w:t>Аудио + текст, загружается вручную</w:t>
             </w:r>
           </w:p>
         </w:tc>
@@ -2676,7 +2949,7 @@
           </w:tcPr>
           <w:p>
             <w:r>
-              <w:t>Инфраструктура</w:t>
+              <w:t>Планировщик</w:t>
             </w:r>
           </w:p>
         </w:tc>
@@ -2686,7 +2959,7 @@
           </w:tcPr>
           <w:p>
             <w:r>
-              <w:t>Replit (хостинг)</w:t>
+              <w:t>APScheduler</w:t>
             </w:r>
           </w:p>
         </w:tc>
@@ -2696,7 +2969,39 @@
           </w:tcPr>
           <w:p>
             <w:r>
-              <w:t>Деплой и запуск системы</w:t>
+              <w:t>AsyncIOScheduler для 07:00 и 22:00 МСК</w:t>
+            </w:r>
+          </w:p>
+        </w:tc>
+      </w:tr>
+      <w:tr>
+        <w:tc>
+          <w:tcPr>
+            <w:tcW w:type="dxa" w:w="3041"/>
+          </w:tcPr>
+          <w:p>
+            <w:r>
+              <w:t>Хостинг</w:t>
+            </w:r>
+          </w:p>
+        </w:tc>
+        <w:tc>
+          <w:tcPr>
+            <w:tcW w:type="dxa" w:w="3041"/>
+          </w:tcPr>
+          <w:p>
+            <w:r>
+              <w:t>Replit</w:t>
+            </w:r>
+          </w:p>
+        </w:tc>
+        <w:tc>
+          <w:tcPr>
+            <w:tcW w:type="dxa" w:w="3041"/>
+          </w:tcPr>
+          <w:p>
+            <w:r>
+              <w:t>Always-on deployment</w:t>
             </w:r>
           </w:p>
         </w:tc>
@@ -2718,7 +3023,7 @@
           </w:tcPr>
           <w:p>
             <w:r>
-              <w:t>ReAct (Reasoning + Acting)</w:t>
+              <w:t>ReAct</w:t>
             </w:r>
           </w:p>
         </w:tc>
@@ -2728,7 +3033,1290 @@
           </w:tcPr>
           <w:p>
             <w:r>
-              <w:t>Думает → Вызывает инструмент → Анализирует результат</w:t>
+              <w:t>Reasoning + Acting через OpenAI function calling</w:t>
+            </w:r>
+          </w:p>
+        </w:tc>
+      </w:tr>
+    </w:tbl>
+    <w:p>
+      <w:r>
+        <w:br w:type="page"/>
+      </w:r>
+    </w:p>
+    <w:p>
+      <w:pPr>
+        <w:pStyle w:val="Heading1"/>
+      </w:pPr>
+      <w:r>
+        <w:rPr>
+          <w:color w:val="5838BA"/>
+        </w:rPr>
+        <w:t>8. Структура проекта</w:t>
+      </w:r>
+    </w:p>
+    <w:p>
+      <w:r>
+        <w:rPr>
+          <w:b w:val="0"/>
+          <w:i/>
+        </w:rPr>
+        <w:t>Точная файловая структура для немедленного начала разработки в Replit.</w:t>
+      </w:r>
+    </w:p>
+    <w:p>
+      <w:pPr>
+        <w:ind w:left="567"/>
+      </w:pPr>
+      <w:r>
+        <w:rPr>
+          <w:rFonts w:ascii="Courier New" w:hAnsi="Courier New"/>
+          <w:color w:val="141414"/>
+          <w:sz w:val="18"/>
+        </w:rPr>
+        <w:t>los/</w:t>
+        <w:br/>
+        <w:t>├── main.py                    # Точка входа: запуск бота + планировщика</w:t>
+        <w:br/>
+        <w:t>├── config.py                  # Настройки: токены, модели, часовой пояс</w:t>
+        <w:br/>
+        <w:t>├── requirements.txt           # Зависимости</w:t>
+        <w:br/>
+        <w:t>│</w:t>
+        <w:br/>
+        <w:t>├── bot/</w:t>
+        <w:br/>
+        <w:t>│   ├── __init__.py</w:t>
+        <w:br/>
+        <w:t>│   ├── handlers.py            # Telegram обработчики сообщений</w:t>
+        <w:br/>
+        <w:t>│   ├── keyboards.py           # Inline-клавиатуры для ввода данных</w:t>
+        <w:br/>
+        <w:t>│   └── voice.py               # Обработка голосовых сообщений (Whisper)</w:t>
+        <w:br/>
+        <w:t>│</w:t>
+        <w:br/>
+        <w:t>├── orchestrator/</w:t>
+        <w:br/>
+        <w:t>│   ├── __init__.py</w:t>
+        <w:br/>
+        <w:t>│   ├── master.py              # Master Orchestrator (ReAct логика)</w:t>
+        <w:br/>
+        <w:t>│   ├── router.py              # Маршрутизация запросов к агентам</w:t>
+        <w:br/>
+        <w:t>│   └── tools.py               # Реестр всех инструментов агентов</w:t>
+        <w:br/>
+        <w:t>│</w:t>
+        <w:br/>
+        <w:t>├── agents/</w:t>
+        <w:br/>
+        <w:t>│   ├── __init__.py</w:t>
+        <w:br/>
+        <w:t>│   ├── neuro_bio.py           # Neuro &amp; Bio Intelligence Agent</w:t>
+        <w:br/>
+        <w:t>│   ├── decision_support.py    # Decision Support Agent</w:t>
+        <w:br/>
+        <w:t>│   ├── esoteric.py            # Esoteric Intelligence Agent (Фаза 2)</w:t>
+        <w:br/>
+        <w:t>│   ├── health.py              # Health &amp; Maintenance Agent (Фаза 2)</w:t>
+        <w:br/>
+        <w:t>│   ├── network.py             # Network &amp; Relationship Agent (Фаза 2)</w:t>
+        <w:br/>
+        <w:t>│   └── communication.py       # Communication Intelligence Agent (Фаза 2)</w:t>
+        <w:br/>
+        <w:t>│</w:t>
+        <w:br/>
+        <w:t>├── memory/</w:t>
+        <w:br/>
+        <w:t>│   ├── __init__.py</w:t>
+        <w:br/>
+        <w:t>│   ├── mem0_client.py         # Mem0: семантическая память</w:t>
+        <w:br/>
+        <w:t>│   └── episodic.py            # Эпизодическая память (PostgreSQL)</w:t>
+        <w:br/>
+        <w:t>│</w:t>
+        <w:br/>
+        <w:t>├── integrations/</w:t>
+        <w:br/>
+        <w:t>│   ├── __init__.py</w:t>
+        <w:br/>
+        <w:t>│   ├── oura.py                # Oura Ring API клиент</w:t>
+        <w:br/>
+        <w:t>│   ├── calendar.py            # Google Calendar API клиент</w:t>
+        <w:br/>
+        <w:t>│   └── whisper.py             # OpenAI Whisper транскрипция</w:t>
+        <w:br/>
+        <w:t>│</w:t>
+        <w:br/>
+        <w:t>├── database/</w:t>
+        <w:br/>
+        <w:t>│   ├── __init__.py</w:t>
+        <w:br/>
+        <w:t>│   ├── models.py              # SQLAlchemy модели</w:t>
+        <w:br/>
+        <w:t>│   ├── crud.py                # CRUD операции</w:t>
+        <w:br/>
+        <w:t>│   └── migrations/</w:t>
+        <w:br/>
+        <w:t>│       └── 001_initial.sql    # Начальная схема БД</w:t>
+        <w:br/>
+        <w:t>│</w:t>
+        <w:br/>
+        <w:t>└── scheduler/</w:t>
+        <w:br/>
+        <w:t xml:space="preserve">    ├── __init__.py</w:t>
+        <w:br/>
+        <w:t xml:space="preserve">    └── jobs.py                # APScheduler: брифинг 07:00, дайджест 22:00</w:t>
+      </w:r>
+    </w:p>
+    <w:p>
+      <w:r>
+        <w:br w:type="page"/>
+      </w:r>
+    </w:p>
+    <w:p>
+      <w:pPr>
+        <w:pStyle w:val="Heading1"/>
+      </w:pPr>
+      <w:r>
+        <w:rPr>
+          <w:color w:val="5838BA"/>
+        </w:rPr>
+        <w:t>9. Схема базы данных (PostgreSQL)</w:t>
+      </w:r>
+    </w:p>
+    <w:p>
+      <w:r>
+        <w:rPr>
+          <w:b w:val="0"/>
+          <w:i/>
+        </w:rPr>
+        <w:t>Полная схема для немедленного создания в Replit PostgreSQL.</w:t>
+      </w:r>
+    </w:p>
+    <w:p>
+      <w:pPr>
+        <w:ind w:left="567"/>
+      </w:pPr>
+      <w:r>
+        <w:rPr>
+          <w:rFonts w:ascii="Courier New" w:hAnsi="Courier New"/>
+          <w:color w:val="141414"/>
+          <w:sz w:val="18"/>
+        </w:rPr>
+        <w:t>-- Расширения</w:t>
+        <w:br/>
+        <w:t>CREATE EXTENSION IF NOT EXISTS vector;</w:t>
+        <w:br/>
+        <w:br/>
+        <w:t>-- Пользователь системы (босс)</w:t>
+        <w:br/>
+        <w:t>CREATE TABLE user_profile (</w:t>
+        <w:br/>
+        <w:t xml:space="preserve">    id SERIAL PRIMARY KEY,</w:t>
+        <w:br/>
+        <w:t xml:space="preserve">    telegram_user_id BIGINT UNIQUE NOT NULL,</w:t>
+        <w:br/>
+        <w:t xml:space="preserve">    name VARCHAR(100),</w:t>
+        <w:br/>
+        <w:t xml:space="preserve">    timezone VARCHAR(50) DEFAULT 'Europe/Moscow',</w:t>
+        <w:br/>
+        <w:t xml:space="preserve">    birth_date DATE,</w:t>
+        <w:br/>
+        <w:t xml:space="preserve">    birth_time TIME,</w:t>
+        <w:br/>
+        <w:t xml:space="preserve">    birth_place VARCHAR(200),</w:t>
+        <w:br/>
+        <w:t xml:space="preserve">    birth_name VARCHAR(200),</w:t>
+        <w:br/>
+        <w:t xml:space="preserve">    created_at TIMESTAMP DEFAULT NOW()</w:t>
+        <w:br/>
+        <w:t>);</w:t>
+        <w:br/>
+        <w:br/>
+        <w:t>-- Ежедневные данные здоровья</w:t>
+        <w:br/>
+        <w:t>CREATE TABLE daily_health (</w:t>
+        <w:br/>
+        <w:t xml:space="preserve">    id SERIAL PRIMARY KEY,</w:t>
+        <w:br/>
+        <w:t xml:space="preserve">    date DATE NOT NULL,</w:t>
+        <w:br/>
+        <w:t xml:space="preserve">    readiness_score INTEGER,</w:t>
+        <w:br/>
+        <w:t xml:space="preserve">    hrv_avg FLOAT,</w:t>
+        <w:br/>
+        <w:t xml:space="preserve">    sleep_score INTEGER,</w:t>
+        <w:br/>
+        <w:t xml:space="preserve">    sleep_hours FLOAT,</w:t>
+        <w:br/>
+        <w:t xml:space="preserve">    heart_rate_avg INTEGER,</w:t>
+        <w:br/>
+        <w:t xml:space="preserve">    energy_subjective INTEGER,       -- 1-10</w:t>
+        <w:br/>
+        <w:t xml:space="preserve">    focus_subjective INTEGER,         -- 1-10</w:t>
+        <w:br/>
+        <w:t xml:space="preserve">    mood_subjective INTEGER,          -- 1-10</w:t>
+        <w:br/>
+        <w:t xml:space="preserve">    workout_done BOOLEAN,</w:t>
+        <w:br/>
+        <w:t xml:space="preserve">    massage_done BOOLEAN,</w:t>
+        <w:br/>
+        <w:t xml:space="preserve">    alcohol BOOLEAN,</w:t>
+        <w:br/>
+        <w:t xml:space="preserve">    data_conflict BOOLEAN DEFAULT FALSE,</w:t>
+        <w:br/>
+        <w:t xml:space="preserve">    created_at TIMESTAMP DEFAULT NOW()</w:t>
+        <w:br/>
+        <w:t>);</w:t>
+        <w:br/>
+        <w:br/>
+        <w:t>-- Встречи из календаря</w:t>
+        <w:br/>
+        <w:t>CREATE TABLE calendar_events (</w:t>
+        <w:br/>
+        <w:t xml:space="preserve">    id SERIAL PRIMARY KEY,</w:t>
+        <w:br/>
+        <w:t xml:space="preserve">    date DATE NOT NULL,</w:t>
+        <w:br/>
+        <w:t xml:space="preserve">    title VARCHAR(500),</w:t>
+        <w:br/>
+        <w:t xml:space="preserve">    start_time TIMESTAMP,</w:t>
+        <w:br/>
+        <w:t xml:space="preserve">    end_time TIMESTAMP,</w:t>
+        <w:br/>
+        <w:t xml:space="preserve">    meeting_type VARCHAR(50),        -- strategic/operational/admin/personal/family</w:t>
+        <w:br/>
+        <w:t xml:space="preserve">    cognitive_load VARCHAR(20),      -- high/medium/low/protected/untouchable</w:t>
+        <w:br/>
+        <w:t xml:space="preserve">    participants TEXT[],</w:t>
+        <w:br/>
+        <w:t xml:space="preserve">    is_protected BOOLEAN DEFAULT FALSE,</w:t>
+        <w:br/>
+        <w:t xml:space="preserve">    created_at TIMESTAMP DEFAULT NOW()</w:t>
+        <w:br/>
+        <w:t>);</w:t>
+        <w:br/>
+        <w:br/>
+        <w:t>-- Семантическая память (Mem0 управляет, но таблица для резервных запросов)</w:t>
+        <w:br/>
+        <w:t>CREATE TABLE semantic_memories (</w:t>
+        <w:br/>
+        <w:t xml:space="preserve">    id SERIAL PRIMARY KEY,</w:t>
+        <w:br/>
+        <w:t xml:space="preserve">    content TEXT NOT NULL,</w:t>
+        <w:br/>
+        <w:t xml:space="preserve">    embedding vector(1536),</w:t>
+        <w:br/>
+        <w:t xml:space="preserve">    category VARCHAR(100),           -- preference/fact/relationship/health/work</w:t>
+        <w:br/>
+        <w:t xml:space="preserve">    source VARCHAR(100),</w:t>
+        <w:br/>
+        <w:t xml:space="preserve">    created_at TIMESTAMP DEFAULT NOW(),</w:t>
+        <w:br/>
+        <w:t xml:space="preserve">    updated_at TIMESTAMP DEFAULT NOW()</w:t>
+        <w:br/>
+        <w:t>);</w:t>
+        <w:br/>
+        <w:br/>
+        <w:t>-- Эпизодическая память (история разговоров)</w:t>
+        <w:br/>
+        <w:t>CREATE TABLE conversation_episodes (</w:t>
+        <w:br/>
+        <w:t xml:space="preserve">    id SERIAL PRIMARY KEY,</w:t>
+        <w:br/>
+        <w:t xml:space="preserve">    session_id UUID,</w:t>
+        <w:br/>
+        <w:t xml:space="preserve">    role VARCHAR(20),                -- user/assistant</w:t>
+        <w:br/>
+        <w:t xml:space="preserve">    content TEXT NOT NULL,</w:t>
+        <w:br/>
+        <w:t xml:space="preserve">    agent_involved VARCHAR(50),</w:t>
+        <w:br/>
+        <w:t xml:space="preserve">    created_at TIMESTAMP DEFAULT NOW()</w:t>
+        <w:br/>
+        <w:t>);</w:t>
+        <w:br/>
+        <w:br/>
+        <w:t>-- Контакты (Network Agent)</w:t>
+        <w:br/>
+        <w:t>CREATE TABLE contacts (</w:t>
+        <w:br/>
+        <w:t xml:space="preserve">    id SERIAL PRIMARY KEY,</w:t>
+        <w:br/>
+        <w:t xml:space="preserve">    full_name VARCHAR(200) NOT NULL,</w:t>
+        <w:br/>
+        <w:t xml:space="preserve">    role VARCHAR(100),               -- partner/client/friend/family/colleague</w:t>
+        <w:br/>
+        <w:t xml:space="preserve">    circle VARCHAR(20),              -- core/close/work/extended</w:t>
+        <w:br/>
+        <w:t xml:space="preserve">    interests TEXT[],</w:t>
+        <w:br/>
+        <w:t xml:space="preserve">    occupation VARCHAR(200),</w:t>
+        <w:br/>
+        <w:t xml:space="preserve">    marital_status VARCHAR(50),</w:t>
+        <w:br/>
+        <w:t xml:space="preserve">    religion VARCHAR(100),</w:t>
+        <w:br/>
+        <w:t xml:space="preserve">    country VARCHAR(100),</w:t>
+        <w:br/>
+        <w:t xml:space="preserve">    city VARCHAR(100),</w:t>
+        <w:br/>
+        <w:t xml:space="preserve">    birth_date DATE,</w:t>
+        <w:br/>
+        <w:t xml:space="preserve">    notes TEXT,</w:t>
+        <w:br/>
+        <w:t xml:space="preserve">    summary TEXT,                    -- AI-генерированное саммари профиля</w:t>
+        <w:br/>
+        <w:t xml:space="preserve">    last_contact DATE,</w:t>
+        <w:br/>
+        <w:t xml:space="preserve">    contact_frequency_days INTEGER,</w:t>
+        <w:br/>
+        <w:t xml:space="preserve">    created_at TIMESTAMP DEFAULT NOW()</w:t>
+        <w:br/>
+        <w:t>);</w:t>
+        <w:br/>
+        <w:br/>
+        <w:t>-- История подарков (Network Agent)</w:t>
+        <w:br/>
+        <w:t>CREATE TABLE gift_history (</w:t>
+        <w:br/>
+        <w:t xml:space="preserve">    id SERIAL PRIMARY KEY,</w:t>
+        <w:br/>
+        <w:t xml:space="preserve">    contact_id INTEGER REFERENCES contacts(id),</w:t>
+        <w:br/>
+        <w:t xml:space="preserve">    occasion VARCHAR(200),</w:t>
+        <w:br/>
+        <w:t xml:space="preserve">    gift_description TEXT,</w:t>
+        <w:br/>
+        <w:t xml:space="preserve">    direction VARCHAR(10),           -- gave/received</w:t>
+        <w:br/>
+        <w:t xml:space="preserve">    date DATE,</w:t>
+        <w:br/>
+        <w:t xml:space="preserve">    created_at TIMESTAMP DEFAULT NOW()</w:t>
+        <w:br/>
+        <w:t>);</w:t>
+        <w:br/>
+        <w:br/>
+        <w:t>-- История поздравлений (Network Agent)</w:t>
+        <w:br/>
+        <w:t>CREATE TABLE greeting_history (</w:t>
+        <w:br/>
+        <w:t xml:space="preserve">    id SERIAL PRIMARY KEY,</w:t>
+        <w:br/>
+        <w:t xml:space="preserve">    contact_id INTEGER REFERENCES contacts(id),</w:t>
+        <w:br/>
+        <w:t xml:space="preserve">    occasion VARCHAR(200),</w:t>
+        <w:br/>
+        <w:t xml:space="preserve">    greeting_text TEXT,</w:t>
+        <w:br/>
+        <w:t xml:space="preserve">    sent_date DATE,</w:t>
+        <w:br/>
+        <w:t xml:space="preserve">    created_at TIMESTAMP DEFAULT NOW()</w:t>
+        <w:br/>
+        <w:t>);</w:t>
+        <w:br/>
+        <w:br/>
+        <w:t>-- Медицинские данные (Health Agent)</w:t>
+        <w:br/>
+        <w:t>CREATE TABLE health_tests (</w:t>
+        <w:br/>
+        <w:t xml:space="preserve">    id SERIAL PRIMARY KEY,</w:t>
+        <w:br/>
+        <w:t xml:space="preserve">    test_name VARCHAR(200),</w:t>
+        <w:br/>
+        <w:t xml:space="preserve">    test_date DATE,</w:t>
+        <w:br/>
+        <w:t xml:space="preserve">    value FLOAT,</w:t>
+        <w:br/>
+        <w:t xml:space="preserve">    unit VARCHAR(50),</w:t>
+        <w:br/>
+        <w:t xml:space="preserve">    normal_min FLOAT,</w:t>
+        <w:br/>
+        <w:t xml:space="preserve">    normal_max FLOAT,</w:t>
+        <w:br/>
+        <w:t xml:space="preserve">    notes TEXT,</w:t>
+        <w:br/>
+        <w:t xml:space="preserve">    created_at TIMESTAMP DEFAULT NOW()</w:t>
+        <w:br/>
+        <w:t>);</w:t>
+        <w:br/>
+        <w:br/>
+        <w:t>CREATE TABLE medications (</w:t>
+        <w:br/>
+        <w:t xml:space="preserve">    id SERIAL PRIMARY KEY,</w:t>
+        <w:br/>
+        <w:t xml:space="preserve">    name VARCHAR(200),</w:t>
+        <w:br/>
+        <w:t xml:space="preserve">    dosage VARCHAR(100),</w:t>
+        <w:br/>
+        <w:t xml:space="preserve">    frequency VARCHAR(100),</w:t>
+        <w:br/>
+        <w:t xml:space="preserve">    prescribed_by VARCHAR(200),</w:t>
+        <w:br/>
+        <w:t xml:space="preserve">    start_date DATE,</w:t>
+        <w:br/>
+        <w:t xml:space="preserve">    end_date DATE,</w:t>
+        <w:br/>
+        <w:t xml:space="preserve">    is_active BOOLEAN DEFAULT TRUE,</w:t>
+        <w:br/>
+        <w:t xml:space="preserve">    research_summary TEXT,          -- AI-ресёрч препарата</w:t>
+        <w:br/>
+        <w:t xml:space="preserve">    created_at TIMESTAMP DEFAULT NOW()</w:t>
+        <w:br/>
+        <w:t>);</w:t>
+        <w:br/>
+        <w:br/>
+        <w:t>CREATE TABLE doctor_visits (</w:t>
+        <w:br/>
+        <w:t xml:space="preserve">    id SERIAL PRIMARY KEY,</w:t>
+        <w:br/>
+        <w:t xml:space="preserve">    doctor_name VARCHAR(200),</w:t>
+        <w:br/>
+        <w:t xml:space="preserve">    specialty VARCHAR(100),</w:t>
+        <w:br/>
+        <w:t xml:space="preserve">    visit_date DATE,</w:t>
+        <w:br/>
+        <w:t xml:space="preserve">    next_visit_date DATE,</w:t>
+        <w:br/>
+        <w:t xml:space="preserve">    notes TEXT,</w:t>
+        <w:br/>
+        <w:t xml:space="preserve">    created_at TIMESTAMP DEFAULT NOW()</w:t>
+        <w:br/>
+        <w:t>);</w:t>
+        <w:br/>
+        <w:br/>
+        <w:t>-- Анализы переговоров (Communication Intel)</w:t>
+        <w:br/>
+        <w:t>CREATE TABLE meeting_analyses (</w:t>
+        <w:br/>
+        <w:t xml:space="preserve">    id SERIAL PRIMARY KEY,</w:t>
+        <w:br/>
+        <w:t xml:space="preserve">    meeting_date DATE,</w:t>
+        <w:br/>
+        <w:t xml:space="preserve">    participants TEXT[],</w:t>
+        <w:br/>
+        <w:t xml:space="preserve">    context TEXT,</w:t>
+        <w:br/>
+        <w:t xml:space="preserve">    manipulation_detected TEXT[],</w:t>
+        <w:br/>
+        <w:t xml:space="preserve">    hidden_conflicts TEXT[],</w:t>
+        <w:br/>
+        <w:t xml:space="preserve">    sincerity_issues TEXT[],</w:t>
+        <w:br/>
+        <w:t xml:space="preserve">    personality_profiles JSONB,</w:t>
+        <w:br/>
+        <w:t xml:space="preserve">    legal_risks TEXT,</w:t>
+        <w:br/>
+        <w:t xml:space="preserve">    recommendations TEXT,</w:t>
+        <w:br/>
+        <w:t xml:space="preserve">    risk_level VARCHAR(20),          -- low/medium/high</w:t>
+        <w:br/>
+        <w:t xml:space="preserve">    created_at TIMESTAMP DEFAULT NOW()</w:t>
+        <w:br/>
+        <w:t>);</w:t>
+        <w:br/>
+        <w:br/>
+        <w:t>-- Настройки системы</w:t>
+        <w:br/>
+        <w:t>CREATE TABLE system_settings (</w:t>
+        <w:br/>
+        <w:t xml:space="preserve">    key VARCHAR(100) PRIMARY KEY,</w:t>
+        <w:br/>
+        <w:t xml:space="preserve">    value TEXT,</w:t>
+        <w:br/>
+        <w:t xml:space="preserve">    updated_at TIMESTAMP DEFAULT NOW()</w:t>
+        <w:br/>
+        <w:t>);</w:t>
+        <w:br/>
+        <w:br/>
+        <w:t>-- Начальные настройки</w:t>
+        <w:br/>
+        <w:t>INSERT INTO system_settings VALUES</w:t>
+        <w:br/>
+        <w:t xml:space="preserve">    ('morning_briefing_time', '07:00'),</w:t>
+        <w:br/>
+        <w:t xml:space="preserve">    ('evening_digest_time', '22:00'),</w:t>
+        <w:br/>
+        <w:t xml:space="preserve">    ('timezone', 'Europe/Moscow'),</w:t>
+        <w:br/>
+        <w:t xml:space="preserve">    ('readiness_low_threshold', '65'),</w:t>
+        <w:br/>
+        <w:t xml:space="preserve">    ('reminder_ping_interval_minutes', '5'),</w:t>
+        <w:br/>
+        <w:t xml:space="preserve">    ('max_pings', '2');</w:t>
+      </w:r>
+    </w:p>
+    <w:p>
+      <w:r>
+        <w:br w:type="page"/>
+      </w:r>
+    </w:p>
+    <w:p>
+      <w:pPr>
+        <w:pStyle w:val="Heading1"/>
+      </w:pPr>
+      <w:r>
+        <w:rPr>
+          <w:color w:val="5838BA"/>
+        </w:rPr>
+        <w:t>10. Системные промты агентов</w:t>
+      </w:r>
+    </w:p>
+    <w:p>
+      <w:r>
+        <w:rPr>
+          <w:b w:val="0"/>
+          <w:i/>
+        </w:rPr>
+        <w:t>Точные system prompts для каждого агента. Использовать как есть при разработке.</w:t>
+      </w:r>
+    </w:p>
+    <w:p>
+      <w:pPr>
+        <w:pStyle w:val="Heading2"/>
+      </w:pPr>
+      <w:r>
+        <w:t>10.1 Master Orchestrator</w:t>
+      </w:r>
+    </w:p>
+    <w:p>
+      <w:pPr>
+        <w:ind w:left="567"/>
+      </w:pPr>
+      <w:r>
+        <w:rPr>
+          <w:rFonts w:ascii="Courier New" w:hAnsi="Courier New"/>
+          <w:color w:val="141414"/>
+          <w:sz w:val="18"/>
+        </w:rPr>
+        <w:t>SYSTEM PROMPT — Master Orchestrator:</w:t>
+        <w:br/>
+        <w:br/>
+        <w:t>Ты — Master Orchestrator системы LOS (Life Operating System).</w:t>
+        <w:br/>
+        <w:t>Твоя роль: получать запросы от Ани (CoS), анализировать их и координировать работу специализированных агентов.</w:t>
+        <w:br/>
+        <w:br/>
+        <w:t>ПРИНЦИПЫ РАБОТЫ:</w:t>
+        <w:br/>
+        <w:t>1. Ты работаешь по паттерну ReAct: Думай → Вызывай инструмент → Анализируй результат → Принимай следующее решение</w:t>
+        <w:br/>
+        <w:t>2. Решение всегда за человеком. Ты только анализируешь и рекомендуешь.</w:t>
+        <w:br/>
+        <w:t>3. Отвечай ТОЛЬКО на русском языке.</w:t>
+        <w:br/>
+        <w:t>4. Будь конкретным: вместо "возможно" пиши "рекомендую".</w:t>
+        <w:br/>
+        <w:t>5. Перед ответом всегда проверяй контекст из памяти (Mem0).</w:t>
+        <w:br/>
+        <w:br/>
+        <w:t>МАРШРУТИЗАЦИЯ:</w:t>
+        <w:br/>
+        <w:t>- Физическое состояние, расписание, энергия → вызови neuro_bio_agent</w:t>
+        <w:br/>
+        <w:t>- Стратегические решения, анализ ситуации → вызови decision_support_agent</w:t>
+        <w:br/>
+        <w:t>- Информация о людях, напоминания → вызови network_agent</w:t>
+        <w:br/>
+        <w:t>- Здоровье, анализы, препараты → вызови health_agent</w:t>
+        <w:br/>
+        <w:t>- Переговоры, анализ встречи → вызови communication_agent</w:t>
+        <w:br/>
+        <w:t>- Астрология, нумерология → вызови esoteric_agent</w:t>
+        <w:br/>
+        <w:t>- Несколько доменов → вызывай агентов последовательно, агрегируй</w:t>
+        <w:br/>
+        <w:br/>
+        <w:t>ФОРМАТ ОТВЕТА АНЕ:</w:t>
+        <w:br/>
+        <w:t>Краткий, структурированный, с конкретными рекомендациями.</w:t>
+        <w:br/>
+        <w:t>Максимум 3-4 абзаца. Без вступлений типа "Конечно!" или "Отлично!".</w:t>
+        <w:br/>
+        <w:t>При критическом алерте — СНАЧАЛА алерт, потом детали.</w:t>
+      </w:r>
+    </w:p>
+    <w:p/>
+    <w:p>
+      <w:pPr>
+        <w:pStyle w:val="Heading2"/>
+      </w:pPr>
+      <w:r>
+        <w:t>10.2 Neuro &amp; Bio Agent</w:t>
+      </w:r>
+    </w:p>
+    <w:p>
+      <w:pPr>
+        <w:ind w:left="567"/>
+      </w:pPr>
+      <w:r>
+        <w:rPr>
+          <w:rFonts w:ascii="Courier New" w:hAnsi="Courier New"/>
+          <w:color w:val="141414"/>
+          <w:sz w:val="18"/>
+        </w:rPr>
+        <w:t>SYSTEM PROMPT — Neuro &amp; Bio Intelligence Agent:</w:t>
+        <w:br/>
+        <w:br/>
+        <w:t>Ты — Neuro &amp; Bio Intelligence Agent системы LOS.</w:t>
+        <w:br/>
+        <w:t>Анализируешь физическое и ментальное состояние босса и оптимизируешь его расписание.</w:t>
+        <w:br/>
+        <w:br/>
+        <w:t>ДАННЫЕ ДЛЯ АНАЛИЗА (получаешь от оркестратора):</w:t>
+        <w:br/>
+        <w:t>- readiness_score: число 0-100 из Oura Ring</w:t>
+        <w:br/>
+        <w:t>- hrv: вариабельность сердечного ритма</w:t>
+        <w:br/>
+        <w:t>- sleep_score: качество сна 0-100</w:t>
+        <w:br/>
+        <w:t>- sleep_hours: часы сна</w:t>
+        <w:br/>
+        <w:t>- energy, focus, mood: субъективная оценка 1-10 (приоритет над Oura при конфликте)</w:t>
+        <w:br/>
+        <w:t>- workout_done, massage_done, alcohol: булевы флаги</w:t>
+        <w:br/>
+        <w:t>- meetings_today: список встреч с типами и временем</w:t>
+        <w:br/>
+        <w:br/>
+        <w:t>ПРАВИЛА АНАЛИЗА:</w:t>
+        <w:br/>
+        <w:t>- Readiness &lt; 65: флаг low_readiness, предложи перенести тяжёлые встречи</w:t>
+        <w:br/>
+        <w:t>- Readiness &lt; 50: критический флаг, настаивай на перестановке расписания</w:t>
+        <w:br/>
+        <w:t>- Снижение 3+ дня подряд: флаг fatigue_pattern, предупреди о накоплении усталости</w:t>
+        <w:br/>
+        <w:t>- Высокая нагрузка при низком readiness: флаг cognitive_risk</w:t>
+        <w:br/>
+        <w:t>- При конфликте субъективного и Oura: используй субъективное, ставь флаг data_conflict</w:t>
+        <w:br/>
+        <w:br/>
+        <w:t>ТИПЫ ВСТРЕЧ:</w:t>
+        <w:br/>
+        <w:t>- strategic / negotiations / public_speaking / travel → нагрузка: HIGH</w:t>
+        <w:br/>
+        <w:t xml:space="preserve">- team_operational / one_on_one → нагрузка: MEDIUM  </w:t>
+        <w:br/>
+        <w:t>- administrative / routine → нагрузка: LOW</w:t>
+        <w:br/>
+        <w:t>- sport / rest → PROTECTED (не трогать)</w:t>
+        <w:br/>
+        <w:t>- family → UNTOUCHABLE (игнорировать)</w:t>
+        <w:br/>
+        <w:br/>
+        <w:t>Отвечай только на русском. Будь конкретным в рекомендациях по времени.</w:t>
+      </w:r>
+    </w:p>
+    <w:p/>
+    <w:p>
+      <w:pPr>
+        <w:pStyle w:val="Heading2"/>
+      </w:pPr>
+      <w:r>
+        <w:t>10.3 Decision Support Agent</w:t>
+      </w:r>
+    </w:p>
+    <w:p>
+      <w:pPr>
+        <w:ind w:left="567"/>
+      </w:pPr>
+      <w:r>
+        <w:rPr>
+          <w:rFonts w:ascii="Courier New" w:hAnsi="Courier New"/>
+          <w:color w:val="141414"/>
+          <w:sz w:val="18"/>
+        </w:rPr>
+        <w:t>SYSTEM PROMPT — Decision Support Agent:</w:t>
+        <w:br/>
+        <w:br/>
+        <w:t>Ты — Decision Support Agent системы LOS.</w:t>
+        <w:br/>
+        <w:t>Агрегируешь контекст всех агентов и формируешь мультилинзовый анализ решений.</w:t>
+        <w:br/>
+        <w:br/>
+        <w:t>ФОРМАТ УТРЕННЕГО БРИФИНГА (07:00 МСК):</w:t>
+        <w:br/>
+        <w:t>---</w:t>
+        <w:br/>
+        <w:t>ДОБРОЕ УТРО. [Дата, день недели]</w:t>
+        <w:br/>
+        <w:br/>
+        <w:t>СОСТОЯНИЕ: [Readiness Score] — [краткая интерпретация]</w:t>
+        <w:br/>
+        <w:t>[Тренд за 7 дней]</w:t>
+        <w:br/>
+        <w:br/>
+        <w:t>КАЧЕСТВО ДНЯ (Эзотерика): [оценка и краткое обоснование]</w:t>
+        <w:br/>
+        <w:br/>
+        <w:t>РАСПИСАНИЕ:</w:t>
+        <w:br/>
+        <w:t>• [Время] — [Встреча] — [нагрузка] [флаг если есть]</w:t>
+        <w:br/>
+        <w:t>[Рекомендации по перестановке если нужны]</w:t>
+        <w:br/>
+        <w:br/>
+        <w:t>ВАЖНЫЕ ДАТЫ: [именинники, праздники или "нет"]</w:t>
+        <w:br/>
+        <w:br/>
+        <w:t>ПРИОРИТЕТЫ ДНЯ:</w:t>
+        <w:br/>
+        <w:t>1. [задача + почему важно + рекомендуемое время]</w:t>
+        <w:br/>
+        <w:t>2. [задача]</w:t>
+        <w:br/>
+        <w:t>3. [задача]</w:t>
+        <w:br/>
+        <w:br/>
+        <w:t>Введи своё состояние: Энергия / Фокус / Настроение / Тренировка / Массаж / Алкоголь</w:t>
+        <w:br/>
+        <w:t>---</w:t>
+        <w:br/>
+        <w:br/>
+        <w:t>ФОРМАТ ВЕЧЕРНЕГО ДАЙДЖЕСТА (22:00 МСК):</w:t>
+        <w:br/>
+        <w:t>---</w:t>
+        <w:br/>
+        <w:t>ВЕЧЕРНИЙ ИТОГ. [Дата]</w:t>
+        <w:br/>
+        <w:br/>
+        <w:t>ДЕНЬ: [краткая оценка как прошёл день по биометрии]</w:t>
+        <w:br/>
+        <w:br/>
+        <w:t>КОНТАКТЫ ПОД ВНИМАНИЕМ: [кто выпал / напоминания]</w:t>
+        <w:br/>
+        <w:br/>
+        <w:t>НЕ ЗАКРЫТО: [открытые задачи]</w:t>
+        <w:br/>
+        <w:br/>
+        <w:t>ЗАВТРА: [предварительная оценка дня — состояние + эзотерика]</w:t>
+        <w:br/>
+        <w:t>---</w:t>
+        <w:br/>
+        <w:br/>
+        <w:t>АРБИТРАЖ конфликтов: физическое состояние &gt; эзотерика &gt; остальное.</w:t>
+      </w:r>
+    </w:p>
+    <w:p/>
+    <w:p>
+      <w:pPr>
+        <w:pStyle w:val="Heading2"/>
+      </w:pPr>
+      <w:r>
+        <w:t>10.4 Network &amp; Relationship Agent</w:t>
+      </w:r>
+    </w:p>
+    <w:p>
+      <w:pPr>
+        <w:ind w:left="567"/>
+      </w:pPr>
+      <w:r>
+        <w:rPr>
+          <w:rFonts w:ascii="Courier New" w:hAnsi="Courier New"/>
+          <w:color w:val="141414"/>
+          <w:sz w:val="18"/>
+        </w:rPr>
+        <w:t>SYSTEM PROMPT — Network &amp; Relationship Agent:</w:t>
+        <w:br/>
+        <w:br/>
+        <w:t>Ты — Network &amp; Relationship Agent системы LOS.</w:t>
+        <w:br/>
+        <w:t>Управляешь картой отношений босса: контакты, ритмы касаний, поздравления, подарки.</w:t>
+        <w:br/>
+        <w:br/>
+        <w:t>ПРАВИЛА:</w:t>
+        <w:br/>
+        <w:t>- Все поздравления ТОЛЬКО на русском языке (даже для иностранных контактов)</w:t>
+        <w:br/>
+        <w:t>- Никогда не повторяй тон, образы, структуру прошлых поздравлений</w:t>
+        <w:br/>
+        <w:t>- Подарки: учитывай интересы + историю подарков (не повторять)</w:t>
+        <w:br/>
+        <w:t>- Семья → всегда в приоритете в уведомлениях</w:t>
+        <w:br/>
+        <w:br/>
+        <w:t>СИСТЕМА НАПОМИНАНИЙ:</w:t>
+        <w:br/>
+        <w:t>- День рождения: за 7 дней (с предложением подарка), за 2 дня, утром в день</w:t>
+        <w:br/>
+        <w:t>- Религиозный/государственный праздник: за 2 дня, за 1 день</w:t>
+        <w:br/>
+        <w:t>- Годовщина: за 2 дня, за 1 день</w:t>
+        <w:br/>
+        <w:br/>
+        <w:t>КРУГИ (circle):</w:t>
+        <w:br/>
+        <w:t>- core: семья + ближайшие партнёры → постоянно</w:t>
+        <w:br/>
+        <w:t>- close: деловые партнёры + близкие друзья → 2-4 раза/месяц</w:t>
+        <w:br/>
+        <w:t>- work: команда, подрядчики, клиенты → по необходимости</w:t>
+        <w:br/>
+        <w:t>- extended: нетворк → раз в квартал</w:t>
+        <w:br/>
+        <w:br/>
+        <w:t>Флаг отношения 'cooling': если последний контакт &gt; 2*рекомендуемого интервала.</w:t>
+      </w:r>
+    </w:p>
+    <w:p/>
+    <w:p>
+      <w:pPr>
+        <w:pStyle w:val="Heading2"/>
+      </w:pPr>
+      <w:r>
+        <w:t>10.5 Communication Intelligence Agent</w:t>
+      </w:r>
+    </w:p>
+    <w:p>
+      <w:pPr>
+        <w:ind w:left="567"/>
+      </w:pPr>
+      <w:r>
+        <w:rPr>
+          <w:rFonts w:ascii="Courier New" w:hAnsi="Courier New"/>
+          <w:color w:val="141414"/>
+          <w:sz w:val="18"/>
+        </w:rPr>
+        <w:t>SYSTEM PROMPT — Communication Intelligence Agent:</w:t>
+        <w:br/>
+        <w:br/>
+        <w:t>Ты — Communication Intelligence Agent системы LOS.</w:t>
+        <w:br/>
+        <w:t>Анализируешь переговоры на основе транскрипций из PLAUDE.</w:t>
+        <w:br/>
+        <w:br/>
+        <w:t>МОДУЛИ АНАЛИЗА:</w:t>
+        <w:br/>
+        <w:t>1. МАНИПУЛЯЦИИ: газлайтинг, давление сроками, лесть-ловушка, уклонение, дефицит</w:t>
+        <w:br/>
+        <w:t>2. СКРЫТЫЕ КОНФЛИКТЫ: темы которых избегают, напряжение в диалоге, противоречия</w:t>
+        <w:br/>
+        <w:t>3. ИСКРЕННОСТЬ: несоответствия в логике — только "признаки", никогда не "ложь"</w:t>
+        <w:br/>
+        <w:t>4. ПРОФАЙЛИНГ: тип личности (DISC/Big5), мотивации, вероятные слабые точки</w:t>
+        <w:br/>
+        <w:t>5. ЮРИДИЧЕСКИЕ РИСКИ: уязвимости позиции, что нужно зафиксировать письменно</w:t>
+        <w:br/>
+        <w:br/>
+        <w:t>ПРАВИЛА:</w:t>
+        <w:br/>
+        <w:t>- Никогда не называй ложь доказанным фактом — только "признаки несоответствия"</w:t>
+        <w:br/>
+        <w:t>- Не храни аудио и транскрипции после анализа</w:t>
+        <w:br/>
+        <w:t>- При уровне риска HIGH → ставь флаг high_risk для Decision Support</w:t>
+        <w:br/>
+        <w:t>- Рекомендации: конкретные следующие шаги</w:t>
+        <w:br/>
+        <w:br/>
+        <w:t>ФОРМАТ ВЫВОДА:</w:t>
+        <w:br/>
+        <w:t>ВСТРЕЧА: [дата, участники, цель]</w:t>
+        <w:br/>
+        <w:t>МАНИПУЛЯЦИИ: [список или "не выявлено"]</w:t>
+        <w:br/>
+        <w:t>СКРЫТЫЕ КОНФЛИКТЫ: [список или "не выявлено"]</w:t>
+        <w:br/>
+        <w:t>ИСКРЕННОСТЬ: [признаки несоответствий или "без отклонений"]</w:t>
+        <w:br/>
+        <w:t>ПРОФАЙЛИНГ [имя]: [краткий профиль]</w:t>
+        <w:br/>
+        <w:t>ЮРИДИЧЕСКИЕ РИСКИ: [список или "нет"]</w:t>
+        <w:br/>
+        <w:t>РЕКОМЕНДАЦИИ: [конкретные действия]</w:t>
+        <w:br/>
+        <w:t>УРОВЕНЬ РИСКА: [LOW / MEDIUM / HIGH]</w:t>
+      </w:r>
+    </w:p>
+    <w:p/>
+    <w:p>
+      <w:pPr>
+        <w:pStyle w:val="Heading2"/>
+      </w:pPr>
+      <w:r>
+        <w:t>10.6 Health &amp; Maintenance Agent</w:t>
+      </w:r>
+    </w:p>
+    <w:p>
+      <w:pPr>
+        <w:ind w:left="567"/>
+      </w:pPr>
+      <w:r>
+        <w:rPr>
+          <w:rFonts w:ascii="Courier New" w:hAnsi="Courier New"/>
+          <w:color w:val="141414"/>
+          <w:sz w:val="18"/>
+        </w:rPr>
+        <w:t>SYSTEM PROMPT — Health &amp; Maintenance Agent:</w:t>
+        <w:br/>
+        <w:br/>
+        <w:t>Ты — Health &amp; Maintenance Agent системы LOS.</w:t>
+        <w:br/>
+        <w:t>Трекаешь здоровье: анализы, препараты, врачебные визиты.</w:t>
+        <w:br/>
+        <w:br/>
+        <w:t>ПРАВИЛА:</w:t>
+        <w:br/>
+        <w:t>- Никогда не ставь диагнозов и не назначай лечение</w:t>
+        <w:br/>
+        <w:t>- Только трекай и исследуй назначенное врачом</w:t>
+        <w:br/>
+        <w:t>- Флаг declining_trend: если показатель снижается 3+ периода подряд</w:t>
+        <w:br/>
+        <w:t>- Ресёрч препарата: состав, механизм, побочные, взаимодействия с другими препаратами в базе</w:t>
+        <w:br/>
+        <w:t>- Напоминание о визите: за 5 дней, за 1 день</w:t>
+        <w:br/>
+        <w:br/>
+        <w:t>Всегда сопровождай флаги конкретной рекомендацией (обратиться к специалисту и к какому).</w:t>
+      </w:r>
+    </w:p>
+    <w:p/>
+    <w:p>
+      <w:pPr>
+        <w:pStyle w:val="Heading2"/>
+      </w:pPr>
+      <w:r>
+        <w:t>10.7 Esoteric Intelligence Agent</w:t>
+      </w:r>
+    </w:p>
+    <w:p>
+      <w:pPr>
+        <w:ind w:left="567"/>
+      </w:pPr>
+      <w:r>
+        <w:rPr>
+          <w:rFonts w:ascii="Courier New" w:hAnsi="Courier New"/>
+          <w:color w:val="141414"/>
+          <w:sz w:val="18"/>
+        </w:rPr>
+        <w:t>SYSTEM PROMPT — Esoteric Intelligence Agent:</w:t>
+        <w:br/>
+        <w:br/>
+        <w:t>Ты — Esoteric Intelligence Agent системы LOS.</w:t>
+        <w:br/>
+        <w:t>Ежедневно оцениваешь качество дня по трём системам.</w:t>
+        <w:br/>
+        <w:br/>
+        <w:t>СИСТЕМЫ:</w:t>
+        <w:br/>
+        <w:t>1. АСТРОЛОГИЯ: анализируй транзиты планет к натальной карте босса</w:t>
+        <w:br/>
+        <w:t xml:space="preserve">   - Благоприятно для: переговоров, подписания, запуска, отдыха, стратегии</w:t>
+        <w:br/>
+        <w:t xml:space="preserve">   - Сложные периоды: отметь и объясни почему</w:t>
+        <w:br/>
+        <w:t>2. МАТРИЦА СУДЬБЫ: личные энергетические циклы на основе даты рождения</w:t>
+        <w:br/>
+        <w:t>3. НУМЕРОЛОГИЯ: личный год + личный месяц + личный день</w:t>
+        <w:br/>
+        <w:br/>
+        <w:t>ФОРМАТ ОЦЕНКИ ДНЯ:</w:t>
+        <w:br/>
+        <w:t>ОБЩАЯ ОЦЕНКА: [высокая / средняя / низкая / нейтральная]</w:t>
+        <w:br/>
+        <w:t>АСТРОЛОГИЯ: [краткий вывод + благоприятные активности]</w:t>
+        <w:br/>
+        <w:t>МАТРИЦА: [энергетический тон дня]</w:t>
+        <w:br/>
+        <w:t>НУМЕРОЛОГИЯ: [личный день X — характеристика]</w:t>
+        <w:br/>
+        <w:t>РЕКОМЕНДАЦИЯ: [что делать / чего избегать сегодня]</w:t>
+        <w:br/>
+        <w:br/>
+        <w:t>ПРАВИЛА:</w:t>
+        <w:br/>
+        <w:t>- Только рекомендации, никогда не "предсказания судьбы"</w:t>
+        <w:br/>
+        <w:t>- Всегда давай обоснование (почему именно так)</w:t>
+        <w:br/>
+        <w:t>- Не давай финансовых и медицинских советов на основе эзотерики</w:t>
+        <w:br/>
+        <w:t>- Если данные не введены — вежливо запроси у Ани</w:t>
+      </w:r>
+    </w:p>
+    <w:p>
+      <w:r>
+        <w:br w:type="page"/>
+      </w:r>
+    </w:p>
+    <w:p>
+      <w:pPr>
+        <w:pStyle w:val="Heading1"/>
+      </w:pPr>
+      <w:r>
+        <w:rPr>
+          <w:color w:val="5838BA"/>
+        </w:rPr>
+        <w:t>11. Руководство по запуску (для разработчика)</w:t>
+      </w:r>
+    </w:p>
+    <w:p>
+      <w:r>
+        <w:rPr>
+          <w:b w:val="0"/>
+          <w:i/>
+        </w:rPr>
+        <w:t>Пошаговые инструкции для немедленного начала разработки в новом Replit-проекте.</w:t>
+      </w:r>
+    </w:p>
+    <w:p>
+      <w:pPr>
+        <w:pStyle w:val="Heading2"/>
+      </w:pPr>
+      <w:r>
+        <w:t>11.1 Создание проекта</w:t>
+      </w:r>
+    </w:p>
+    <w:p>
+      <w:pPr>
+        <w:pStyle w:val="ListNumber"/>
+      </w:pPr>
+      <w:r>
+        <w:t>Создать новый Replit-проект: Python + PostgreSQL</w:t>
+      </w:r>
+    </w:p>
+    <w:p>
+      <w:pPr>
+        <w:pStyle w:val="ListNumber"/>
+      </w:pPr>
+      <w:r>
+        <w:t>Включить Replit PostgreSQL Database (Add-on в настройках)</w:t>
+      </w:r>
+    </w:p>
+    <w:p>
+      <w:pPr>
+        <w:pStyle w:val="ListNumber"/>
+      </w:pPr>
+      <w:r>
+        <w:t>Создать файловую структуру согласно разделу 8</w:t>
+      </w:r>
+    </w:p>
+    <w:p>
+      <w:pPr>
+        <w:pStyle w:val="Heading2"/>
+      </w:pPr>
+      <w:r>
+        <w:t>11.2 Переменные окружения (Secrets в Replit)</w:t>
+      </w:r>
+    </w:p>
+    <w:tbl>
+      <w:tblPr>
+        <w:tblStyle w:val="TableGrid"/>
+        <w:tblW w:type="auto" w:w="0"/>
+        <w:tblLook w:firstColumn="1" w:firstRow="1" w:lastColumn="0" w:lastRow="0" w:noHBand="0" w:noVBand="1" w:val="04A0"/>
+      </w:tblPr>
+      <w:tblGrid>
+        <w:gridCol w:w="3041"/>
+        <w:gridCol w:w="3041"/>
+        <w:gridCol w:w="3041"/>
+      </w:tblGrid>
+      <w:tr>
+        <w:tc>
+          <w:tcPr>
+            <w:tcW w:type="dxa" w:w="3041"/>
+            <w:shd w:fill="2d5a2d" w:val="clear"/>
+          </w:tcPr>
+          <w:p>
+            <w:r>
+              <w:rPr>
+                <w:b/>
+                <w:color w:val="FFFFFF"/>
+              </w:rPr>
+              <w:t>Переменная</w:t>
+            </w:r>
+          </w:p>
+        </w:tc>
+        <w:tc>
+          <w:tcPr>
+            <w:tcW w:type="dxa" w:w="3041"/>
+            <w:shd w:fill="2d5a2d" w:val="clear"/>
+          </w:tcPr>
+          <w:p>
+            <w:r>
+              <w:rPr>
+                <w:b/>
+                <w:color w:val="FFFFFF"/>
+              </w:rPr>
+              <w:t>Значение</w:t>
+            </w:r>
+          </w:p>
+        </w:tc>
+        <w:tc>
+          <w:tcPr>
+            <w:tcW w:type="dxa" w:w="3041"/>
+            <w:shd w:fill="2d5a2d" w:val="clear"/>
+          </w:tcPr>
+          <w:p>
+            <w:r>
+              <w:rPr>
+                <w:b/>
+                <w:color w:val="FFFFFF"/>
+              </w:rPr>
+              <w:t>Как получить</w:t>
+            </w:r>
+          </w:p>
+        </w:tc>
+      </w:tr>
+      <w:tr>
+        <w:tc>
+          <w:tcPr>
+            <w:tcW w:type="dxa" w:w="3041"/>
+          </w:tcPr>
+          <w:p>
+            <w:r>
+              <w:t>TELEGRAM_BOT_TOKEN</w:t>
+            </w:r>
+          </w:p>
+        </w:tc>
+        <w:tc>
+          <w:tcPr>
+            <w:tcW w:type="dxa" w:w="3041"/>
+          </w:tcPr>
+          <w:p>
+            <w:r>
+              <w:t>Ваш токен</w:t>
+            </w:r>
+          </w:p>
+        </w:tc>
+        <w:tc>
+          <w:tcPr>
+            <w:tcW w:type="dxa" w:w="3041"/>
+          </w:tcPr>
+          <w:p>
+            <w:r>
+              <w:t>@BotFather → /newbot</w:t>
+            </w:r>
+          </w:p>
+        </w:tc>
+      </w:tr>
+      <w:tr>
+        <w:tc>
+          <w:tcPr>
+            <w:tcW w:type="dxa" w:w="3041"/>
+          </w:tcPr>
+          <w:p>
+            <w:r>
+              <w:t>OPENAI_API_KEY</w:t>
+            </w:r>
+          </w:p>
+        </w:tc>
+        <w:tc>
+          <w:tcPr>
+            <w:tcW w:type="dxa" w:w="3041"/>
+          </w:tcPr>
+          <w:p>
+            <w:r>
+              <w:t>sk-...</w:t>
+            </w:r>
+          </w:p>
+        </w:tc>
+        <w:tc>
+          <w:tcPr>
+            <w:tcW w:type="dxa" w:w="3041"/>
+          </w:tcPr>
+          <w:p>
+            <w:r>
+              <w:t>platform.openai.com → API Keys</w:t>
+            </w:r>
+          </w:p>
+        </w:tc>
+      </w:tr>
+      <w:tr>
+        <w:tc>
+          <w:tcPr>
+            <w:tcW w:type="dxa" w:w="3041"/>
+          </w:tcPr>
+          <w:p>
+            <w:r>
+              <w:t>OURA_ACCESS_TOKEN</w:t>
+            </w:r>
+          </w:p>
+        </w:tc>
+        <w:tc>
+          <w:tcPr>
+            <w:tcW w:type="dxa" w:w="3041"/>
+          </w:tcPr>
+          <w:p>
+            <w:r>
+              <w:t>Ваш токен</w:t>
+            </w:r>
+          </w:p>
+        </w:tc>
+        <w:tc>
+          <w:tcPr>
+            <w:tcW w:type="dxa" w:w="3041"/>
+          </w:tcPr>
+          <w:p>
+            <w:r>
+              <w:t>cloud.ouraring.com/personal-access-tokens</w:t>
+            </w:r>
+          </w:p>
+        </w:tc>
+      </w:tr>
+      <w:tr>
+        <w:tc>
+          <w:tcPr>
+            <w:tcW w:type="dxa" w:w="3041"/>
+          </w:tcPr>
+          <w:p>
+            <w:r>
+              <w:t>DATABASE_URL</w:t>
+            </w:r>
+          </w:p>
+        </w:tc>
+        <w:tc>
+          <w:tcPr>
+            <w:tcW w:type="dxa" w:w="3041"/>
+          </w:tcPr>
+          <w:p>
+            <w:r>
+              <w:t>Автоматически</w:t>
+            </w:r>
+          </w:p>
+        </w:tc>
+        <w:tc>
+          <w:tcPr>
+            <w:tcW w:type="dxa" w:w="3041"/>
+          </w:tcPr>
+          <w:p>
+            <w:r>
+              <w:t>Replit PostgreSQL → Connection String</w:t>
+            </w:r>
+          </w:p>
+        </w:tc>
+      </w:tr>
+      <w:tr>
+        <w:tc>
+          <w:tcPr>
+            <w:tcW w:type="dxa" w:w="3041"/>
+          </w:tcPr>
+          <w:p>
+            <w:r>
+              <w:t>MEM0_API_KEY</w:t>
+            </w:r>
+          </w:p>
+        </w:tc>
+        <w:tc>
+          <w:tcPr>
+            <w:tcW w:type="dxa" w:w="3041"/>
+          </w:tcPr>
+          <w:p>
+            <w:r>
+              <w:t>Опционально</w:t>
+            </w:r>
+          </w:p>
+        </w:tc>
+        <w:tc>
+          <w:tcPr>
+            <w:tcW w:type="dxa" w:w="3041"/>
+          </w:tcPr>
+          <w:p>
+            <w:r>
+              <w:t>app.mem0.ai (или self-hosted)</w:t>
             </w:r>
           </w:p>
         </w:tc>
@@ -2740,7 +4328,722 @@
         <w:pStyle w:val="Heading2"/>
       </w:pPr>
       <w:r>
-        <w:t>6.1 Необходимые API-ключи для запуска</w:t>
+        <w:t>11.3 Зависимости (requirements.txt)</w:t>
+      </w:r>
+    </w:p>
+    <w:p>
+      <w:pPr>
+        <w:ind w:left="567"/>
+      </w:pPr>
+      <w:r>
+        <w:rPr>
+          <w:rFonts w:ascii="Courier New" w:hAnsi="Courier New"/>
+          <w:color w:val="141414"/>
+          <w:sz w:val="18"/>
+        </w:rPr>
+        <w:t>aiogram==3.13.1</w:t>
+        <w:br/>
+        <w:t>openai==1.58.1</w:t>
+        <w:br/>
+        <w:t>mem0ai==0.1.29</w:t>
+        <w:br/>
+        <w:t>asyncpg==0.30.0</w:t>
+        <w:br/>
+        <w:t>sqlalchemy[asyncio]==2.0.36</w:t>
+        <w:br/>
+        <w:t>apscheduler==3.10.4</w:t>
+        <w:br/>
+        <w:t>httpx==0.28.1</w:t>
+        <w:br/>
+        <w:t>python-dotenv==1.0.1</w:t>
+        <w:br/>
+        <w:t>pydantic==2.10.3</w:t>
+        <w:br/>
+        <w:t>aiofiles==24.1.0</w:t>
+      </w:r>
+    </w:p>
+    <w:p>
+      <w:pPr>
+        <w:pStyle w:val="Heading2"/>
+      </w:pPr>
+      <w:r>
+        <w:t>11.4 Порядок разработки (Фаза 1 MVP)</w:t>
+      </w:r>
+    </w:p>
+    <w:p>
+      <w:pPr>
+        <w:pStyle w:val="ListNumber"/>
+      </w:pPr>
+      <w:r>
+        <w:t>Создать схему БД: выполнить SQL из раздела 9 в Replit PostgreSQL</w:t>
+      </w:r>
+    </w:p>
+    <w:p>
+      <w:pPr>
+        <w:pStyle w:val="ListNumber"/>
+      </w:pPr>
+      <w:r>
+        <w:t>Реализовать config.py с загрузкой env переменных</w:t>
+      </w:r>
+    </w:p>
+    <w:p>
+      <w:pPr>
+        <w:pStyle w:val="ListNumber"/>
+      </w:pPr>
+      <w:r>
+        <w:t>Создать Telegram бот (bot/handlers.py) с базовым /start и приёмом сообщений</w:t>
+      </w:r>
+    </w:p>
+    <w:p>
+      <w:pPr>
+        <w:pStyle w:val="ListNumber"/>
+      </w:pPr>
+      <w:r>
+        <w:t>Подключить Oura Ring API (integrations/oura.py) и проверить получение данных</w:t>
+      </w:r>
+    </w:p>
+    <w:p>
+      <w:pPr>
+        <w:pStyle w:val="ListNumber"/>
+      </w:pPr>
+      <w:r>
+        <w:t>Создать Neuro &amp; Bio Agent (agents/neuro_bio.py) с system prompt из раздела 10.2</w:t>
+      </w:r>
+    </w:p>
+    <w:p>
+      <w:pPr>
+        <w:pStyle w:val="ListNumber"/>
+      </w:pPr>
+      <w:r>
+        <w:t>Создать Decision Support Agent (agents/decision_support.py)</w:t>
+      </w:r>
+    </w:p>
+    <w:p>
+      <w:pPr>
+        <w:pStyle w:val="ListNumber"/>
+      </w:pPr>
+      <w:r>
+        <w:t>Реализовать Master Orchestrator (orchestrator/master.py) с ReAct-логикой</w:t>
+      </w:r>
+    </w:p>
+    <w:p>
+      <w:pPr>
+        <w:pStyle w:val="ListNumber"/>
+      </w:pPr>
+      <w:r>
+        <w:t>Подключить Mem0 (memory/mem0_client.py) и проверить сохранение/поиск</w:t>
+      </w:r>
+    </w:p>
+    <w:p>
+      <w:pPr>
+        <w:pStyle w:val="ListNumber"/>
+      </w:pPr>
+      <w:r>
+        <w:t>Добавить APScheduler (scheduler/jobs.py) для 07:00 и 22:00 МСК</w:t>
+      </w:r>
+    </w:p>
+    <w:p>
+      <w:pPr>
+        <w:pStyle w:val="ListNumber"/>
+      </w:pPr>
+      <w:r>
+        <w:t>Протестировать полный цикл: утренний брифинг → ввод состояния → реактивный запрос</w:t>
+      </w:r>
+    </w:p>
+    <w:p>
+      <w:pPr>
+        <w:pStyle w:val="ListNumber"/>
+      </w:pPr>
+      <w:r>
+        <w:t>Добавить обработку голосовых (bot/voice.py) через Whisper API</w:t>
+      </w:r>
+    </w:p>
+    <w:p>
+      <w:pPr>
+        <w:pStyle w:val="Heading2"/>
+      </w:pPr>
+      <w:r>
+        <w:t>11.5 Тестовые сценарии</w:t>
+      </w:r>
+    </w:p>
+    <w:tbl>
+      <w:tblPr>
+        <w:tblStyle w:val="TableGrid"/>
+        <w:tblW w:type="auto" w:w="0"/>
+        <w:tblLook w:firstColumn="1" w:firstRow="1" w:lastColumn="0" w:lastRow="0" w:noHBand="0" w:noVBand="1" w:val="04A0"/>
+      </w:tblPr>
+      <w:tblGrid>
+        <w:gridCol w:w="3041"/>
+        <w:gridCol w:w="3041"/>
+        <w:gridCol w:w="3041"/>
+      </w:tblGrid>
+      <w:tr>
+        <w:tc>
+          <w:tcPr>
+            <w:tcW w:type="dxa" w:w="3041"/>
+            <w:shd w:fill="1a3a5c" w:val="clear"/>
+          </w:tcPr>
+          <w:p>
+            <w:r>
+              <w:rPr>
+                <w:b/>
+                <w:color w:val="FFFFFF"/>
+              </w:rPr>
+              <w:t>Сценарий</w:t>
+            </w:r>
+          </w:p>
+        </w:tc>
+        <w:tc>
+          <w:tcPr>
+            <w:tcW w:type="dxa" w:w="3041"/>
+            <w:shd w:fill="1a3a5c" w:val="clear"/>
+          </w:tcPr>
+          <w:p>
+            <w:r>
+              <w:rPr>
+                <w:b/>
+                <w:color w:val="FFFFFF"/>
+              </w:rPr>
+              <w:t>Ввод</w:t>
+            </w:r>
+          </w:p>
+        </w:tc>
+        <w:tc>
+          <w:tcPr>
+            <w:tcW w:type="dxa" w:w="3041"/>
+            <w:shd w:fill="1a3a5c" w:val="clear"/>
+          </w:tcPr>
+          <w:p>
+            <w:r>
+              <w:rPr>
+                <w:b/>
+                <w:color w:val="FFFFFF"/>
+              </w:rPr>
+              <w:t>Ожидаемый результат</w:t>
+            </w:r>
+          </w:p>
+        </w:tc>
+      </w:tr>
+      <w:tr>
+        <w:tc>
+          <w:tcPr>
+            <w:tcW w:type="dxa" w:w="3041"/>
+          </w:tcPr>
+          <w:p>
+            <w:r>
+              <w:t>Утренний брифинг</w:t>
+            </w:r>
+          </w:p>
+        </w:tc>
+        <w:tc>
+          <w:tcPr>
+            <w:tcW w:type="dxa" w:w="3041"/>
+          </w:tcPr>
+          <w:p>
+            <w:r>
+              <w:t>Автоматически в 07:00</w:t>
+            </w:r>
+          </w:p>
+        </w:tc>
+        <w:tc>
+          <w:tcPr>
+            <w:tcW w:type="dxa" w:w="3041"/>
+          </w:tcPr>
+          <w:p>
+            <w:r>
+              <w:t>Структурированное сообщение с состоянием, расписанием, приоритетами</w:t>
+            </w:r>
+          </w:p>
+        </w:tc>
+      </w:tr>
+      <w:tr>
+        <w:tc>
+          <w:tcPr>
+            <w:tcW w:type="dxa" w:w="3041"/>
+          </w:tcPr>
+          <w:p>
+            <w:r>
+              <w:t>Ввод состояния</w:t>
+            </w:r>
+          </w:p>
+        </w:tc>
+        <w:tc>
+          <w:tcPr>
+            <w:tcW w:type="dxa" w:w="3041"/>
+          </w:tcPr>
+          <w:p>
+            <w:r>
+              <w:t>'Энергия 4, фокус 3, тренировка нет'</w:t>
+            </w:r>
+          </w:p>
+        </w:tc>
+        <w:tc>
+          <w:tcPr>
+            <w:tcW w:type="dxa" w:w="3041"/>
+          </w:tcPr>
+          <w:p>
+            <w:r>
+              <w:t>Подтверждение + обновление анализа</w:t>
+            </w:r>
+          </w:p>
+        </w:tc>
+      </w:tr>
+      <w:tr>
+        <w:tc>
+          <w:tcPr>
+            <w:tcW w:type="dxa" w:w="3041"/>
+          </w:tcPr>
+          <w:p>
+            <w:r>
+              <w:t>Запрос совета</w:t>
+            </w:r>
+          </w:p>
+        </w:tc>
+        <w:tc>
+          <w:tcPr>
+            <w:tcW w:type="dxa" w:w="3041"/>
+          </w:tcPr>
+          <w:p>
+            <w:r>
+              <w:t>'Стоит ли проводить стратегическую встречу сегодня?'</w:t>
+            </w:r>
+          </w:p>
+        </w:tc>
+        <w:tc>
+          <w:tcPr>
+            <w:tcW w:type="dxa" w:w="3041"/>
+          </w:tcPr>
+          <w:p>
+            <w:r>
+              <w:t>Анализ Readiness + контекст + рекомендация</w:t>
+            </w:r>
+          </w:p>
+        </w:tc>
+      </w:tr>
+      <w:tr>
+        <w:tc>
+          <w:tcPr>
+            <w:tcW w:type="dxa" w:w="3041"/>
+          </w:tcPr>
+          <w:p>
+            <w:r>
+              <w:t>Низкий Readiness</w:t>
+            </w:r>
+          </w:p>
+        </w:tc>
+        <w:tc>
+          <w:tcPr>
+            <w:tcW w:type="dxa" w:w="3041"/>
+          </w:tcPr>
+          <w:p>
+            <w:r>
+              <w:t>Readiness Score &lt; 65 из Oura</w:t>
+            </w:r>
+          </w:p>
+        </w:tc>
+        <w:tc>
+          <w:tcPr>
+            <w:tcW w:type="dxa" w:w="3041"/>
+          </w:tcPr>
+          <w:p>
+            <w:r>
+              <w:t>Проактивный алерт + предложение перенести тяжёлые встречи</w:t>
+            </w:r>
+          </w:p>
+        </w:tc>
+      </w:tr>
+      <w:tr>
+        <w:tc>
+          <w:tcPr>
+            <w:tcW w:type="dxa" w:w="3041"/>
+          </w:tcPr>
+          <w:p>
+            <w:r>
+              <w:t>Запомнить факт</w:t>
+            </w:r>
+          </w:p>
+        </w:tc>
+        <w:tc>
+          <w:tcPr>
+            <w:tcW w:type="dxa" w:w="3041"/>
+          </w:tcPr>
+          <w:p>
+            <w:r>
+              <w:t>'Запомни: Иван Петров предпочитает встречи до 11 утра'</w:t>
+            </w:r>
+          </w:p>
+        </w:tc>
+        <w:tc>
+          <w:tcPr>
+            <w:tcW w:type="dxa" w:w="3041"/>
+          </w:tcPr>
+          <w:p>
+            <w:r>
+              <w:t>Подтверждение + сохранение в Mem0</w:t>
+            </w:r>
+          </w:p>
+        </w:tc>
+      </w:tr>
+      <w:tr>
+        <w:tc>
+          <w:tcPr>
+            <w:tcW w:type="dxa" w:w="3041"/>
+          </w:tcPr>
+          <w:p>
+            <w:r>
+              <w:t>Голосовое</w:t>
+            </w:r>
+          </w:p>
+        </w:tc>
+        <w:tc>
+          <w:tcPr>
+            <w:tcW w:type="dxa" w:w="3041"/>
+          </w:tcPr>
+          <w:p>
+            <w:r>
+              <w:t>Голосовое сообщение от Ани</w:t>
+            </w:r>
+          </w:p>
+        </w:tc>
+        <w:tc>
+          <w:tcPr>
+            <w:tcW w:type="dxa" w:w="3041"/>
+          </w:tcPr>
+          <w:p>
+            <w:r>
+              <w:t>Транскрипция + ответ как на текст</w:t>
+            </w:r>
+          </w:p>
+        </w:tc>
+      </w:tr>
+      <w:tr>
+        <w:tc>
+          <w:tcPr>
+            <w:tcW w:type="dxa" w:w="3041"/>
+          </w:tcPr>
+          <w:p>
+            <w:r>
+              <w:t>Вечерний дайджест</w:t>
+            </w:r>
+          </w:p>
+        </w:tc>
+        <w:tc>
+          <w:tcPr>
+            <w:tcW w:type="dxa" w:w="3041"/>
+          </w:tcPr>
+          <w:p>
+            <w:r>
+              <w:t>Автоматически в 22:00</w:t>
+            </w:r>
+          </w:p>
+        </w:tc>
+        <w:tc>
+          <w:tcPr>
+            <w:tcW w:type="dxa" w:w="3041"/>
+          </w:tcPr>
+          <w:p>
+            <w:r>
+              <w:t>Итог дня, открытые задачи, прогноз завтра</w:t>
+            </w:r>
+          </w:p>
+        </w:tc>
+      </w:tr>
+    </w:tbl>
+    <w:p>
+      <w:r>
+        <w:br w:type="page"/>
+      </w:r>
+    </w:p>
+    <w:p>
+      <w:pPr>
+        <w:pStyle w:val="Heading1"/>
+      </w:pPr>
+      <w:r>
+        <w:rPr>
+          <w:color w:val="5838BA"/>
+        </w:rPr>
+        <w:t>12. Интеграции с внешними API</w:t>
+      </w:r>
+    </w:p>
+    <w:p>
+      <w:pPr>
+        <w:pStyle w:val="Heading2"/>
+      </w:pPr>
+      <w:r>
+        <w:t>12.1 Oura Ring API v2</w:t>
+      </w:r>
+    </w:p>
+    <w:p>
+      <w:r>
+        <w:rPr>
+          <w:b w:val="0"/>
+          <w:i w:val="0"/>
+        </w:rPr>
+        <w:t>Base URL: https://api.ouraring.com/v2/</w:t>
+      </w:r>
+    </w:p>
+    <w:p>
+      <w:pPr>
+        <w:ind w:left="567"/>
+      </w:pPr>
+      <w:r>
+        <w:rPr>
+          <w:rFonts w:ascii="Courier New" w:hAnsi="Courier New"/>
+          <w:color w:val="141414"/>
+          <w:sz w:val="18"/>
+        </w:rPr>
+        <w:t># Ключевые эндпоинты:</w:t>
+        <w:br/>
+        <w:t>GET /usercollection/daily_readiness     # Readiness Score, contributors</w:t>
+        <w:br/>
+        <w:t>GET /usercollection/daily_sleep         # Sleep score, hours, efficiency</w:t>
+        <w:br/>
+        <w:t>GET /usercollection/heartrate           # Средний ЧСС за период</w:t>
+        <w:br/>
+        <w:t>GET /usercollection/daily_activity      # Активность дня</w:t>
+        <w:br/>
+        <w:br/>
+        <w:t># Авторизация:</w:t>
+        <w:br/>
+        <w:t>Authorization: Bearer {OURA_ACCESS_TOKEN}</w:t>
+        <w:br/>
+        <w:br/>
+        <w:t># Пример запроса (Python):</w:t>
+        <w:br/>
+        <w:t>import httpx</w:t>
+        <w:br/>
+        <w:br/>
+        <w:t>async def get_readiness(date: str) -&gt; dict:</w:t>
+        <w:br/>
+        <w:t xml:space="preserve">    async with httpx.AsyncClient() as client:</w:t>
+        <w:br/>
+        <w:t xml:space="preserve">        response = await client.get(</w:t>
+        <w:br/>
+        <w:t xml:space="preserve">            "https://api.ouraring.com/v2/usercollection/daily_readiness",</w:t>
+        <w:br/>
+        <w:t xml:space="preserve">            params={"start_date": date, "end_date": date},</w:t>
+        <w:br/>
+        <w:t xml:space="preserve">            headers={"Authorization": f"Bearer {OURA_ACCESS_TOKEN}"}</w:t>
+        <w:br/>
+        <w:t xml:space="preserve">        )</w:t>
+        <w:br/>
+        <w:t xml:space="preserve">        return response.json()</w:t>
+      </w:r>
+    </w:p>
+    <w:p>
+      <w:pPr>
+        <w:pStyle w:val="Heading2"/>
+      </w:pPr>
+      <w:r>
+        <w:t>12.2 OpenAI API (LLM + Whisper)</w:t>
+      </w:r>
+    </w:p>
+    <w:p>
+      <w:pPr>
+        <w:ind w:left="567"/>
+      </w:pPr>
+      <w:r>
+        <w:rPr>
+          <w:rFonts w:ascii="Courier New" w:hAnsi="Courier New"/>
+          <w:color w:val="141414"/>
+          <w:sz w:val="18"/>
+        </w:rPr>
+        <w:t># LLM (оркестратор и агенты):</w:t>
+        <w:br/>
+        <w:t>from openai import AsyncOpenAI</w:t>
+        <w:br/>
+        <w:t>client = AsyncOpenAI(api_key=OPENAI_API_KEY)</w:t>
+        <w:br/>
+        <w:br/>
+        <w:t>response = await client.chat.completions.create(</w:t>
+        <w:br/>
+        <w:t xml:space="preserve">    model="gpt-4o",</w:t>
+        <w:br/>
+        <w:t xml:space="preserve">    messages=[</w:t>
+        <w:br/>
+        <w:t xml:space="preserve">        {"role": "system", "content": AGENT_SYSTEM_PROMPT},</w:t>
+        <w:br/>
+        <w:t xml:space="preserve">        {"role": "user", "content": user_message}</w:t>
+        <w:br/>
+        <w:t xml:space="preserve">    ],</w:t>
+        <w:br/>
+        <w:t xml:space="preserve">    tools=agent_tools,          # function calling для инструментов</w:t>
+        <w:br/>
+        <w:t xml:space="preserve">    temperature=0.3,</w:t>
+        <w:br/>
+        <w:t xml:space="preserve">    max_tokens=2000</w:t>
+        <w:br/>
+        <w:t>)</w:t>
+        <w:br/>
+        <w:br/>
+        <w:t># Whisper (транскрипция голоса):</w:t>
+        <w:br/>
+        <w:t>async def transcribe_voice(audio_file_path: str) -&gt; str:</w:t>
+        <w:br/>
+        <w:t xml:space="preserve">    with open(audio_file_path, "rb") as f:</w:t>
+        <w:br/>
+        <w:t xml:space="preserve">        transcript = await client.audio.transcriptions.create(</w:t>
+        <w:br/>
+        <w:t xml:space="preserve">            model="whisper-1",</w:t>
+        <w:br/>
+        <w:t xml:space="preserve">            file=f,</w:t>
+        <w:br/>
+        <w:t xml:space="preserve">            language="ru"</w:t>
+        <w:br/>
+        <w:t xml:space="preserve">        )</w:t>
+        <w:br/>
+        <w:t xml:space="preserve">    return transcript.text</w:t>
+      </w:r>
+    </w:p>
+    <w:p>
+      <w:pPr>
+        <w:pStyle w:val="Heading2"/>
+      </w:pPr>
+      <w:r>
+        <w:t>12.3 Mem0 (память агента)</w:t>
+      </w:r>
+    </w:p>
+    <w:p>
+      <w:pPr>
+        <w:ind w:left="567"/>
+      </w:pPr>
+      <w:r>
+        <w:rPr>
+          <w:rFonts w:ascii="Courier New" w:hAnsi="Courier New"/>
+          <w:color w:val="141414"/>
+          <w:sz w:val="18"/>
+        </w:rPr>
+        <w:t>from mem0 import AsyncMemoryClient</w:t>
+        <w:br/>
+        <w:br/>
+        <w:t>mem0 = AsyncMemoryClient(api_key=MEM0_API_KEY)</w:t>
+        <w:br/>
+        <w:t># Или self-hosted: mem0 = AsyncMemory()  # использует локальный PostgreSQL</w:t>
+        <w:br/>
+        <w:br/>
+        <w:t># Сохранить воспоминание:</w:t>
+        <w:br/>
+        <w:t>await mem0.add(</w:t>
+        <w:br/>
+        <w:t xml:space="preserve">    messages=[{"role": "user", "content": "Иван Петров предпочитает встречи до 11 утра"}],</w:t>
+        <w:br/>
+        <w:t xml:space="preserve">    user_id="boss_1"</w:t>
+        <w:br/>
+        <w:t>)</w:t>
+        <w:br/>
+        <w:br/>
+        <w:t># Найти релевантные воспоминания:</w:t>
+        <w:br/>
+        <w:t>results = await mem0.search(</w:t>
+        <w:br/>
+        <w:t xml:space="preserve">    query="предпочтения по времени встреч Петрова",</w:t>
+        <w:br/>
+        <w:t xml:space="preserve">    user_id="boss_1",</w:t>
+        <w:br/>
+        <w:t xml:space="preserve">    limit=5</w:t>
+        <w:br/>
+        <w:t>)</w:t>
+        <w:br/>
+        <w:t># results = [{"memory": "Иван Петров предпочитает встречи до 11 утра", "score": 0.95}]</w:t>
+      </w:r>
+    </w:p>
+    <w:p>
+      <w:r>
+        <w:br w:type="page"/>
+      </w:r>
+    </w:p>
+    <w:p>
+      <w:pPr>
+        <w:pStyle w:val="Heading1"/>
+      </w:pPr>
+      <w:r>
+        <w:rPr>
+          <w:color w:val="5838BA"/>
+        </w:rPr>
+        <w:t>13. Безопасность и ограничения</w:t>
+      </w:r>
+    </w:p>
+    <w:p>
+      <w:pPr>
+        <w:pStyle w:val="ListBullet"/>
+      </w:pPr>
+      <w:r>
+        <w:t>Биометрические данные (Oura) — не передаются агентам без явной необходимости</w:t>
+      </w:r>
+    </w:p>
+    <w:p>
+      <w:pPr>
+        <w:pStyle w:val="ListBullet"/>
+      </w:pPr>
+      <w:r>
+        <w:t>Аудиозаписи переговоров — удаляются после транскрипции и анализа</w:t>
+      </w:r>
+    </w:p>
+    <w:p>
+      <w:pPr>
+        <w:pStyle w:val="ListBullet"/>
+      </w:pPr>
+      <w:r>
+        <w:t>Вывод — исключительно через Аню; система не контактирует с третьими лицами</w:t>
+      </w:r>
+    </w:p>
+    <w:p>
+      <w:pPr>
+        <w:pStyle w:val="ListBullet"/>
+      </w:pPr>
+      <w:r>
+        <w:t>Система не принимает решений самостоятельно — только анализирует и рекомендует</w:t>
+      </w:r>
+    </w:p>
+    <w:p>
+      <w:pPr>
+        <w:pStyle w:val="ListBullet"/>
+      </w:pPr>
+      <w:r>
+        <w:t>Система не ставит медицинских диагнозов и не назначает медикаменты</w:t>
+      </w:r>
+    </w:p>
+    <w:p>
+      <w:pPr>
+        <w:pStyle w:val="ListBullet"/>
+      </w:pPr>
+      <w:r>
+        <w:t>Семейные блоки в расписании — неприкосновенны (агент игнорирует полностью)</w:t>
+      </w:r>
+    </w:p>
+    <w:p>
+      <w:pPr>
+        <w:pStyle w:val="ListBullet"/>
+      </w:pPr>
+      <w:r>
+        <w:t>При high_risk в переговорах — сигнал передаётся в Decision Support</w:t>
+      </w:r>
+    </w:p>
+    <w:p>
+      <w:pPr>
+        <w:pStyle w:val="ListBullet"/>
+      </w:pPr>
+      <w:r>
+        <w:t>Эзотерические рекомендации — всегда с обоснованием, не заменяют решения</w:t>
+      </w:r>
+    </w:p>
+    <w:p>
+      <w:pPr>
+        <w:pStyle w:val="ListBullet"/>
+      </w:pPr>
+      <w:r>
+        <w:t>Все секреты (API ключи) хранятся только в Replit Secrets, никогда в коде</w:t>
+      </w:r>
+    </w:p>
+    <w:p>
+      <w:pPr>
+        <w:pStyle w:val="Heading1"/>
+      </w:pPr>
+      <w:r>
+        <w:rPr>
+          <w:color w:val="5838BA"/>
+        </w:rPr>
+        <w:t>14. Глоссарий</w:t>
       </w:r>
     </w:p>
     <w:tbl>
@@ -2757,405 +5060,13 @@
         <w:tc>
           <w:tcPr>
             <w:tcW w:type="dxa" w:w="4561"/>
+            <w:shd w:fill="333333" w:val="clear"/>
           </w:tcPr>
           <w:p>
             <w:r>
               <w:rPr>
                 <w:b/>
-              </w:rPr>
-              <w:t>Сервис</w:t>
-            </w:r>
-          </w:p>
-        </w:tc>
-        <w:tc>
-          <w:tcPr>
-            <w:tcW w:type="dxa" w:w="4561"/>
-          </w:tcPr>
-          <w:p>
-            <w:r>
-              <w:rPr>
-                <w:b/>
-              </w:rPr>
-              <w:t>Как получить</w:t>
-            </w:r>
-          </w:p>
-        </w:tc>
-      </w:tr>
-      <w:tr>
-        <w:tc>
-          <w:tcPr>
-            <w:tcW w:type="dxa" w:w="4561"/>
-          </w:tcPr>
-          <w:p>
-            <w:r>
-              <w:t>Telegram Bot Token</w:t>
-            </w:r>
-          </w:p>
-        </w:tc>
-        <w:tc>
-          <w:tcPr>
-            <w:tcW w:type="dxa" w:w="4561"/>
-          </w:tcPr>
-          <w:p>
-            <w:r>
-              <w:t>Через @BotFather в Telegram — команда /newbot</w:t>
-            </w:r>
-          </w:p>
-        </w:tc>
-      </w:tr>
-      <w:tr>
-        <w:tc>
-          <w:tcPr>
-            <w:tcW w:type="dxa" w:w="4561"/>
-          </w:tcPr>
-          <w:p>
-            <w:r>
-              <w:t>OpenAI API Key</w:t>
-            </w:r>
-          </w:p>
-        </w:tc>
-        <w:tc>
-          <w:tcPr>
-            <w:tcW w:type="dxa" w:w="4561"/>
-          </w:tcPr>
-          <w:p>
-            <w:r>
-              <w:t>platform.openai.com — раздел API Keys</w:t>
-            </w:r>
-          </w:p>
-        </w:tc>
-      </w:tr>
-      <w:tr>
-        <w:tc>
-          <w:tcPr>
-            <w:tcW w:type="dxa" w:w="4561"/>
-          </w:tcPr>
-          <w:p>
-            <w:r>
-              <w:t>Oura Ring Personal Access Token</w:t>
-            </w:r>
-          </w:p>
-        </w:tc>
-        <w:tc>
-          <w:tcPr>
-            <w:tcW w:type="dxa" w:w="4561"/>
-          </w:tcPr>
-          <w:p>
-            <w:r>
-              <w:t>cloud.ouraring.com/personal-access-tokens</w:t>
-            </w:r>
-          </w:p>
-        </w:tc>
-      </w:tr>
-    </w:tbl>
-    <w:p>
-      <w:r>
-        <w:br w:type="page"/>
-      </w:r>
-    </w:p>
-    <w:p>
-      <w:pPr>
-        <w:pStyle w:val="Heading1"/>
-      </w:pPr>
-      <w:r>
-        <w:rPr>
-          <w:color w:val="5838BA"/>
-        </w:rPr>
-        <w:t>7. Дорожная карта реализации</w:t>
-      </w:r>
-    </w:p>
-    <w:p>
-      <w:pPr>
-        <w:pStyle w:val="Heading2"/>
-      </w:pPr>
-      <w:r>
-        <w:t>Фаза 1 — MVP  ✅</w:t>
-      </w:r>
-    </w:p>
-    <w:p>
-      <w:r>
-        <w:rPr>
-          <w:b w:val="0"/>
-          <w:i w:val="0"/>
-        </w:rPr>
-        <w:t>Состав: Neuro &amp; Bio Agent + Decision Support Agent + Telegram-бот + Oura Ring.</w:t>
-      </w:r>
-    </w:p>
-    <w:p>
-      <w:pPr>
-        <w:pStyle w:val="ListBullet"/>
-      </w:pPr>
-      <w:r>
-        <w:t>Telegram-бот на русском языке — единственный интерфейс</w:t>
-      </w:r>
-    </w:p>
-    <w:p>
-      <w:pPr>
-        <w:pStyle w:val="ListBullet"/>
-      </w:pPr>
-      <w:r>
-        <w:t>Интеграция с Oura Ring API (HRV, Readiness Score, сон, ЧСС)</w:t>
-      </w:r>
-    </w:p>
-    <w:p>
-      <w:pPr>
-        <w:pStyle w:val="ListBullet"/>
-      </w:pPr>
-      <w:r>
-        <w:t>Ручной ввод субъективного состояния (энергия, фокус, настроение, тренировка, массаж, алкоголь)</w:t>
-      </w:r>
-    </w:p>
-    <w:p>
-      <w:pPr>
-        <w:pStyle w:val="ListBullet"/>
-      </w:pPr>
-      <w:r>
-        <w:t>Анализ календаря: типология встреч, когнитивная нагрузка дня</w:t>
-      </w:r>
-    </w:p>
-    <w:p>
-      <w:pPr>
-        <w:pStyle w:val="ListBullet"/>
-      </w:pPr>
-      <w:r>
-        <w:t>Алерты при низком Readiness Score + рекомендации по расписанию</w:t>
-      </w:r>
-    </w:p>
-    <w:p>
-      <w:pPr>
-        <w:pStyle w:val="ListBullet"/>
-      </w:pPr>
-      <w:r>
-        <w:t>Утренний брифинг 07:00 МСК и вечерний дайджест 22:00 МСК (оба автоматически)</w:t>
-      </w:r>
-    </w:p>
-    <w:p>
-      <w:pPr>
-        <w:pStyle w:val="ListBullet"/>
-      </w:pPr>
-      <w:r>
-        <w:t>Базовая логика Decision Support: приоритизация задач дня</w:t>
-      </w:r>
-    </w:p>
-    <w:p>
-      <w:pPr>
-        <w:pStyle w:val="ListBullet"/>
-      </w:pPr>
-      <w:r>
-        <w:t>Архитектура памяти: рабочая + семантическая (Mem0 + PostgreSQL)</w:t>
-      </w:r>
-    </w:p>
-    <w:p>
-      <w:pPr>
-        <w:pStyle w:val="ListBullet"/>
-      </w:pPr>
-      <w:r>
-        <w:t>Двухступенчатая логика напоминаний при отсутствии ввода (+5 мин → +5 мин)</w:t>
-      </w:r>
-    </w:p>
-    <w:p>
-      <w:r>
-        <w:rPr>
-          <w:b/>
-        </w:rPr>
-        <w:t xml:space="preserve">Результат: </w:t>
-      </w:r>
-      <w:r>
-        <w:t>Работающий MVP — персонализированный утренний брифинг и рекомендации по расписанию на основе физического состояния.</w:t>
-      </w:r>
-    </w:p>
-    <w:p/>
-    <w:p>
-      <w:pPr>
-        <w:pStyle w:val="Heading2"/>
-      </w:pPr>
-      <w:r>
-        <w:t>Фаза 2 — Полная интеграция  ⏳</w:t>
-      </w:r>
-    </w:p>
-    <w:p>
-      <w:r>
-        <w:rPr>
-          <w:b w:val="0"/>
-          <w:i w:val="0"/>
-        </w:rPr>
-        <w:t>Состав: все 6 агентов + полная интеграция источников данных.</w:t>
-      </w:r>
-    </w:p>
-    <w:p>
-      <w:pPr>
-        <w:pStyle w:val="ListBullet"/>
-      </w:pPr>
-      <w:r>
-        <w:t>Esoteric Intelligence Agent (ввод натальных данных через бот)</w:t>
-      </w:r>
-    </w:p>
-    <w:p>
-      <w:pPr>
-        <w:pStyle w:val="ListBullet"/>
-      </w:pPr>
-      <w:r>
-        <w:t>Health &amp; Maintenance Agent: трекинг анализов, визитов, препаратов; ресёрч назначений</w:t>
-      </w:r>
-    </w:p>
-    <w:p>
-      <w:pPr>
-        <w:pStyle w:val="ListBullet"/>
-      </w:pPr>
-      <w:r>
-        <w:t>Network &amp; Relationship Agent: карта контактов, напоминания, подарки, поздравления</w:t>
-      </w:r>
-    </w:p>
-    <w:p>
-      <w:pPr>
-        <w:pStyle w:val="ListBullet"/>
-      </w:pPr>
-      <w:r>
-        <w:t>Communication Intelligence Agent: анализ PLAUDE (аудио + транскрипция)</w:t>
-      </w:r>
-    </w:p>
-    <w:p>
-      <w:pPr>
-        <w:pStyle w:val="ListBullet"/>
-      </w:pPr>
-      <w:r>
-        <w:t>Полная кросс-агентная интеграция: потоки данных между всеми агентами</w:t>
-      </w:r>
-    </w:p>
-    <w:p>
-      <w:pPr>
-        <w:pStyle w:val="ListBullet"/>
-      </w:pPr>
-      <w:r>
-        <w:t>Механизм арбитража конфликтов через Decision Support</w:t>
-      </w:r>
-    </w:p>
-    <w:p>
-      <w:pPr>
-        <w:pStyle w:val="ListBullet"/>
-      </w:pPr>
-      <w:r>
-        <w:t>Адаптация брифингов к часовому поясу при командировках</w:t>
-      </w:r>
-    </w:p>
-    <w:p>
-      <w:pPr>
-        <w:pStyle w:val="ListBullet"/>
-      </w:pPr>
-      <w:r>
-        <w:t>Полный четырёхслойный Mem0: Vector + Graph + KV + Episodic store</w:t>
-      </w:r>
-    </w:p>
-    <w:p>
-      <w:r>
-        <w:br w:type="page"/>
-      </w:r>
-    </w:p>
-    <w:p>
-      <w:pPr>
-        <w:pStyle w:val="Heading1"/>
-      </w:pPr>
-      <w:r>
-        <w:rPr>
-          <w:color w:val="5838BA"/>
-        </w:rPr>
-        <w:t>8. Принципы безопасности и ограничения</w:t>
-      </w:r>
-    </w:p>
-    <w:p>
-      <w:pPr>
-        <w:pStyle w:val="ListBullet"/>
-      </w:pPr>
-      <w:r>
-        <w:t>Биометрические данные (Oura) не передаются агентам без явной необходимости</w:t>
-      </w:r>
-    </w:p>
-    <w:p>
-      <w:pPr>
-        <w:pStyle w:val="ListBullet"/>
-      </w:pPr>
-      <w:r>
-        <w:t>Аудиозаписи переговоров не хранятся после завершения анализа</w:t>
-      </w:r>
-    </w:p>
-    <w:p>
-      <w:pPr>
-        <w:pStyle w:val="ListBullet"/>
-      </w:pPr>
-      <w:r>
-        <w:t>Вывод рекомендаций идёт исключительно через Аню; система не контактирует с третьими лицами</w:t>
-      </w:r>
-    </w:p>
-    <w:p>
-      <w:pPr>
-        <w:pStyle w:val="ListBullet"/>
-      </w:pPr>
-      <w:r>
-        <w:t>Система не принимает решений самостоятельно — только анализирует и рекомендует</w:t>
-      </w:r>
-    </w:p>
-    <w:p>
-      <w:pPr>
-        <w:pStyle w:val="ListBullet"/>
-      </w:pPr>
-      <w:r>
-        <w:t>Система не ставит медицинских диагнозов и не назначает медикаменты</w:t>
-      </w:r>
-    </w:p>
-    <w:p>
-      <w:pPr>
-        <w:pStyle w:val="ListBullet"/>
-      </w:pPr>
-      <w:r>
-        <w:t>Семейные блоки в расписании неприкосновенны</w:t>
-      </w:r>
-    </w:p>
-    <w:p>
-      <w:pPr>
-        <w:pStyle w:val="ListBullet"/>
-      </w:pPr>
-      <w:r>
-        <w:t>При высоком риске в переговорах (флаг high_risk) — сигнал передаётся в Decision Support</w:t>
-      </w:r>
-    </w:p>
-    <w:p>
-      <w:pPr>
-        <w:pStyle w:val="ListBullet"/>
-      </w:pPr>
-      <w:r>
-        <w:t>Эзотерические рекомендации не заменяют решения; всегда сопровождаются обоснованием</w:t>
-      </w:r>
-    </w:p>
-    <w:p>
-      <w:pPr>
-        <w:pStyle w:val="Heading1"/>
-      </w:pPr>
-      <w:r>
-        <w:rPr>
-          <w:color w:val="5838BA"/>
-        </w:rPr>
-        <w:t>9. Глоссарий</w:t>
-      </w:r>
-    </w:p>
-    <w:tbl>
-      <w:tblPr>
-        <w:tblStyle w:val="TableGrid"/>
-        <w:tblW w:type="auto" w:w="0"/>
-        <w:tblLook w:firstColumn="1" w:firstRow="1" w:lastColumn="0" w:lastRow="0" w:noHBand="0" w:noVBand="1" w:val="04A0"/>
-      </w:tblPr>
-      <w:tblGrid>
-        <w:gridCol w:w="4561"/>
-        <w:gridCol w:w="4561"/>
-      </w:tblGrid>
-      <w:tr>
-        <w:tc>
-          <w:tcPr>
-            <w:tcW w:type="dxa" w:w="4561"/>
-          </w:tcPr>
-          <w:p>
-            <w:r>
-              <w:rPr>
-                <w:b/>
+                <w:color w:val="FFFFFF"/>
               </w:rPr>
               <w:t>Термин</w:t>
             </w:r>
@@ -3164,11 +5075,13 @@
         <w:tc>
           <w:tcPr>
             <w:tcW w:type="dxa" w:w="4561"/>
+            <w:shd w:fill="333333" w:val="clear"/>
           </w:tcPr>
           <w:p>
             <w:r>
               <w:rPr>
                 <w:b/>
+                <w:color w:val="FFFFFF"/>
               </w:rPr>
               <w:t>Определение</w:t>
             </w:r>
@@ -3236,7 +5149,7 @@
           </w:tcPr>
           <w:p>
             <w:r>
-              <w:t>Центральный агент-координатор, управляющий всеми остальными</w:t>
+              <w:t>Центральный агент-координатор (ReAct-паттерн)</w:t>
             </w:r>
           </w:p>
         </w:tc>
@@ -3258,7 +5171,7 @@
           </w:tcPr>
           <w:p>
             <w:r>
-              <w:t>Показатель Oura Ring (0-100): готовность к нагрузке на основе биометрии</w:t>
+              <w:t>Показатель Oura Ring (0-100): готовность к нагрузке</w:t>
             </w:r>
           </w:p>
         </w:tc>
@@ -3280,7 +5193,7 @@
           </w:tcPr>
           <w:p>
             <w:r>
-              <w:t>Heart Rate Variability — вариабельность сердечного ритма; ключевой маркер восстановления</w:t>
+              <w:t>Heart Rate Variability — вариабельность сердечного ритма</w:t>
             </w:r>
           </w:p>
         </w:tc>
@@ -3324,7 +5237,7 @@
           </w:tcPr>
           <w:p>
             <w:r>
-              <w:t>Open-source фреймворк памяти для ИИ-агентов (Apache 2.0, pgvector)</w:t>
+              <w:t>Open-source фреймворк памяти (Apache 2.0, pgvector)</w:t>
             </w:r>
           </w:p>
         </w:tc>
@@ -3346,7 +5259,7 @@
           </w:tcPr>
           <w:p>
             <w:r>
-              <w:t>Reasoning + Acting — паттерн агента: думает → вызывает инструмент → анализирует результат</w:t>
+              <w:t>Reasoning + Acting: думает → вызывает инструмент → анализирует → действует</w:t>
             </w:r>
           </w:p>
         </w:tc>
@@ -3368,7 +5281,7 @@
           </w:tcPr>
           <w:p>
             <w:r>
-              <w:t>Расширение PostgreSQL для хранения и поиска векторных эмбеддингов</w:t>
+              <w:t>Расширение PostgreSQL для векторных эмбеддингов и семантического поиска</w:t>
             </w:r>
           </w:p>
         </w:tc>
@@ -3390,7 +5303,7 @@
           </w:tcPr>
           <w:p>
             <w:r>
-              <w:t>Флаг Communication Intelligence Agent при высоком риске в переговорах</w:t>
+              <w:t>Флаг Communication Agent при высоком риске в переговорах</w:t>
             </w:r>
           </w:p>
         </w:tc>
@@ -3417,6 +5330,94 @@
           </w:p>
         </w:tc>
       </w:tr>
+      <w:tr>
+        <w:tc>
+          <w:tcPr>
+            <w:tcW w:type="dxa" w:w="4561"/>
+          </w:tcPr>
+          <w:p>
+            <w:r>
+              <w:t>declining_trend</w:t>
+            </w:r>
+          </w:p>
+        </w:tc>
+        <w:tc>
+          <w:tcPr>
+            <w:tcW w:type="dxa" w:w="4561"/>
+          </w:tcPr>
+          <w:p>
+            <w:r>
+              <w:t>Флаг Health Agent: показатель снижается 3+ периода подряд</w:t>
+            </w:r>
+          </w:p>
+        </w:tc>
+      </w:tr>
+      <w:tr>
+        <w:tc>
+          <w:tcPr>
+            <w:tcW w:type="dxa" w:w="4561"/>
+          </w:tcPr>
+          <w:p>
+            <w:r>
+              <w:t>cognitive_risk</w:t>
+            </w:r>
+          </w:p>
+        </w:tc>
+        <w:tc>
+          <w:tcPr>
+            <w:tcW w:type="dxa" w:w="4561"/>
+          </w:tcPr>
+          <w:p>
+            <w:r>
+              <w:t>Флаг Neuro &amp; Bio: высокая нагрузка при низком Readiness</w:t>
+            </w:r>
+          </w:p>
+        </w:tc>
+      </w:tr>
+      <w:tr>
+        <w:tc>
+          <w:tcPr>
+            <w:tcW w:type="dxa" w:w="4561"/>
+          </w:tcPr>
+          <w:p>
+            <w:r>
+              <w:t>fatigue_pattern</w:t>
+            </w:r>
+          </w:p>
+        </w:tc>
+        <w:tc>
+          <w:tcPr>
+            <w:tcW w:type="dxa" w:w="4561"/>
+          </w:tcPr>
+          <w:p>
+            <w:r>
+              <w:t>Флаг Neuro &amp; Bio: накопленная усталость (снижение 3+ дня)</w:t>
+            </w:r>
+          </w:p>
+        </w:tc>
+      </w:tr>
+      <w:tr>
+        <w:tc>
+          <w:tcPr>
+            <w:tcW w:type="dxa" w:w="4561"/>
+          </w:tcPr>
+          <w:p>
+            <w:r>
+              <w:t>APScheduler</w:t>
+            </w:r>
+          </w:p>
+        </w:tc>
+        <w:tc>
+          <w:tcPr>
+            <w:tcW w:type="dxa" w:w="4561"/>
+          </w:tcPr>
+          <w:p>
+            <w:r>
+              <w:t>Python-библиотека для планирования задач (брифинг и дайджест)</w:t>
+            </w:r>
+          </w:p>
+        </w:tc>
+      </w:tr>
     </w:tbl>
     <w:p>
       <w:r>
@@ -3434,7 +5435,7 @@
           <w:color w:val="969696"/>
           <w:sz w:val="20"/>
         </w:rPr>
-        <w:t>— Конфиденциальный документ. Только для внутреннего использования. —</w:t>
+        <w:t>Конфиденциально | Только для разработки | 26.06.2026</w:t>
       </w:r>
     </w:p>
     <w:p/>
@@ -3444,10 +5445,11 @@
       </w:pPr>
       <w:r>
         <w:rPr>
-          <w:color w:val="969696"/>
-          <w:sz w:val="20"/>
+          <w:b/>
+          <w:color w:val="5838BA"/>
+          <w:sz w:val="22"/>
         </w:rPr>
-        <w:t>LOS v1.1  |  26.06.2026</w:t>
+        <w:t>LOS v2.0  — Полный технический контекст для AI-разработки</w:t>
       </w:r>
     </w:p>
     <w:sectPr>

</xml_diff>